<commit_message>
Convert upper lattice supports to 8-32 and audit full design
</commit_message>
<xml_diff>
--- a/production/shopping_list.docx
+++ b/production/shopping_list.docx
@@ -146,23 +146,7 @@
               <w:spacing w:after="0" w:line="240" w:lineRule="auto"/>
             </w:pPr>
             <w:r>
-              <w:t>Lattice board V</w:t>
-            </w:r>
-            <w:proofErr w:type="gramStart"/>
-            <w:r>
-              <w:t>9  |</w:t>
-            </w:r>
-            <w:proofErr w:type="gramEnd"/>
-            <w:r>
-              <w:t xml:space="preserve">  dual TA 75–</w:t>
-            </w:r>
-            <w:proofErr w:type="gramStart"/>
-            <w:r>
-              <w:t>75  |</w:t>
-            </w:r>
-            <w:proofErr w:type="gramEnd"/>
-            <w:r>
-              <w:t xml:space="preserve">  24 × 15 in</w:t>
+              <w:t>Lattice board V9  |  dual TA 75–75  |  24 × 15 in</w:t>
             </w:r>
           </w:p>
         </w:tc>
@@ -986,15 +970,7 @@
               <w:spacing w:after="0" w:line="240" w:lineRule="auto"/>
             </w:pPr>
             <w:r>
-              <w:t xml:space="preserve">TA board </w:t>
-            </w:r>
-            <w:proofErr w:type="gramStart"/>
-            <w:r>
-              <w:t>V9.15  |</w:t>
-            </w:r>
-            <w:proofErr w:type="gramEnd"/>
-            <w:r>
-              <w:t xml:space="preserve">  11.625 × 10.625 in</w:t>
+              <w:t>TA board V9.15  |  11.625 × 10.625 in</w:t>
             </w:r>
           </w:p>
         </w:tc>
@@ -1416,23 +1392,7 @@
                   <w:sz w:val="20"/>
                   <w:u w:val="single"/>
                 </w:rPr>
-                <w:t>Thorl</w:t>
-              </w:r>
-              <w:r>
-                <w:rPr>
-                  <w:color w:val="17588B"/>
-                  <w:sz w:val="20"/>
-                  <w:u w:val="single"/>
-                </w:rPr>
-                <w:t>a</w:t>
-              </w:r>
-              <w:r>
-                <w:rPr>
-                  <w:color w:val="17588B"/>
-                  <w:sz w:val="20"/>
-                  <w:u w:val="single"/>
-                </w:rPr>
-                <w:t>bs</w:t>
+                <w:t>Thorlabs</w:t>
               </w:r>
             </w:hyperlink>
           </w:p>
@@ -1641,15 +1601,7 @@
               <w:spacing w:after="0" w:line="240" w:lineRule="auto"/>
             </w:pPr>
             <w:r>
-              <w:t>Splitting board V</w:t>
-            </w:r>
-            <w:proofErr w:type="gramStart"/>
-            <w:r>
-              <w:t>2  |</w:t>
-            </w:r>
-            <w:proofErr w:type="gramEnd"/>
-            <w:r>
-              <w:t xml:space="preserve">  24 × 14 in</w:t>
+              <w:t>Splitting board V2  |  24 × 14 in</w:t>
             </w:r>
           </w:p>
         </w:tc>
@@ -2113,21 +2065,15 @@
         <w:rPr>
           <w:sz w:val="18"/>
         </w:rPr>
-        <w:t xml:space="preserve">795 nm design with modular </w:t>
+        <w:t xml:space="preserve">795 nm design with modular fibre collimators and telescopes with two CP32 lens plates each. Eight pedestal connections use 8-32 studs. Two steering mirrors per beam remain; top-flange hardware follows our existing design. Quantities are installed requirements before laboratory stock deductions.</w:t>
       </w:r>
-      <w:proofErr w:type="spellStart"/>
+    </w:p>
+    <w:p>
       <w:r>
         <w:rPr>
           <w:sz w:val="18"/>
         </w:rPr>
-        <w:t>fibre</w:t>
-      </w:r>
-      <w:proofErr w:type="spellEnd"/>
-      <w:r>
-        <w:rPr>
-          <w:sz w:val="18"/>
-        </w:rPr>
-        <w:t xml:space="preserve"> collimators and telescopes with two CP32/M lens plates each. Two steering mirrors per beam remain; top-flange hardware follows our existing design. Quantities are installed requirements before laboratory stock deductions.</w:t>
+        <w:t xml:space="preserve">Assembly note: No adhesive is specified for the PBS125-to-CRM05 bond. Confirm a suitable adhesive and laboratory supply before assembly.</w:t>
       </w:r>
     </w:p>
     <w:tbl>
@@ -2234,15 +2180,7 @@
               <w:spacing w:after="0" w:line="240" w:lineRule="auto"/>
             </w:pPr>
             <w:r>
-              <w:t>A390TM-</w:t>
-            </w:r>
-            <w:proofErr w:type="gramStart"/>
-            <w:r>
-              <w:t>B  |</w:t>
-            </w:r>
-            <w:proofErr w:type="gramEnd"/>
-            <w:r>
-              <w:t xml:space="preserve">  mounted collimation </w:t>
+              <w:t xml:space="preserve">A390TM-B  |  mounted collimation </w:t>
             </w:r>
             <w:proofErr w:type="spellStart"/>
             <w:r>
@@ -2312,15 +2250,7 @@
               <w:spacing w:after="0" w:line="240" w:lineRule="auto"/>
             </w:pPr>
             <w:r>
-              <w:t>S05TM</w:t>
-            </w:r>
-            <w:proofErr w:type="gramStart"/>
-            <w:r>
-              <w:t>09  |</w:t>
-            </w:r>
-            <w:proofErr w:type="gramEnd"/>
-            <w:r>
-              <w:t xml:space="preserve">  M9 × 0.5 to SM05 lens adapter</w:t>
+              <w:t>S05TM09  |  M9 × 0.5 to SM05 lens adapter</w:t>
             </w:r>
           </w:p>
         </w:tc>
@@ -2377,15 +2307,7 @@
               <w:spacing w:after="0" w:line="240" w:lineRule="auto"/>
             </w:pPr>
             <w:r>
-              <w:t>SM05L</w:t>
-            </w:r>
-            <w:proofErr w:type="gramStart"/>
-            <w:r>
-              <w:t>05  |</w:t>
-            </w:r>
-            <w:proofErr w:type="gramEnd"/>
-            <w:r>
-              <w:t xml:space="preserve">  ½ in collimator lens tube</w:t>
+              <w:t>SM05L05  |  ½ in collimator lens tube</w:t>
             </w:r>
           </w:p>
         </w:tc>
@@ -2442,15 +2364,7 @@
               <w:spacing w:after="0" w:line="240" w:lineRule="auto"/>
             </w:pPr>
             <w:r>
-              <w:t>SM05FCA</w:t>
-            </w:r>
-            <w:proofErr w:type="gramStart"/>
-            <w:r>
-              <w:t>2  |</w:t>
-            </w:r>
-            <w:proofErr w:type="gramEnd"/>
-            <w:r>
-              <w:t xml:space="preserve">  FC/APC </w:t>
+              <w:t xml:space="preserve">SM05FCA2  |  FC/APC </w:t>
             </w:r>
             <w:proofErr w:type="spellStart"/>
             <w:r>
@@ -2523,15 +2437,7 @@
               <w:spacing w:after="0" w:line="240" w:lineRule="auto"/>
             </w:pPr>
             <w:r>
-              <w:t>AHWP05M-</w:t>
-            </w:r>
-            <w:proofErr w:type="gramStart"/>
-            <w:r>
-              <w:t>980  |</w:t>
-            </w:r>
-            <w:proofErr w:type="gramEnd"/>
-            <w:r>
-              <w:t xml:space="preserve">  half-wave plate</w:t>
+              <w:t>AHWP05M-980  |  half-wave plate</w:t>
             </w:r>
           </w:p>
         </w:tc>
@@ -2588,15 +2494,7 @@
               <w:spacing w:after="0" w:line="240" w:lineRule="auto"/>
             </w:pPr>
             <w:r>
-              <w:t>LC1054-</w:t>
-            </w:r>
-            <w:proofErr w:type="gramStart"/>
-            <w:r>
-              <w:t>B  |</w:t>
-            </w:r>
-            <w:proofErr w:type="gramEnd"/>
-            <w:r>
-              <w:t xml:space="preserve">  telescope lens, f = −25 mm</w:t>
+              <w:t>LC1054-B  |  telescope lens, f = −25 mm</w:t>
             </w:r>
           </w:p>
         </w:tc>
@@ -2653,15 +2551,7 @@
               <w:spacing w:after="0" w:line="240" w:lineRule="auto"/>
             </w:pPr>
             <w:r>
-              <w:t>LA1213-</w:t>
-            </w:r>
-            <w:proofErr w:type="gramStart"/>
-            <w:r>
-              <w:t>B  |</w:t>
-            </w:r>
-            <w:proofErr w:type="gramEnd"/>
-            <w:r>
-              <w:t xml:space="preserve">  unmounted telescope lens</w:t>
+              <w:t>LA1213-B  |  unmounted telescope lens</w:t>
             </w:r>
             <w:r>
               <w:rPr>
@@ -2726,15 +2616,9 @@
               <w:spacing w:after="0" w:line="240" w:lineRule="auto"/>
             </w:pPr>
             <w:r>
-              <w:t>KM05/</w:t>
-            </w:r>
-            <w:proofErr w:type="gramStart"/>
-            <w:r>
-              <w:t>M  |</w:t>
-            </w:r>
-            <w:proofErr w:type="gramEnd"/>
-            <w:r>
-              <w:t xml:space="preserve">  ½ in two-axis mirror mount </w:t>
+              <w:t xml:space="preserve">KM05  |  ½ in two-axis mirror mount</w:t>
+              <w:br/>
+              <w:t xml:space="preserve">8-32 post mounting threads</w:t>
             </w:r>
           </w:p>
         </w:tc>
@@ -2748,14 +2632,14 @@
               <w:spacing w:after="0"/>
               <w:jc w:val="center"/>
             </w:pPr>
-            <w:hyperlink r:id="rId28">
+            <w:hyperlink r:id="rId73">
               <w:r>
                 <w:rPr>
                   <w:color w:val="17588B"/>
                   <w:sz w:val="20"/>
                   <w:u w:val="single"/>
                 </w:rPr>
-                <w:t>Thorlabs</w:t>
+                <w:t xml:space="preserve">Thorlabs</w:t>
               </w:r>
             </w:hyperlink>
           </w:p>
@@ -2771,7 +2655,7 @@
               <w:jc w:val="center"/>
             </w:pPr>
             <w:r>
-              <w:t>4</w:t>
+              <w:t xml:space="preserve">4</w:t>
             </w:r>
           </w:p>
         </w:tc>
@@ -2791,18 +2675,10 @@
               <w:spacing w:after="0" w:line="240" w:lineRule="auto"/>
             </w:pPr>
             <w:r>
-              <w:t>CRM1T/</w:t>
-            </w:r>
-            <w:proofErr w:type="gramStart"/>
-            <w:r>
-              <w:t>M</w:t>
-            </w:r>
-            <w:r>
-              <w:t xml:space="preserve">  |</w:t>
-            </w:r>
-            <w:proofErr w:type="gramEnd"/>
-            <w:r>
-              <w:t xml:space="preserve">  cage rotation mount</w:t>
+              <w:t>CRM1T/M</w:t>
+            </w:r>
+            <w:r>
+              <w:t xml:space="preserve">  |  cage rotation mount</w:t>
             </w:r>
           </w:p>
         </w:tc>
@@ -2859,15 +2735,7 @@
               <w:spacing w:after="0" w:line="240" w:lineRule="auto"/>
             </w:pPr>
             <w:r>
-              <w:t>CRM</w:t>
-            </w:r>
-            <w:proofErr w:type="gramStart"/>
-            <w:r>
-              <w:t>05  |</w:t>
-            </w:r>
-            <w:proofErr w:type="gramEnd"/>
-            <w:r>
-              <w:t xml:space="preserve">  ½ in rotation adapter</w:t>
+              <w:t>CRM05  |  ½ in rotation adapter</w:t>
             </w:r>
           </w:p>
         </w:tc>
@@ -2924,15 +2792,7 @@
               <w:spacing w:after="0" w:line="240" w:lineRule="auto"/>
             </w:pPr>
             <w:r>
-              <w:t>CP33/</w:t>
-            </w:r>
-            <w:proofErr w:type="gramStart"/>
-            <w:r>
-              <w:t>M  |</w:t>
-            </w:r>
-            <w:proofErr w:type="gramEnd"/>
-            <w:r>
-              <w:t xml:space="preserve">  30 mm cage plate</w:t>
+              <w:t>CP33/M  |  30 mm cage plate</w:t>
             </w:r>
           </w:p>
         </w:tc>
@@ -2989,15 +2849,9 @@
               <w:spacing w:after="0" w:line="240" w:lineRule="auto"/>
             </w:pPr>
             <w:r>
-              <w:t>CP32/</w:t>
-            </w:r>
-            <w:proofErr w:type="gramStart"/>
-            <w:r>
-              <w:t>M  |</w:t>
-            </w:r>
-            <w:proofErr w:type="gramEnd"/>
-            <w:r>
-              <w:t xml:space="preserve">  ½ in lens cage plate</w:t>
+              <w:t xml:space="preserve">CP32  |  ½ in lens cage plate</w:t>
+              <w:br/>
+              <w:t xml:space="preserve">8-32 post mounting thread</w:t>
             </w:r>
           </w:p>
         </w:tc>
@@ -3011,14 +2865,14 @@
               <w:spacing w:after="0"/>
               <w:jc w:val="center"/>
             </w:pPr>
-            <w:hyperlink r:id="rId32">
+            <w:hyperlink r:id="rId74">
               <w:r>
                 <w:rPr>
                   <w:color w:val="17588B"/>
                   <w:sz w:val="20"/>
                   <w:u w:val="single"/>
                 </w:rPr>
-                <w:t>Thorlabs</w:t>
+                <w:t xml:space="preserve">Thorlabs</w:t>
               </w:r>
             </w:hyperlink>
           </w:p>
@@ -3034,7 +2888,7 @@
               <w:jc w:val="center"/>
             </w:pPr>
             <w:r>
-              <w:t>6</w:t>
+              <w:t xml:space="preserve">6</w:t>
             </w:r>
           </w:p>
         </w:tc>
@@ -3054,15 +2908,7 @@
               <w:spacing w:after="0" w:line="240" w:lineRule="auto"/>
             </w:pPr>
             <w:r>
-              <w:t>ER6</w:t>
-            </w:r>
-            <w:proofErr w:type="gramStart"/>
-            <w:r>
-              <w:t>E  |</w:t>
-            </w:r>
-            <w:proofErr w:type="gramEnd"/>
-            <w:r>
-              <w:t xml:space="preserve">  6 in engraved cage rod</w:t>
+              <w:t>ER6E  |  6 in engraved cage rod</w:t>
             </w:r>
             <w:r>
               <w:rPr>
@@ -3133,15 +2979,9 @@
               <w:spacing w:after="0" w:line="240" w:lineRule="auto"/>
             </w:pPr>
             <w:r>
-              <w:t>ER</w:t>
-            </w:r>
-            <w:proofErr w:type="gramStart"/>
-            <w:r>
-              <w:t>1  |</w:t>
-            </w:r>
-            <w:proofErr w:type="gramEnd"/>
-            <w:r>
-              <w:t xml:space="preserve">  1 in cage rod</w:t>
+              <w:t xml:space="preserve">ER1.5  |  1.5 in cage rod</w:t>
+              <w:br/>
+              <w:t xml:space="preserve">38.1 mm; remove both factory 4-40 end studs from each of the four rods</w:t>
             </w:r>
           </w:p>
         </w:tc>
@@ -3155,14 +2995,14 @@
               <w:spacing w:after="0"/>
               <w:jc w:val="center"/>
             </w:pPr>
-            <w:hyperlink r:id="rId34">
+            <w:hyperlink r:id="rId72">
               <w:r>
                 <w:rPr>
                   <w:color w:val="17588B"/>
                   <w:sz w:val="20"/>
                   <w:u w:val="single"/>
                 </w:rPr>
-                <w:t>Thorlabs</w:t>
+                <w:t xml:space="preserve">Thorlabs</w:t>
               </w:r>
             </w:hyperlink>
           </w:p>
@@ -3178,7 +3018,7 @@
               <w:jc w:val="center"/>
             </w:pPr>
             <w:r>
-              <w:t>4</w:t>
+              <w:t xml:space="preserve">4</w:t>
             </w:r>
           </w:p>
         </w:tc>
@@ -3198,15 +3038,7 @@
               <w:spacing w:after="0" w:line="240" w:lineRule="auto"/>
             </w:pPr>
             <w:r>
-              <w:t>LCP</w:t>
-            </w:r>
-            <w:proofErr w:type="gramStart"/>
-            <w:r>
-              <w:t>33  |</w:t>
-            </w:r>
-            <w:proofErr w:type="gramEnd"/>
-            <w:r>
-              <w:t xml:space="preserve">  30 mm to 60 mm cage plate</w:t>
+              <w:t>LCP33  |  30 mm to 60 mm cage plate</w:t>
             </w:r>
           </w:p>
         </w:tc>
@@ -3263,15 +3095,7 @@
               <w:spacing w:after="0" w:line="240" w:lineRule="auto"/>
             </w:pPr>
             <w:r>
-              <w:t>CCM1-E03/</w:t>
-            </w:r>
-            <w:proofErr w:type="gramStart"/>
-            <w:r>
-              <w:t>M  |</w:t>
-            </w:r>
-            <w:proofErr w:type="gramEnd"/>
-            <w:r>
-              <w:t xml:space="preserve">  fixed 45° cage mirror</w:t>
+              <w:t>CCM1-E03/M  |  fixed 45° cage mirror</w:t>
             </w:r>
           </w:p>
         </w:tc>
@@ -3328,275 +3152,13 @@
               <w:spacing w:after="0" w:line="240" w:lineRule="auto"/>
             </w:pPr>
             <w:r>
-              <w:t>RS2P4M  |  Ø25 mm fixed pedestal post</w:t>
-            </w:r>
-            <w:r>
               <w:rPr>
                 <w:color w:val="4A4A4A"/>
                 <w:sz w:val="18"/>
               </w:rPr>
+              <w:t xml:space="preserve">RS2P8E  |  Ø1 in fixed pedestal post</w:t>
               <w:br/>
-              <w:t xml:space="preserve">50 mm height; M4 tapped ends; 4 telescope + 4 mirror supports</w:t>
-            </w:r>
-          </w:p>
-        </w:tc>
-        <w:tc>
-          <w:tcPr>
-            <w:tcW w:w="2608" w:type="dxa"/>
-            <w:vAlign w:val="center"/>
-          </w:tcPr>
-          <w:p>
-            <w:pPr>
-              <w:spacing w:after="0"/>
-              <w:jc w:val="center"/>
-            </w:pPr>
-            <w:hyperlink r:id="rId72">
-              <w:r>
-                <w:rPr>
-                  <w:color w:val="17588B"/>
-                  <w:sz w:val="20"/>
-                  <w:u w:val="single"/>
-                </w:rPr>
-                <w:t xml:space="preserve">Thorlabs</w:t>
-              </w:r>
-            </w:hyperlink>
-          </w:p>
-        </w:tc>
-        <w:tc>
-          <w:tcPr>
-            <w:tcW w:w="1531" w:type="dxa"/>
-            <w:vAlign w:val="center"/>
-          </w:tcPr>
-          <w:p>
-            <w:pPr>
-              <w:spacing w:after="0" w:line="240" w:lineRule="auto"/>
-              <w:jc w:val="center"/>
-            </w:pPr>
-            <w:r>
-              <w:t xml:space="preserve">8</w:t>
-            </w:r>
-          </w:p>
-        </w:tc>
-      </w:tr>
-      <w:tr>
-        <w:trPr>
-          <w:cantSplit/>
-          <w:jc w:val="center"/>
-        </w:trPr>
-        <w:tc>
-          <w:tcPr>
-            <w:tcW w:w="5953" w:type="dxa"/>
-            <w:vAlign w:val="center"/>
-          </w:tcPr>
-          <w:p>
-            <w:pPr>
-              <w:spacing w:after="0" w:line="240" w:lineRule="auto"/>
-            </w:pPr>
-            <w:r>
-              <w:t>RS5M  |  Ø25 mm post spacer</w:t>
-            </w:r>
-            <w:r>
-              <w:rPr>
-                <w:color w:val="4A4A4A"/>
-                <w:sz w:val="18"/>
-              </w:rPr>
-              <w:br/>
-              <w:t xml:space="preserve">5 mm thick; A1 and B1 steering supports</w:t>
-            </w:r>
-          </w:p>
-        </w:tc>
-        <w:tc>
-          <w:tcPr>
-            <w:tcW w:w="2608" w:type="dxa"/>
-            <w:vAlign w:val="center"/>
-          </w:tcPr>
-          <w:p>
-            <w:pPr>
-              <w:spacing w:after="0"/>
-              <w:jc w:val="center"/>
-            </w:pPr>
-            <w:hyperlink r:id="rId73">
-              <w:r>
-                <w:rPr>
-                  <w:color w:val="17588B"/>
-                  <w:sz w:val="20"/>
-                  <w:u w:val="single"/>
-                </w:rPr>
-                <w:t xml:space="preserve">Thorlabs</w:t>
-              </w:r>
-            </w:hyperlink>
-          </w:p>
-        </w:tc>
-        <w:tc>
-          <w:tcPr>
-            <w:tcW w:w="1531" w:type="dxa"/>
-            <w:vAlign w:val="center"/>
-          </w:tcPr>
-          <w:p>
-            <w:pPr>
-              <w:spacing w:after="0" w:line="240" w:lineRule="auto"/>
-              <w:jc w:val="center"/>
-            </w:pPr>
-            <w:r>
-              <w:t xml:space="preserve">2</w:t>
-            </w:r>
-          </w:p>
-        </w:tc>
-      </w:tr>
-      <w:tr>
-        <w:trPr>
-          <w:cantSplit/>
-          <w:jc w:val="center"/>
-        </w:trPr>
-        <w:tc>
-          <w:tcPr>
-            <w:tcW w:w="5953" w:type="dxa"/>
-            <w:vAlign w:val="center"/>
-          </w:tcPr>
-          <w:p>
-            <w:pPr>
-              <w:spacing w:after="0" w:line="240" w:lineRule="auto"/>
-            </w:pPr>
-            <w:r>
-              <w:t>RS4M  |  Ø25 mm post spacer</w:t>
-            </w:r>
-            <w:r>
-              <w:rPr>
-                <w:color w:val="4A4A4A"/>
-                <w:sz w:val="18"/>
-              </w:rPr>
-              <w:br/>
-              <w:t xml:space="preserve">4 mm thick; A2 steering support (lowers A2 1 mm to clear beam B)</w:t>
-            </w:r>
-          </w:p>
-        </w:tc>
-        <w:tc>
-          <w:tcPr>
-            <w:tcW w:w="2608" w:type="dxa"/>
-            <w:vAlign w:val="center"/>
-          </w:tcPr>
-          <w:p>
-            <w:pPr>
-              <w:spacing w:after="0"/>
-              <w:jc w:val="center"/>
-            </w:pPr>
-            <w:hyperlink r:id="rId87">
-              <w:r>
-                <w:rPr>
-                  <w:color w:val="17588B"/>
-                  <w:sz w:val="20"/>
-                  <w:u w:val="single"/>
-                </w:rPr>
-                <w:t xml:space="preserve">Thorlabs</w:t>
-              </w:r>
-            </w:hyperlink>
-          </w:p>
-        </w:tc>
-        <w:tc>
-          <w:tcPr>
-            <w:tcW w:w="1531" w:type="dxa"/>
-            <w:vAlign w:val="center"/>
-          </w:tcPr>
-          <w:p>
-            <w:pPr>
-              <w:spacing w:after="0" w:line="240" w:lineRule="auto"/>
-              <w:jc w:val="center"/>
-            </w:pPr>
-            <w:r>
-              <w:t xml:space="preserve">1</w:t>
-            </w:r>
-          </w:p>
-        </w:tc>
-      </w:tr>
-      <w:tr>
-        <w:trPr>
-          <w:cantSplit/>
-          <w:jc w:val="center"/>
-        </w:trPr>
-        <w:tc>
-          <w:tcPr>
-            <w:tcW w:w="5953" w:type="dxa"/>
-            <w:vAlign w:val="center"/>
-          </w:tcPr>
-          <w:p>
-            <w:pPr>
-              <w:spacing w:after="0" w:line="240" w:lineRule="auto"/>
-            </w:pPr>
-            <w:r>
-              <w:t>PS-F-1.0  |  pedestal clamping fork</w:t>
-            </w:r>
-            <w:r>
-              <w:rPr>
-                <w:color w:val="4A4A4A"/>
-                <w:sz w:val="18"/>
-              </w:rPr>
-              <w:br/>
-              <w:t xml:space="preserve">Stainless steel; 1 in slot; for 1/4-20 fixing screws</w:t>
-            </w:r>
-          </w:p>
-        </w:tc>
-        <w:tc>
-          <w:tcPr>
-            <w:tcW w:w="2608" w:type="dxa"/>
-            <w:vAlign w:val="center"/>
-          </w:tcPr>
-          <w:p>
-            <w:pPr>
-              <w:spacing w:after="0"/>
-              <w:jc w:val="center"/>
-            </w:pPr>
-            <w:hyperlink r:id="rId74">
-              <w:r>
-                <w:rPr>
-                  <w:color w:val="17588B"/>
-                  <w:sz w:val="20"/>
-                  <w:u w:val="single"/>
-                </w:rPr>
-                <w:t xml:space="preserve">Newport</w:t>
-              </w:r>
-            </w:hyperlink>
-          </w:p>
-        </w:tc>
-        <w:tc>
-          <w:tcPr>
-            <w:tcW w:w="1531" w:type="dxa"/>
-            <w:vAlign w:val="center"/>
-          </w:tcPr>
-          <w:p>
-            <w:pPr>
-              <w:spacing w:after="0" w:line="240" w:lineRule="auto"/>
-              <w:jc w:val="center"/>
-            </w:pPr>
-            <w:r>
-              <w:t xml:space="preserve">8</w:t>
-            </w:r>
-          </w:p>
-        </w:tc>
-      </w:tr>
-      <w:tr>
-        <w:trPr>
-          <w:cantSplit/>
-          <w:jc w:val="center"/>
-        </w:trPr>
-        <w:tc>
-          <w:tcPr>
-            <w:tcW w:w="5953" w:type="dxa"/>
-            <w:vAlign w:val="center"/>
-          </w:tcPr>
-          <w:p>
-            <w:pPr>
-              <w:spacing w:after="0" w:line="240" w:lineRule="auto"/>
-            </w:pPr>
-            <w:r>
-              <w:t>MB1224  |  24 × 12 × ½ in breadboard</w:t>
-            </w:r>
-            <w:r>
-              <w:rPr>
-                <w:color w:val="4A4A4A"/>
-                <w:sz w:val="18"/>
-              </w:rPr>
-              <w:br/>
-              <w:t xml:space="preserve">609.6 × 304.8 × 12.7 mm; 1/4-20 grid</w:t>
+              <w:t xml:space="preserve">2 in nominal height; 8-32 tapped ends; 4 telescope + 4 mirror supports</w:t>
             </w:r>
           </w:p>
         </w:tc>
@@ -3633,7 +3195,7 @@
               <w:jc w:val="center"/>
             </w:pPr>
             <w:r>
-              <w:t xml:space="preserve">1</w:t>
+              <w:t xml:space="preserve">8</w:t>
             </w:r>
           </w:p>
         </w:tc>
@@ -3653,15 +3215,330 @@
               <w:spacing w:after="0" w:line="240" w:lineRule="auto"/>
             </w:pPr>
             <w:r>
-              <w:t>MRA12-E</w:t>
-            </w:r>
-            <w:proofErr w:type="gramStart"/>
-            <w:r>
-              <w:t>03  |</w:t>
-            </w:r>
-            <w:proofErr w:type="gramEnd"/>
-            <w:r>
-              <w:t xml:space="preserve">  internal right-angle prism mirror</w:t>
+              <w:t>RS5M  |  Ø25 mm post spacer</w:t>
+            </w:r>
+            <w:r>
+              <w:rPr>
+                <w:color w:val="4A4A4A"/>
+                <w:sz w:val="18"/>
+              </w:rPr>
+              <w:br/>
+              <w:t>5 mm thick; A1 and B1 steering supports</w:t>
+            </w:r>
+          </w:p>
+        </w:tc>
+        <w:tc>
+          <w:tcPr>
+            <w:tcW w:w="2608" w:type="dxa"/>
+            <w:vAlign w:val="center"/>
+          </w:tcPr>
+          <w:p>
+            <w:pPr>
+              <w:spacing w:after="0"/>
+              <w:jc w:val="center"/>
+            </w:pPr>
+            <w:hyperlink r:id="rId38">
+              <w:r>
+                <w:rPr>
+                  <w:color w:val="17588B"/>
+                  <w:sz w:val="20"/>
+                  <w:u w:val="single"/>
+                </w:rPr>
+                <w:t>Thorlabs</w:t>
+              </w:r>
+            </w:hyperlink>
+          </w:p>
+        </w:tc>
+        <w:tc>
+          <w:tcPr>
+            <w:tcW w:w="1531" w:type="dxa"/>
+            <w:vAlign w:val="center"/>
+          </w:tcPr>
+          <w:p>
+            <w:pPr>
+              <w:spacing w:after="0" w:line="240" w:lineRule="auto"/>
+              <w:jc w:val="center"/>
+            </w:pPr>
+            <w:r>
+              <w:t>2</w:t>
+            </w:r>
+          </w:p>
+        </w:tc>
+      </w:tr>
+      <w:tr>
+        <w:trPr>
+          <w:cantSplit/>
+          <w:jc w:val="center"/>
+        </w:trPr>
+        <w:tc>
+          <w:tcPr>
+            <w:tcW w:w="5953" w:type="dxa"/>
+            <w:vAlign w:val="center"/>
+          </w:tcPr>
+          <w:p>
+            <w:pPr>
+              <w:spacing w:after="0" w:line="240" w:lineRule="auto"/>
+            </w:pPr>
+            <w:r>
+              <w:t>RS4M  |  Ø25 mm post spacer</w:t>
+            </w:r>
+            <w:r>
+              <w:rPr>
+                <w:color w:val="4A4A4A"/>
+                <w:sz w:val="18"/>
+              </w:rPr>
+              <w:br/>
+              <w:t>4 mm thick; A2 steering support (lowers A2 1 mm to clear beam B)</w:t>
+            </w:r>
+          </w:p>
+        </w:tc>
+        <w:tc>
+          <w:tcPr>
+            <w:tcW w:w="2608" w:type="dxa"/>
+            <w:vAlign w:val="center"/>
+          </w:tcPr>
+          <w:p>
+            <w:pPr>
+              <w:spacing w:after="0"/>
+              <w:jc w:val="center"/>
+            </w:pPr>
+            <w:hyperlink r:id="rId39">
+              <w:r>
+                <w:rPr>
+                  <w:color w:val="17588B"/>
+                  <w:sz w:val="20"/>
+                  <w:u w:val="single"/>
+                </w:rPr>
+                <w:t>Thorlabs</w:t>
+              </w:r>
+            </w:hyperlink>
+          </w:p>
+        </w:tc>
+        <w:tc>
+          <w:tcPr>
+            <w:tcW w:w="1531" w:type="dxa"/>
+            <w:vAlign w:val="center"/>
+          </w:tcPr>
+          <w:p>
+            <w:pPr>
+              <w:spacing w:after="0" w:line="240" w:lineRule="auto"/>
+              <w:jc w:val="center"/>
+            </w:pPr>
+            <w:r>
+              <w:t>1</w:t>
+            </w:r>
+          </w:p>
+        </w:tc>
+      </w:tr>
+      <w:tr>
+        <w:trPr>
+          <w:cantSplit/>
+          <w:jc w:val="center"/>
+        </w:trPr>
+        <w:tc>
+          <w:tcPr>
+            <w:tcW w:w="5953" w:type="dxa"/>
+            <w:vAlign w:val="center"/>
+          </w:tcPr>
+          <w:p>
+            <w:pPr>
+              <w:spacing w:after="0" w:line="240" w:lineRule="auto"/>
+            </w:pPr>
+            <w:r>
+              <w:t>PS-F-1.0  |  pedestal clamping fork</w:t>
+            </w:r>
+            <w:r>
+              <w:rPr>
+                <w:color w:val="4A4A4A"/>
+                <w:sz w:val="18"/>
+              </w:rPr>
+              <w:br/>
+              <w:t>Stainless steel; 1 in slot; for 1/4-20 fixing screws</w:t>
+            </w:r>
+          </w:p>
+        </w:tc>
+        <w:tc>
+          <w:tcPr>
+            <w:tcW w:w="2608" w:type="dxa"/>
+            <w:vAlign w:val="center"/>
+          </w:tcPr>
+          <w:p>
+            <w:pPr>
+              <w:spacing w:after="0"/>
+              <w:jc w:val="center"/>
+            </w:pPr>
+            <w:hyperlink r:id="rId40">
+              <w:r>
+                <w:rPr>
+                  <w:color w:val="17588B"/>
+                  <w:sz w:val="20"/>
+                  <w:u w:val="single"/>
+                </w:rPr>
+                <w:t>Newport</w:t>
+              </w:r>
+            </w:hyperlink>
+          </w:p>
+        </w:tc>
+        <w:tc>
+          <w:tcPr>
+            <w:tcW w:w="1531" w:type="dxa"/>
+            <w:vAlign w:val="center"/>
+          </w:tcPr>
+          <w:p>
+            <w:pPr>
+              <w:spacing w:after="0" w:line="240" w:lineRule="auto"/>
+              <w:jc w:val="center"/>
+            </w:pPr>
+            <w:r>
+              <w:t>8</w:t>
+            </w:r>
+          </w:p>
+        </w:tc>
+      </w:tr>
+      <w:tr>
+        <w:trPr>
+          <w:cantSplit/>
+          <w:jc w:val="center"/>
+        </w:trPr>
+        <w:tc>
+          <w:tcPr>
+            <w:tcW w:w="5953" w:type="dxa"/>
+            <w:vAlign w:val="center"/>
+          </w:tcPr>
+          <w:p>
+            <w:pPr>
+              <w:spacing w:after="0" w:line="240" w:lineRule="auto"/>
+            </w:pPr>
+            <w:r>
+              <w:t>MB1224  |  24 × 12 × ½ in breadboard</w:t>
+            </w:r>
+            <w:r>
+              <w:rPr>
+                <w:color w:val="4A4A4A"/>
+                <w:sz w:val="18"/>
+              </w:rPr>
+              <w:br/>
+              <w:t>609.6 × 304.8 × 12.7 mm; 1/4-20 grid</w:t>
+            </w:r>
+          </w:p>
+        </w:tc>
+        <w:tc>
+          <w:tcPr>
+            <w:tcW w:w="2608" w:type="dxa"/>
+            <w:vAlign w:val="center"/>
+          </w:tcPr>
+          <w:p>
+            <w:pPr>
+              <w:spacing w:after="0"/>
+              <w:jc w:val="center"/>
+            </w:pPr>
+            <w:hyperlink r:id="rId41">
+              <w:r>
+                <w:rPr>
+                  <w:color w:val="17588B"/>
+                  <w:sz w:val="20"/>
+                  <w:u w:val="single"/>
+                </w:rPr>
+                <w:t>Thorlabs</w:t>
+              </w:r>
+            </w:hyperlink>
+          </w:p>
+        </w:tc>
+        <w:tc>
+          <w:tcPr>
+            <w:tcW w:w="1531" w:type="dxa"/>
+            <w:vAlign w:val="center"/>
+          </w:tcPr>
+          <w:p>
+            <w:pPr>
+              <w:spacing w:after="0" w:line="240" w:lineRule="auto"/>
+              <w:jc w:val="center"/>
+            </w:pPr>
+            <w:r>
+              <w:t>1</w:t>
+            </w:r>
+          </w:p>
+        </w:tc>
+      </w:tr>
+      <w:tr>
+        <w:trPr>
+          <w:cantSplit/>
+          <w:jc w:val="center"/>
+        </w:trPr>
+        <w:tc>
+          <w:tcPr>
+            <w:tcW w:w="5953" w:type="dxa"/>
+            <w:vAlign w:val="center"/>
+          </w:tcPr>
+          <w:p>
+            <w:pPr>
+              <w:spacing w:after="0" w:line="240" w:lineRule="auto"/>
+            </w:pPr>
+            <w:r>
+              <w:t>MRA12-E03  |  internal right-angle prism mirror</w:t>
+            </w:r>
+          </w:p>
+        </w:tc>
+        <w:tc>
+          <w:tcPr>
+            <w:tcW w:w="2608" w:type="dxa"/>
+            <w:vAlign w:val="center"/>
+          </w:tcPr>
+          <w:p>
+            <w:pPr>
+              <w:spacing w:after="0"/>
+              <w:jc w:val="center"/>
+            </w:pPr>
+            <w:hyperlink r:id="rId42">
+              <w:r>
+                <w:rPr>
+                  <w:color w:val="17588B"/>
+                  <w:sz w:val="20"/>
+                  <w:u w:val="single"/>
+                </w:rPr>
+                <w:t>Thorlabs</w:t>
+              </w:r>
+            </w:hyperlink>
+          </w:p>
+        </w:tc>
+        <w:tc>
+          <w:tcPr>
+            <w:tcW w:w="1531" w:type="dxa"/>
+            <w:vAlign w:val="center"/>
+          </w:tcPr>
+          <w:p>
+            <w:pPr>
+              <w:spacing w:after="0" w:line="240" w:lineRule="auto"/>
+              <w:jc w:val="center"/>
+            </w:pPr>
+            <w:r>
+              <w:t>2</w:t>
+            </w:r>
+          </w:p>
+        </w:tc>
+      </w:tr>
+      <w:tr>
+        <w:trPr>
+          <w:cantSplit/>
+          <w:jc w:val="center"/>
+        </w:trPr>
+        <w:tc>
+          <w:tcPr>
+            <w:tcW w:w="5953" w:type="dxa"/>
+            <w:vAlign w:val="center"/>
+          </w:tcPr>
+          <w:p>
+            <w:pPr>
+              <w:spacing w:after="0" w:line="240" w:lineRule="auto"/>
+            </w:pPr>
+            <w:r>
+              <w:t>HRS</w:t>
+            </w:r>
+            <w:r>
+              <w:t>1</w:t>
+            </w:r>
+            <w:r>
+              <w:t>015-AG  |  internal hollow roof mirror</w:t>
             </w:r>
           </w:p>
         </w:tc>
@@ -3698,77 +3575,6 @@
               <w:jc w:val="center"/>
             </w:pPr>
             <w:r>
-              <w:t>2</w:t>
-            </w:r>
-          </w:p>
-        </w:tc>
-      </w:tr>
-      <w:tr>
-        <w:trPr>
-          <w:cantSplit/>
-          <w:jc w:val="center"/>
-        </w:trPr>
-        <w:tc>
-          <w:tcPr>
-            <w:tcW w:w="5953" w:type="dxa"/>
-            <w:vAlign w:val="center"/>
-          </w:tcPr>
-          <w:p>
-            <w:pPr>
-              <w:spacing w:after="0" w:line="240" w:lineRule="auto"/>
-            </w:pPr>
-            <w:r>
-              <w:t>HRS</w:t>
-            </w:r>
-            <w:r>
-              <w:t>1</w:t>
-            </w:r>
-            <w:r>
-              <w:t>015-</w:t>
-            </w:r>
-            <w:proofErr w:type="gramStart"/>
-            <w:r>
-              <w:t>AG  |</w:t>
-            </w:r>
-            <w:proofErr w:type="gramEnd"/>
-            <w:r>
-              <w:t xml:space="preserve">  internal hollow roof mirror</w:t>
-            </w:r>
-          </w:p>
-        </w:tc>
-        <w:tc>
-          <w:tcPr>
-            <w:tcW w:w="2608" w:type="dxa"/>
-            <w:vAlign w:val="center"/>
-          </w:tcPr>
-          <w:p>
-            <w:pPr>
-              <w:spacing w:after="0"/>
-              <w:jc w:val="center"/>
-            </w:pPr>
-            <w:hyperlink r:id="rId44">
-              <w:r>
-                <w:rPr>
-                  <w:color w:val="17588B"/>
-                  <w:sz w:val="20"/>
-                  <w:u w:val="single"/>
-                </w:rPr>
-                <w:t>Thorlabs</w:t>
-              </w:r>
-            </w:hyperlink>
-          </w:p>
-        </w:tc>
-        <w:tc>
-          <w:tcPr>
-            <w:tcW w:w="1531" w:type="dxa"/>
-            <w:vAlign w:val="center"/>
-          </w:tcPr>
-          <w:p>
-            <w:pPr>
-              <w:spacing w:after="0" w:line="240" w:lineRule="auto"/>
-              <w:jc w:val="center"/>
-            </w:pPr>
-            <w:r>
               <w:t>1</w:t>
             </w:r>
           </w:p>
@@ -3778,6 +3584,7 @@
     <w:p>
       <w:pPr>
         <w:pStyle w:val="1"/>
+        <w:pageBreakBefore/>
       </w:pPr>
       <w:r>
         <w:t>Fridge CNC parts and internal fasteners</w:t>
@@ -3789,6 +3596,14 @@
           <w:sz w:val="18"/>
         </w:rPr>
         <w:t>Machine both internal mount options, one of each. The four legs have different hole positions. Two identical half-rings make one complete flange clamp.</w:t>
+      </w:r>
+    </w:p>
+    <w:p>
+      <w:r>
+        <w:rPr>
+          <w:sz w:val="18"/>
+        </w:rPr>
+        <w:t xml:space="preserve">Assembly note: Each mirror-mount variant requires two 0.50 mm flat stop shims (four total). The shim purchase row remains omitted pending confirmation of supply; this omission does not confirm laboratory stock.</w:t>
       </w:r>
     </w:p>
     <w:p>
@@ -3917,7 +3732,7 @@
               <w:spacing w:after="0" w:line="240" w:lineRule="auto"/>
               <w:jc w:val="center"/>
             </w:pPr>
-            <w:hyperlink r:id="rId45">
+            <w:hyperlink r:id="rId44">
               <w:r>
                 <w:rPr>
                   <w:color w:val="17588B"/>
@@ -3930,7 +3745,7 @@
             <w:r>
               <w:t xml:space="preserve">  |  </w:t>
             </w:r>
-            <w:hyperlink r:id="rId46">
+            <w:hyperlink r:id="rId45">
               <w:r>
                 <w:rPr>
                   <w:color w:val="17588B"/>
@@ -3973,6 +3788,7 @@
               <w:spacing w:after="0" w:line="240" w:lineRule="auto"/>
             </w:pPr>
             <w:r>
+              <w:lastRenderedPageBreak/>
               <w:t>Leg_2</w:t>
             </w:r>
           </w:p>
@@ -3987,7 +3803,7 @@
               <w:spacing w:after="0" w:line="240" w:lineRule="auto"/>
               <w:jc w:val="center"/>
             </w:pPr>
-            <w:hyperlink r:id="rId47">
+            <w:hyperlink r:id="rId46">
               <w:r>
                 <w:rPr>
                   <w:color w:val="17588B"/>
@@ -4000,7 +3816,7 @@
             <w:r>
               <w:t xml:space="preserve">  |  </w:t>
             </w:r>
-            <w:hyperlink r:id="rId48">
+            <w:hyperlink r:id="rId47">
               <w:r>
                 <w:rPr>
                   <w:color w:val="17588B"/>
@@ -4043,7 +3859,6 @@
               <w:spacing w:after="0" w:line="240" w:lineRule="auto"/>
             </w:pPr>
             <w:r>
-              <w:lastRenderedPageBreak/>
               <w:t>Leg_3</w:t>
             </w:r>
           </w:p>
@@ -4058,7 +3873,7 @@
               <w:spacing w:after="0" w:line="240" w:lineRule="auto"/>
               <w:jc w:val="center"/>
             </w:pPr>
-            <w:hyperlink r:id="rId49">
+            <w:hyperlink r:id="rId48">
               <w:r>
                 <w:rPr>
                   <w:color w:val="17588B"/>
@@ -4071,7 +3886,7 @@
             <w:r>
               <w:t xml:space="preserve">  |  </w:t>
             </w:r>
-            <w:hyperlink r:id="rId50">
+            <w:hyperlink r:id="rId49">
               <w:r>
                 <w:rPr>
                   <w:color w:val="17588B"/>
@@ -4128,7 +3943,7 @@
               <w:spacing w:after="0" w:line="240" w:lineRule="auto"/>
               <w:jc w:val="center"/>
             </w:pPr>
-            <w:hyperlink r:id="rId51">
+            <w:hyperlink r:id="rId50">
               <w:r>
                 <w:rPr>
                   <w:color w:val="17588B"/>
@@ -4141,7 +3956,7 @@
             <w:r>
               <w:t xml:space="preserve">  |  </w:t>
             </w:r>
-            <w:hyperlink r:id="rId52">
+            <w:hyperlink r:id="rId51">
               <w:r>
                 <w:rPr>
                   <w:color w:val="17588B"/>
@@ -4198,7 +4013,7 @@
               <w:spacing w:after="0" w:line="240" w:lineRule="auto"/>
               <w:jc w:val="center"/>
             </w:pPr>
-            <w:hyperlink r:id="rId53">
+            <w:hyperlink r:id="rId52">
               <w:r>
                 <w:rPr>
                   <w:color w:val="17588B"/>
@@ -4211,7 +4026,7 @@
             <w:r>
               <w:t xml:space="preserve">  |  </w:t>
             </w:r>
-            <w:hyperlink r:id="rId54">
+            <w:hyperlink r:id="rId53">
               <w:r>
                 <w:rPr>
                   <w:color w:val="17588B"/>
@@ -4262,7 +4077,7 @@
                 <w:sz w:val="18"/>
               </w:rPr>
               <w:br/>
-              <w:t xml:space="preserve">3.00 mm solid web below mirror seat; mirror 0.50 mm above body rim</w:t>
+              <w:t>3.00 mm solid web below mirror seat; mirror 0.50 mm above body rim</w:t>
             </w:r>
           </w:p>
         </w:tc>
@@ -4276,7 +4091,7 @@
               <w:spacing w:after="0" w:line="240" w:lineRule="auto"/>
               <w:jc w:val="center"/>
             </w:pPr>
-            <w:hyperlink r:id="rId55">
+            <w:hyperlink r:id="rId54">
               <w:r>
                 <w:rPr>
                   <w:color w:val="17588B"/>
@@ -4289,7 +4104,7 @@
             <w:r>
               <w:t xml:space="preserve">  |  </w:t>
             </w:r>
-            <w:hyperlink r:id="rId56">
+            <w:hyperlink r:id="rId55">
               <w:r>
                 <w:rPr>
                   <w:color w:val="17588B"/>
@@ -4340,7 +4155,7 @@
                 <w:sz w:val="18"/>
               </w:rPr>
               <w:br/>
-              <w:t xml:space="preserve">3.00 mm solid web below mirror seat; mirror 0.50 mm above body rim</w:t>
+              <w:t>3.00 mm solid web below mirror seat; mirror 0.50 mm above body rim</w:t>
             </w:r>
           </w:p>
         </w:tc>
@@ -4354,7 +4169,7 @@
               <w:spacing w:after="0" w:line="240" w:lineRule="auto"/>
               <w:jc w:val="center"/>
             </w:pPr>
-            <w:hyperlink r:id="rId57">
+            <w:hyperlink r:id="rId56">
               <w:r>
                 <w:rPr>
                   <w:color w:val="17588B"/>
@@ -4367,7 +4182,7 @@
             <w:r>
               <w:t xml:space="preserve">  |  </w:t>
             </w:r>
-            <w:hyperlink r:id="rId58">
+            <w:hyperlink r:id="rId57">
               <w:r>
                 <w:rPr>
                   <w:color w:val="17588B"/>
@@ -4418,7 +4233,7 @@
                 <w:sz w:val="18"/>
               </w:rPr>
               <w:br/>
-              <w:t xml:space="preserve">0.30 mm flat sheet; two 0.50 mm calibrated stop shims</w:t>
+              <w:t>0.30 mm flat sheet; two 0.50 mm calibrated stop shims</w:t>
             </w:r>
           </w:p>
         </w:tc>
@@ -4432,7 +4247,7 @@
               <w:spacing w:after="0" w:line="240" w:lineRule="auto"/>
               <w:jc w:val="center"/>
             </w:pPr>
-            <w:hyperlink r:id="rId59">
+            <w:hyperlink r:id="rId58">
               <w:r>
                 <w:rPr>
                   <w:color w:val="17588B"/>
@@ -4445,7 +4260,7 @@
             <w:r>
               <w:t xml:space="preserve">  |  </w:t>
             </w:r>
-            <w:hyperlink r:id="rId60">
+            <w:hyperlink r:id="rId59">
               <w:r>
                 <w:rPr>
                   <w:color w:val="17588B"/>
@@ -4496,7 +4311,7 @@
                 <w:sz w:val="18"/>
               </w:rPr>
               <w:br/>
-              <w:t xml:space="preserve">0.30 mm flat sheet; two 0.50 mm calibrated stop shims</w:t>
+              <w:t>0.30 mm flat sheet; two 0.50 mm calibrated stop shims</w:t>
             </w:r>
           </w:p>
         </w:tc>
@@ -4510,7 +4325,7 @@
               <w:spacing w:after="0" w:line="240" w:lineRule="auto"/>
               <w:jc w:val="center"/>
             </w:pPr>
-            <w:hyperlink r:id="rId61">
+            <w:hyperlink r:id="rId60">
               <w:r>
                 <w:rPr>
                   <w:color w:val="17588B"/>
@@ -4523,7 +4338,7 @@
             <w:r>
               <w:t xml:space="preserve">  |  </w:t>
             </w:r>
-            <w:hyperlink r:id="rId62">
+            <w:hyperlink r:id="rId61">
               <w:r>
                 <w:rPr>
                   <w:color w:val="17588B"/>
@@ -4547,84 +4362,6 @@
             </w:pPr>
             <w:r>
               <w:t>1</w:t>
-            </w:r>
-          </w:p>
-        </w:tc>
-      </w:tr>
-      <w:tr>
-        <w:trPr>
-          <w:cantSplit/>
-          <w:jc w:val="center"/>
-        </w:trPr>
-        <w:tc>
-          <w:tcPr>
-            <w:tcW w:w="5953" w:type="dxa"/>
-            <w:vAlign w:val="center"/>
-          </w:tcPr>
-          <w:p>
-            <w:pPr>
-              <w:spacing w:after="0" w:line="240" w:lineRule="auto"/>
-            </w:pPr>
-            <w:r>
-              <w:t>Prism_440_Flat_StopShim_0p5mm</w:t>
-            </w:r>
-            <w:r>
-              <w:rPr>
-                <w:color w:val="4A4A4A"/>
-                <w:sz w:val="18"/>
-              </w:rPr>
-              <w:br/>
-              <w:t xml:space="preserve">Custom stainless steel shim; ID 3.2 × OD 7.5 × t 0.50 mm; calibrated matched pairs</w:t>
-            </w:r>
-          </w:p>
-        </w:tc>
-        <w:tc>
-          <w:tcPr>
-            <w:tcW w:w="2608" w:type="dxa"/>
-            <w:vAlign w:val="center"/>
-          </w:tcPr>
-          <w:p>
-            <w:pPr>
-              <w:spacing w:after="0" w:line="240" w:lineRule="auto"/>
-              <w:jc w:val="center"/>
-            </w:pPr>
-            <w:hyperlink r:id="rId76">
-              <w:r>
-                <w:rPr>
-                  <w:color w:val="17588B"/>
-                  <w:sz w:val="20"/>
-                  <w:u w:val="single"/>
-                </w:rPr>
-                <w:t xml:space="preserve">STEP</w:t>
-              </w:r>
-            </w:hyperlink>
-            <w:r>
-              <w:t xml:space="preserve">  |  </w:t>
-            </w:r>
-            <w:hyperlink r:id="rId77">
-              <w:r>
-                <w:rPr>
-                  <w:color w:val="17588B"/>
-                  <w:sz w:val="20"/>
-                  <w:u w:val="single"/>
-                </w:rPr>
-                <w:t xml:space="preserve">Drawing</w:t>
-              </w:r>
-            </w:hyperlink>
-          </w:p>
-        </w:tc>
-        <w:tc>
-          <w:tcPr>
-            <w:tcW w:w="1531" w:type="dxa"/>
-            <w:vAlign w:val="center"/>
-          </w:tcPr>
-          <w:p>
-            <w:pPr>
-              <w:spacing w:after="0" w:line="240" w:lineRule="auto"/>
-              <w:jc w:val="center"/>
-            </w:pPr>
-            <w:r>
-              <w:t xml:space="preserve">4</w:t>
             </w:r>
           </w:p>
         </w:tc>
@@ -4755,7 +4492,7 @@
                 <w:sz w:val="18"/>
               </w:rPr>
               <w:br/>
-              <w:t xml:space="preserve">18-8 stainless; finish to MRA12 32.5 mm × 2 and HRS1015 38.5 mm × 2; retain ≥ 6 mm usable thread</w:t>
+              <w:t>18-8 stainless; finish to MRA12 32.5 mm × 2 and HRS1015 38.5 mm × 2; retain ≥ 6 mm usable thread</w:t>
             </w:r>
           </w:p>
         </w:tc>
@@ -4769,14 +4506,14 @@
               <w:spacing w:after="0" w:line="240" w:lineRule="auto"/>
               <w:jc w:val="center"/>
             </w:pPr>
-            <w:hyperlink r:id="rId78">
+            <w:hyperlink r:id="rId62">
               <w:r>
                 <w:rPr>
                   <w:color w:val="17588B"/>
                   <w:sz w:val="20"/>
                   <w:u w:val="single"/>
                 </w:rPr>
-                <w:t xml:space="preserve">McMaster</w:t>
+                <w:t>McMaster</w:t>
               </w:r>
             </w:hyperlink>
           </w:p>
@@ -4792,9 +4529,11 @@
               <w:jc w:val="center"/>
             </w:pPr>
             <w:r>
-              <w:t xml:space="preserve">4 pcs</w:t>
+              <w:t>4 pcs</w:t>
+            </w:r>
+            <w:r>
               <w:br/>
-              <w:t xml:space="preserve">1 × 50 pack</w:t>
+              <w:t>1 × 50 pack</w:t>
             </w:r>
           </w:p>
         </w:tc>
@@ -4813,10 +4552,6 @@
             <w:pPr>
               <w:spacing w:after="0" w:line="240" w:lineRule="auto"/>
             </w:pPr>
-            <w:proofErr w:type="gramStart"/>
-            <w:proofErr w:type="gramEnd"/>
-            <w:proofErr w:type="spellStart"/>
-            <w:proofErr w:type="spellEnd"/>
             <w:r>
               <w:t>SH4S025  |  4-40 × ¼ in</w:t>
             </w:r>
@@ -4826,7 +4561,7 @@
                 <w:sz w:val="18"/>
               </w:rPr>
               <w:br/>
-              <w:t xml:space="preserve">Thin retainer screws; direct tapped holes, no Helicoil</w:t>
+              <w:t>Thin retainer screws; direct tapped holes, no Helicoil</w:t>
             </w:r>
           </w:p>
         </w:tc>
@@ -4885,7 +4620,7 @@
                 <w:sz w:val="18"/>
               </w:rPr>
               <w:br/>
-              <w:t xml:space="preserve">For 4-40; OD 7.1374 / ID 3.6068 / t 0.5334 / H 0.8382 mm</w:t>
+              <w:t>For 4-40; OD 7.1374 / ID 3.6068 / t 0.5334 / H 0.8382 mm</w:t>
             </w:r>
           </w:p>
         </w:tc>
@@ -4899,14 +4634,30 @@
               <w:spacing w:after="0" w:line="240" w:lineRule="auto"/>
               <w:jc w:val="center"/>
             </w:pPr>
-            <w:hyperlink r:id="rId79">
+            <w:hyperlink r:id="rId63">
               <w:r>
                 <w:rPr>
                   <w:color w:val="17588B"/>
                   <w:sz w:val="20"/>
                   <w:u w:val="single"/>
                 </w:rPr>
-                <w:t xml:space="preserve">McMaster</w:t>
+                <w:t>Mc</w:t>
+              </w:r>
+              <w:r>
+                <w:rPr>
+                  <w:color w:val="17588B"/>
+                  <w:sz w:val="20"/>
+                  <w:u w:val="single"/>
+                </w:rPr>
+                <w:t>M</w:t>
+              </w:r>
+              <w:r>
+                <w:rPr>
+                  <w:color w:val="17588B"/>
+                  <w:sz w:val="20"/>
+                  <w:u w:val="single"/>
+                </w:rPr>
+                <w:t>aster</w:t>
               </w:r>
             </w:hyperlink>
           </w:p>
@@ -4922,7 +4673,7 @@
               <w:jc w:val="center"/>
             </w:pPr>
             <w:r>
-              <w:t xml:space="preserve">4</w:t>
+              <w:t>4</w:t>
             </w:r>
           </w:p>
         </w:tc>
@@ -4950,7 +4701,7 @@
                 <w:sz w:val="18"/>
               </w:rPr>
               <w:br/>
-              <w:t xml:space="preserve">316 stainless; OD 9 / ID 4.3 / t 1.0 / H 1.30 mm</w:t>
+              <w:t>316 stainless; OD 9 / ID 4.3 / t 1.0 / H 1.30 mm</w:t>
             </w:r>
           </w:p>
         </w:tc>
@@ -4964,14 +4715,30 @@
               <w:spacing w:after="0" w:line="240" w:lineRule="auto"/>
               <w:jc w:val="center"/>
             </w:pPr>
-            <w:hyperlink r:id="rId80">
+            <w:hyperlink r:id="rId64">
               <w:r>
                 <w:rPr>
                   <w:color w:val="17588B"/>
                   <w:sz w:val="20"/>
                   <w:u w:val="single"/>
                 </w:rPr>
-                <w:t xml:space="preserve">McMaster</w:t>
+                <w:t>McM</w:t>
+              </w:r>
+              <w:r>
+                <w:rPr>
+                  <w:color w:val="17588B"/>
+                  <w:sz w:val="20"/>
+                  <w:u w:val="single"/>
+                </w:rPr>
+                <w:t>a</w:t>
+              </w:r>
+              <w:r>
+                <w:rPr>
+                  <w:color w:val="17588B"/>
+                  <w:sz w:val="20"/>
+                  <w:u w:val="single"/>
+                </w:rPr>
+                <w:t>ster</w:t>
               </w:r>
             </w:hyperlink>
           </w:p>
@@ -4987,9 +4754,11 @@
               <w:jc w:val="center"/>
             </w:pPr>
             <w:r>
-              <w:t xml:space="preserve">4 pcs</w:t>
+              <w:t>4 pcs</w:t>
+            </w:r>
+            <w:r>
               <w:br/>
-              <w:t xml:space="preserve">1 × 10 pack</w:t>
+              <w:t>1 × 10 pack</w:t>
             </w:r>
           </w:p>
         </w:tc>
@@ -5022,23 +4791,7 @@
           <w:rFonts w:hint="eastAsia"/>
           <w:lang w:eastAsia="zh-CN"/>
         </w:rPr>
-        <w:t xml:space="preserve">t find </w:t>
-      </w:r>
-      <w:proofErr w:type="gramStart"/>
-      <w:r>
-        <w:rPr>
-          <w:rFonts w:hint="eastAsia"/>
-          <w:lang w:eastAsia="zh-CN"/>
-        </w:rPr>
-        <w:t>it(</w:t>
-      </w:r>
-      <w:proofErr w:type="gramEnd"/>
-      <w:r>
-        <w:rPr>
-          <w:rFonts w:hint="eastAsia"/>
-          <w:lang w:eastAsia="zh-CN"/>
-        </w:rPr>
-        <w:t>But maybe we also have).</w:t>
+        <w:t>t find it(But maybe we also have).</w:t>
       </w:r>
       <w:bookmarkEnd w:id="0"/>
       <w:r>
@@ -5162,7 +4915,7 @@
                 <w:sz w:val="18"/>
               </w:rPr>
               <w:br/>
-              <w:t xml:space="preserve">18-8 stainless; 8 leg-top screws; 7.05 mm nominal board engagement</w:t>
+              <w:t>18-8 stainless; 8 leg-top screws; 7.05 mm nominal board engagement</w:t>
             </w:r>
           </w:p>
         </w:tc>
@@ -5176,16 +4929,6 @@
               <w:spacing w:after="0" w:line="240" w:lineRule="auto"/>
               <w:jc w:val="center"/>
             </w:pPr>
-            <w:hyperlink r:id="rId81">
-              <w:r>
-                <w:rPr>
-                  <w:rStyle w:val="Hyperlink"/>
-                  <w:color w:val="0563C1"/>
-                  <w:u w:val="single"/>
-                </w:rPr>
-                <w:t xml:space="preserve">McMaster</w:t>
-              </w:r>
-            </w:hyperlink>
           </w:p>
         </w:tc>
         <w:tc>
@@ -5199,9 +4942,11 @@
               <w:jc w:val="center"/>
             </w:pPr>
             <w:r>
-              <w:t xml:space="preserve">8 pcs</w:t>
+              <w:t>8 pcs</w:t>
+            </w:r>
+            <w:r>
               <w:br/>
-              <w:t xml:space="preserve">1 × 50 pack</w:t>
+              <w:t>1 × 50 pack</w:t>
             </w:r>
           </w:p>
         </w:tc>
@@ -5229,7 +4974,7 @@
                 <w:sz w:val="18"/>
               </w:rPr>
               <w:br/>
-              <w:t xml:space="preserve">18-8 stainless; 8 Newport fork-to-board screws</w:t>
+              <w:t>18-8 stainless; 8 Newport fork-to-board screws</w:t>
             </w:r>
           </w:p>
         </w:tc>
@@ -5246,16 +4991,6 @@
                 <w:lang w:eastAsia="zh-CN"/>
               </w:rPr>
             </w:pPr>
-            <w:hyperlink r:id="rId82">
-              <w:r>
-                <w:rPr>
-                  <w:rStyle w:val="Hyperlink"/>
-                  <w:color w:val="0563C1"/>
-                  <w:u w:val="single"/>
-                </w:rPr>
-                <w:t xml:space="preserve">McMaster</w:t>
-              </w:r>
-            </w:hyperlink>
           </w:p>
         </w:tc>
         <w:tc>
@@ -5269,9 +5004,11 @@
               <w:jc w:val="center"/>
             </w:pPr>
             <w:r>
-              <w:t xml:space="preserve">8 pcs</w:t>
+              <w:t>8 pcs</w:t>
+            </w:r>
+            <w:r>
               <w:br/>
-              <w:t xml:space="preserve">1 × 50 pack</w:t>
+              <w:t>1 × 50 pack</w:t>
             </w:r>
           </w:p>
         </w:tc>
@@ -5299,7 +5036,7 @@
                 <w:sz w:val="18"/>
               </w:rPr>
               <w:br/>
-              <w:t xml:space="preserve">18-8 stainless; 4 legs to the existing platform</w:t>
+              <w:t>18-8 stainless; 4 legs to the existing platform</w:t>
             </w:r>
           </w:p>
         </w:tc>
@@ -5313,7 +5050,374 @@
               <w:spacing w:after="0" w:line="240" w:lineRule="auto"/>
               <w:jc w:val="center"/>
             </w:pPr>
-            <w:hyperlink r:id="rId83">
+            <w:hyperlink r:id="rId65">
+              <w:r>
+                <w:rPr>
+                  <w:color w:val="17588B"/>
+                  <w:sz w:val="20"/>
+                  <w:u w:val="single"/>
+                </w:rPr>
+                <w:t>McMaster</w:t>
+              </w:r>
+            </w:hyperlink>
+          </w:p>
+        </w:tc>
+        <w:tc>
+          <w:tcPr>
+            <w:tcW w:w="1531" w:type="dxa"/>
+            <w:vAlign w:val="center"/>
+          </w:tcPr>
+          <w:p>
+            <w:pPr>
+              <w:spacing w:after="0" w:line="240" w:lineRule="auto"/>
+              <w:jc w:val="center"/>
+            </w:pPr>
+            <w:r>
+              <w:t>4 pcs</w:t>
+            </w:r>
+            <w:r>
+              <w:br/>
+              <w:t>1 × 10 pack</w:t>
+            </w:r>
+          </w:p>
+        </w:tc>
+      </w:tr>
+      <w:tr>
+        <w:trPr>
+          <w:cantSplit/>
+          <w:jc w:val="center"/>
+        </w:trPr>
+        <w:tc>
+          <w:tcPr>
+            <w:tcW w:w="5953" w:type="dxa"/>
+            <w:vAlign w:val="center"/>
+          </w:tcPr>
+          <w:p>
+            <w:pPr>
+              <w:spacing w:after="0" w:line="240" w:lineRule="auto"/>
+            </w:pPr>
+            <w:r>
+              <w:t>93475A290  |  M12 flat washer</w:t>
+            </w:r>
+            <w:r>
+              <w:rPr>
+                <w:color w:val="4A4A4A"/>
+                <w:sz w:val="18"/>
+              </w:rPr>
+              <w:br/>
+              <w:t>18-8 stainless; ID 13 × OD 24 mm; t 2.0–2.9 mm</w:t>
+            </w:r>
+          </w:p>
+        </w:tc>
+        <w:tc>
+          <w:tcPr>
+            <w:tcW w:w="2608" w:type="dxa"/>
+            <w:vAlign w:val="center"/>
+          </w:tcPr>
+          <w:p>
+            <w:pPr>
+              <w:spacing w:after="0" w:line="240" w:lineRule="auto"/>
+              <w:jc w:val="center"/>
+              <w:rPr>
+                <w:lang w:eastAsia="zh-CN"/>
+              </w:rPr>
+            </w:pPr>
+            <w:hyperlink r:id="rId66">
+              <w:r>
+                <w:rPr>
+                  <w:color w:val="17588B"/>
+                  <w:sz w:val="20"/>
+                  <w:u w:val="single"/>
+                </w:rPr>
+                <w:t>McMaster</w:t>
+              </w:r>
+            </w:hyperlink>
+          </w:p>
+        </w:tc>
+        <w:tc>
+          <w:tcPr>
+            <w:tcW w:w="1531" w:type="dxa"/>
+            <w:vAlign w:val="center"/>
+          </w:tcPr>
+          <w:p>
+            <w:pPr>
+              <w:spacing w:after="0" w:line="240" w:lineRule="auto"/>
+              <w:jc w:val="center"/>
+            </w:pPr>
+            <w:r>
+              <w:t>4 pcs</w:t>
+            </w:r>
+            <w:r>
+              <w:br/>
+              <w:t>1 × 25 pack</w:t>
+            </w:r>
+          </w:p>
+        </w:tc>
+      </w:tr>
+      <w:tr>
+        <w:trPr>
+          <w:cantSplit/>
+          <w:jc w:val="center"/>
+        </w:trPr>
+        <w:tc>
+          <w:tcPr>
+            <w:tcW w:w="5953" w:type="dxa"/>
+            <w:vAlign w:val="center"/>
+          </w:tcPr>
+          <w:p>
+            <w:pPr>
+              <w:spacing w:after="0" w:line="240" w:lineRule="auto"/>
+            </w:pPr>
+            <w:r>
+              <w:t>SH8S100  |  8-32 × 1 in</w:t>
+            </w:r>
+            <w:r>
+              <w:rPr>
+                <w:color w:val="4A4A4A"/>
+                <w:sz w:val="18"/>
+              </w:rPr>
+              <w:br/>
+              <w:t>2 clamp-ear bolts</w:t>
+            </w:r>
+          </w:p>
+        </w:tc>
+        <w:tc>
+          <w:tcPr>
+            <w:tcW w:w="2608" w:type="dxa"/>
+            <w:vAlign w:val="center"/>
+          </w:tcPr>
+          <w:p>
+            <w:pPr>
+              <w:spacing w:after="0" w:line="240" w:lineRule="auto"/>
+              <w:jc w:val="center"/>
+            </w:pPr>
+          </w:p>
+        </w:tc>
+        <w:tc>
+          <w:tcPr>
+            <w:tcW w:w="1531" w:type="dxa"/>
+            <w:vAlign w:val="center"/>
+          </w:tcPr>
+          <w:p>
+            <w:pPr>
+              <w:spacing w:after="0" w:line="240" w:lineRule="auto"/>
+              <w:jc w:val="center"/>
+            </w:pPr>
+            <w:r>
+              <w:t>2 pcs</w:t>
+            </w:r>
+            <w:r>
+              <w:br/>
+              <w:t>1 × 50 pack</w:t>
+            </w:r>
+          </w:p>
+        </w:tc>
+      </w:tr>
+      <w:tr>
+        <w:trPr>
+          <w:cantSplit/>
+          <w:jc w:val="center"/>
+        </w:trPr>
+        <w:tc>
+          <w:tcPr>
+            <w:tcW w:w="5953" w:type="dxa"/>
+            <w:vAlign w:val="center"/>
+          </w:tcPr>
+          <w:p>
+            <w:pPr>
+              <w:spacing w:after="0" w:line="240" w:lineRule="auto"/>
+            </w:pPr>
+            <w:r>
+              <w:t>N8S0340  |  8-32 hex nut</w:t>
+            </w:r>
+            <w:r>
+              <w:rPr>
+                <w:color w:val="4A4A4A"/>
+                <w:sz w:val="18"/>
+              </w:rPr>
+              <w:br/>
+              <w:t>2 clamp-ear nuts</w:t>
+            </w:r>
+          </w:p>
+        </w:tc>
+        <w:tc>
+          <w:tcPr>
+            <w:tcW w:w="2608" w:type="dxa"/>
+            <w:vAlign w:val="center"/>
+          </w:tcPr>
+          <w:p>
+            <w:pPr>
+              <w:spacing w:after="0" w:line="240" w:lineRule="auto"/>
+              <w:jc w:val="center"/>
+            </w:pPr>
+          </w:p>
+        </w:tc>
+        <w:tc>
+          <w:tcPr>
+            <w:tcW w:w="1531" w:type="dxa"/>
+            <w:vAlign w:val="center"/>
+          </w:tcPr>
+          <w:p>
+            <w:pPr>
+              <w:spacing w:after="0" w:line="240" w:lineRule="auto"/>
+              <w:jc w:val="center"/>
+            </w:pPr>
+            <w:r>
+              <w:t>2 pcs</w:t>
+            </w:r>
+            <w:r>
+              <w:br/>
+              <w:t>1 × 50 pack</w:t>
+            </w:r>
+          </w:p>
+        </w:tc>
+      </w:tr>
+      <w:tr>
+        <w:trPr>
+          <w:cantSplit/>
+          <w:jc w:val="center"/>
+        </w:trPr>
+        <w:tc>
+          <w:tcPr>
+            <w:tcW w:w="5953" w:type="dxa"/>
+            <w:vAlign w:val="center"/>
+          </w:tcPr>
+          <w:p>
+            <w:pPr>
+              <w:spacing w:after="0" w:line="240" w:lineRule="auto"/>
+            </w:pPr>
+            <w:r>
+              <w:t>Lawson 1297309  |  8-32 × ¼ in</w:t>
+            </w:r>
+            <w:r>
+              <w:rPr>
+                <w:color w:val="4A4A4A"/>
+                <w:sz w:val="18"/>
+              </w:rPr>
+              <w:br/>
+              <w:t>Flat-point stainless set screw; 4 radial cage-rod locks</w:t>
+            </w:r>
+          </w:p>
+        </w:tc>
+        <w:tc>
+          <w:tcPr>
+            <w:tcW w:w="2608" w:type="dxa"/>
+            <w:vAlign w:val="center"/>
+          </w:tcPr>
+          <w:p>
+            <w:pPr>
+              <w:spacing w:after="0" w:line="240" w:lineRule="auto"/>
+              <w:jc w:val="center"/>
+            </w:pPr>
+          </w:p>
+        </w:tc>
+        <w:tc>
+          <w:tcPr>
+            <w:tcW w:w="1531" w:type="dxa"/>
+            <w:vAlign w:val="center"/>
+          </w:tcPr>
+          <w:p>
+            <w:pPr>
+              <w:spacing w:after="0" w:line="240" w:lineRule="auto"/>
+              <w:jc w:val="center"/>
+            </w:pPr>
+            <w:r>
+              <w:t>4</w:t>
+            </w:r>
+          </w:p>
+        </w:tc>
+      </w:tr>
+      <w:tr>
+        <w:trPr>
+          <w:cantSplit/>
+          <w:jc w:val="center"/>
+        </w:trPr>
+        <w:tc>
+          <w:tcPr>
+            <w:tcW w:w="5953" w:type="dxa"/>
+            <w:vAlign w:val="center"/>
+          </w:tcPr>
+          <w:p>
+            <w:pPr>
+              <w:spacing w:after="0" w:line="240" w:lineRule="auto"/>
+            </w:pPr>
+            <w:r>
+              <w:t>SSC-4-40-5/8-A2  |  4-40 × ⅝ in</w:t>
+            </w:r>
+            <w:r>
+              <w:rPr>
+                <w:color w:val="4A4A4A"/>
+                <w:sz w:val="18"/>
+              </w:rPr>
+              <w:br/>
+              <w:t>4 screws attaching the top cage mirror cube</w:t>
+            </w:r>
+          </w:p>
+        </w:tc>
+        <w:tc>
+          <w:tcPr>
+            <w:tcW w:w="2608" w:type="dxa"/>
+            <w:vAlign w:val="center"/>
+          </w:tcPr>
+          <w:p>
+            <w:pPr>
+              <w:spacing w:after="0" w:line="240" w:lineRule="auto"/>
+              <w:jc w:val="center"/>
+            </w:pPr>
+          </w:p>
+        </w:tc>
+        <w:tc>
+          <w:tcPr>
+            <w:tcW w:w="1531" w:type="dxa"/>
+            <w:vAlign w:val="center"/>
+          </w:tcPr>
+          <w:p>
+            <w:pPr>
+              <w:spacing w:after="0" w:line="240" w:lineRule="auto"/>
+              <w:jc w:val="center"/>
+            </w:pPr>
+            <w:r>
+              <w:t>4</w:t>
+            </w:r>
+          </w:p>
+        </w:tc>
+      </w:tr>
+      <w:tr>
+        <w:trPr>
+          <w:cantSplit/>
+          <w:jc w:val="center"/>
+        </w:trPr>
+        <w:tc>
+          <w:tcPr>
+            <w:tcW w:w="5953" w:type="dxa"/>
+            <w:vAlign w:val="center"/>
+          </w:tcPr>
+          <w:p>
+            <w:pPr>
+              <w:spacing w:after="0" w:line="240" w:lineRule="auto"/>
+            </w:pPr>
+            <w:r>
+              <w:rPr>
+                <w:color w:val="4A4A4A"/>
+                <w:sz w:val="18"/>
+              </w:rPr>
+              <w:t xml:space="preserve">94355A192  |  8-32 × ⅜ in flat-tip setscrew</w:t>
+              <w:br/>
+              <w:t xml:space="preserve">18-8 stainless; 4 telescope supports + B2 mirror support</w:t>
+            </w:r>
+          </w:p>
+        </w:tc>
+        <w:tc>
+          <w:tcPr>
+            <w:tcW w:w="2608" w:type="dxa"/>
+            <w:vAlign w:val="center"/>
+          </w:tcPr>
+          <w:p>
+            <w:pPr>
+              <w:spacing w:after="0"/>
+              <w:jc w:val="center"/>
+            </w:pPr>
+            <w:hyperlink r:id="rId76">
               <w:r>
                 <w:rPr>
                   <w:color w:val="17588B"/>
@@ -5336,9 +5440,9 @@
               <w:jc w:val="center"/>
             </w:pPr>
             <w:r>
-              <w:t xml:space="preserve">4 pcs</w:t>
+              <w:t xml:space="preserve">5 pcs</w:t>
               <w:br/>
-              <w:t xml:space="preserve">1 × 10 pack</w:t>
+              <w:t xml:space="preserve">1 × 25 pack</w:t>
             </w:r>
           </w:p>
         </w:tc>
@@ -5358,15 +5462,13 @@
               <w:spacing w:after="0" w:line="240" w:lineRule="auto"/>
             </w:pPr>
             <w:r>
-              <w:t>93475A290  |  M12 flat washer</w:t>
-            </w:r>
-            <w:r>
               <w:rPr>
                 <w:color w:val="4A4A4A"/>
                 <w:sz w:val="18"/>
               </w:rPr>
+              <w:t xml:space="preserve">94355A198  |  8-32 × ⅝ in flat-tip setscrew</w:t>
               <w:br/>
-              <w:t xml:space="preserve">18-8 stainless; ID 13 × OD 24 mm; t 2.0–2.9 mm</w:t>
+              <w:t xml:space="preserve">18-8 stainless; A1 and B1 through 5 mm spacers, A2 through 4 mm spacer</w:t>
             </w:r>
           </w:p>
         </w:tc>
@@ -5377,13 +5479,10 @@
           </w:tcPr>
           <w:p>
             <w:pPr>
-              <w:spacing w:after="0" w:line="240" w:lineRule="auto"/>
+              <w:spacing w:after="0"/>
               <w:jc w:val="center"/>
-              <w:rPr>
-                <w:lang w:eastAsia="zh-CN"/>
-              </w:rPr>
-            </w:pPr>
-            <w:hyperlink r:id="rId84">
+            </w:pPr>
+            <w:hyperlink r:id="rId77">
               <w:r>
                 <w:rPr>
                   <w:color w:val="17588B"/>
@@ -5406,379 +5505,9 @@
               <w:jc w:val="center"/>
             </w:pPr>
             <w:r>
-              <w:t xml:space="preserve">4 pcs</w:t>
+              <w:t xml:space="preserve">3 pcs</w:t>
               <w:br/>
               <w:t xml:space="preserve">1 × 25 pack</w:t>
-            </w:r>
-          </w:p>
-        </w:tc>
-      </w:tr>
-      <w:tr>
-        <w:trPr>
-          <w:cantSplit/>
-          <w:jc w:val="center"/>
-        </w:trPr>
-        <w:tc>
-          <w:tcPr>
-            <w:tcW w:w="5953" w:type="dxa"/>
-            <w:vAlign w:val="center"/>
-          </w:tcPr>
-          <w:p>
-            <w:pPr>
-              <w:spacing w:after="0" w:line="240" w:lineRule="auto"/>
-            </w:pPr>
-            <w:proofErr w:type="gramStart"/>
-            <w:proofErr w:type="gramEnd"/>
-            <w:r>
-              <w:t>SH8S100  |  8-32 × 1 in</w:t>
-            </w:r>
-            <w:r>
-              <w:rPr>
-                <w:color w:val="4A4A4A"/>
-                <w:sz w:val="18"/>
-              </w:rPr>
-              <w:br/>
-              <w:t xml:space="preserve">2 clamp-ear bolts</w:t>
-            </w:r>
-          </w:p>
-        </w:tc>
-        <w:tc>
-          <w:tcPr>
-            <w:tcW w:w="2608" w:type="dxa"/>
-            <w:vAlign w:val="center"/>
-          </w:tcPr>
-          <w:p>
-            <w:pPr>
-              <w:spacing w:after="0" w:line="240" w:lineRule="auto"/>
-              <w:jc w:val="center"/>
-            </w:pPr>
-          </w:p>
-        </w:tc>
-        <w:tc>
-          <w:tcPr>
-            <w:tcW w:w="1531" w:type="dxa"/>
-            <w:vAlign w:val="center"/>
-          </w:tcPr>
-          <w:p>
-            <w:pPr>
-              <w:spacing w:after="0" w:line="240" w:lineRule="auto"/>
-              <w:jc w:val="center"/>
-            </w:pPr>
-            <w:r>
-              <w:t>2 pcs</w:t>
-            </w:r>
-            <w:r>
-              <w:br/>
-              <w:t>1 × 50 pack</w:t>
-            </w:r>
-          </w:p>
-        </w:tc>
-      </w:tr>
-      <w:tr>
-        <w:trPr>
-          <w:cantSplit/>
-          <w:jc w:val="center"/>
-        </w:trPr>
-        <w:tc>
-          <w:tcPr>
-            <w:tcW w:w="5953" w:type="dxa"/>
-            <w:vAlign w:val="center"/>
-          </w:tcPr>
-          <w:p>
-            <w:pPr>
-              <w:spacing w:after="0" w:line="240" w:lineRule="auto"/>
-            </w:pPr>
-            <w:proofErr w:type="gramStart"/>
-            <w:proofErr w:type="gramEnd"/>
-            <w:r>
-              <w:t>N8S0340  |  8-32 hex nut</w:t>
-            </w:r>
-            <w:r>
-              <w:rPr>
-                <w:color w:val="4A4A4A"/>
-                <w:sz w:val="18"/>
-              </w:rPr>
-              <w:br/>
-              <w:t xml:space="preserve">2 clamp-ear nuts</w:t>
-            </w:r>
-          </w:p>
-        </w:tc>
-        <w:tc>
-          <w:tcPr>
-            <w:tcW w:w="2608" w:type="dxa"/>
-            <w:vAlign w:val="center"/>
-          </w:tcPr>
-          <w:p>
-            <w:pPr>
-              <w:spacing w:after="0" w:line="240" w:lineRule="auto"/>
-              <w:jc w:val="center"/>
-            </w:pPr>
-          </w:p>
-        </w:tc>
-        <w:tc>
-          <w:tcPr>
-            <w:tcW w:w="1531" w:type="dxa"/>
-            <w:vAlign w:val="center"/>
-          </w:tcPr>
-          <w:p>
-            <w:pPr>
-              <w:spacing w:after="0" w:line="240" w:lineRule="auto"/>
-              <w:jc w:val="center"/>
-            </w:pPr>
-            <w:r>
-              <w:t>2 pcs</w:t>
-            </w:r>
-            <w:r>
-              <w:br/>
-              <w:t>1 × 50 pack</w:t>
-            </w:r>
-          </w:p>
-        </w:tc>
-      </w:tr>
-      <w:tr>
-        <w:trPr>
-          <w:cantSplit/>
-          <w:jc w:val="center"/>
-        </w:trPr>
-        <w:tc>
-          <w:tcPr>
-            <w:tcW w:w="5953" w:type="dxa"/>
-            <w:vAlign w:val="center"/>
-          </w:tcPr>
-          <w:p>
-            <w:pPr>
-              <w:spacing w:after="0" w:line="240" w:lineRule="auto"/>
-            </w:pPr>
-            <w:proofErr w:type="gramStart"/>
-            <w:proofErr w:type="gramEnd"/>
-            <w:r>
-              <w:t>Lawson 1297309  |  8-32 × ¼ in</w:t>
-            </w:r>
-            <w:r>
-              <w:rPr>
-                <w:color w:val="4A4A4A"/>
-                <w:sz w:val="18"/>
-              </w:rPr>
-              <w:br/>
-              <w:t xml:space="preserve">Flat-point stainless set screw; 4 radial cage-rod locks</w:t>
-            </w:r>
-          </w:p>
-        </w:tc>
-        <w:tc>
-          <w:tcPr>
-            <w:tcW w:w="2608" w:type="dxa"/>
-            <w:vAlign w:val="center"/>
-          </w:tcPr>
-          <w:p>
-            <w:pPr>
-              <w:spacing w:after="0" w:line="240" w:lineRule="auto"/>
-              <w:jc w:val="center"/>
-            </w:pPr>
-          </w:p>
-        </w:tc>
-        <w:tc>
-          <w:tcPr>
-            <w:tcW w:w="1531" w:type="dxa"/>
-            <w:vAlign w:val="center"/>
-          </w:tcPr>
-          <w:p>
-            <w:pPr>
-              <w:spacing w:after="0" w:line="240" w:lineRule="auto"/>
-              <w:jc w:val="center"/>
-            </w:pPr>
-            <w:r>
-              <w:t>4</w:t>
-            </w:r>
-          </w:p>
-        </w:tc>
-      </w:tr>
-      <w:tr>
-        <w:trPr>
-          <w:cantSplit/>
-          <w:jc w:val="center"/>
-        </w:trPr>
-        <w:tc>
-          <w:tcPr>
-            <w:tcW w:w="5953" w:type="dxa"/>
-            <w:vAlign w:val="center"/>
-          </w:tcPr>
-          <w:p>
-            <w:pPr>
-              <w:spacing w:after="0" w:line="240" w:lineRule="auto"/>
-            </w:pPr>
-            <w:proofErr w:type="gramStart"/>
-            <w:proofErr w:type="gramEnd"/>
-            <w:r>
-              <w:t>SSC-4-40-5/8-A2  |  4-40 × ⅝ in</w:t>
-            </w:r>
-            <w:r>
-              <w:rPr>
-                <w:color w:val="4A4A4A"/>
-                <w:sz w:val="18"/>
-              </w:rPr>
-              <w:br/>
-              <w:t xml:space="preserve">4 screws attaching the top cage mirror cube</w:t>
-            </w:r>
-          </w:p>
-        </w:tc>
-        <w:tc>
-          <w:tcPr>
-            <w:tcW w:w="2608" w:type="dxa"/>
-            <w:vAlign w:val="center"/>
-          </w:tcPr>
-          <w:p>
-            <w:pPr>
-              <w:spacing w:after="0" w:line="240" w:lineRule="auto"/>
-              <w:jc w:val="center"/>
-            </w:pPr>
-          </w:p>
-        </w:tc>
-        <w:tc>
-          <w:tcPr>
-            <w:tcW w:w="1531" w:type="dxa"/>
-            <w:vAlign w:val="center"/>
-          </w:tcPr>
-          <w:p>
-            <w:pPr>
-              <w:spacing w:after="0" w:line="240" w:lineRule="auto"/>
-              <w:jc w:val="center"/>
-            </w:pPr>
-            <w:r>
-              <w:t>4</w:t>
-            </w:r>
-          </w:p>
-        </w:tc>
-      </w:tr>
-      <w:tr>
-        <w:trPr>
-          <w:cantSplit/>
-          <w:jc w:val="center"/>
-        </w:trPr>
-        <w:tc>
-          <w:tcPr>
-            <w:tcW w:w="5953" w:type="dxa"/>
-            <w:vAlign w:val="center"/>
-          </w:tcPr>
-          <w:p>
-            <w:pPr>
-              <w:spacing w:after="0" w:line="240" w:lineRule="auto"/>
-            </w:pPr>
-            <w:r>
-              <w:t>92605A117  |  M4 × 12 mm flat-tip setscrew</w:t>
-            </w:r>
-            <w:r>
-              <w:rPr>
-                <w:color w:val="4A4A4A"/>
-                <w:sz w:val="18"/>
-              </w:rPr>
-              <w:br/>
-              <w:t xml:space="preserve">18-8 stainless; 4 telescope supports + B2 mirror support</w:t>
-            </w:r>
-          </w:p>
-        </w:tc>
-        <w:tc>
-          <w:tcPr>
-            <w:tcW w:w="2608" w:type="dxa"/>
-            <w:vAlign w:val="center"/>
-          </w:tcPr>
-          <w:p>
-            <w:pPr>
-              <w:spacing w:after="0"/>
-              <w:jc w:val="center"/>
-            </w:pPr>
-            <w:hyperlink r:id="rId85">
-              <w:r>
-                <w:rPr>
-                  <w:color w:val="17588B"/>
-                  <w:sz w:val="20"/>
-                  <w:u w:val="single"/>
-                </w:rPr>
-                <w:t xml:space="preserve">McMaster</w:t>
-              </w:r>
-            </w:hyperlink>
-          </w:p>
-        </w:tc>
-        <w:tc>
-          <w:tcPr>
-            <w:tcW w:w="1531" w:type="dxa"/>
-            <w:vAlign w:val="center"/>
-          </w:tcPr>
-          <w:p>
-            <w:pPr>
-              <w:spacing w:after="0" w:line="240" w:lineRule="auto"/>
-              <w:jc w:val="center"/>
-            </w:pPr>
-            <w:r>
-              <w:t xml:space="preserve">5 pcs</w:t>
-              <w:br/>
-              <w:t xml:space="preserve">1 × 50 pack</w:t>
-            </w:r>
-          </w:p>
-        </w:tc>
-      </w:tr>
-      <w:tr>
-        <w:trPr>
-          <w:cantSplit/>
-          <w:jc w:val="center"/>
-        </w:trPr>
-        <w:tc>
-          <w:tcPr>
-            <w:tcW w:w="5953" w:type="dxa"/>
-            <w:vAlign w:val="center"/>
-          </w:tcPr>
-          <w:p>
-            <w:pPr>
-              <w:spacing w:after="0" w:line="240" w:lineRule="auto"/>
-            </w:pPr>
-            <w:r>
-              <w:t>92605A121  |  M4 × 16 mm flat-tip setscrew</w:t>
-            </w:r>
-            <w:r>
-              <w:rPr>
-                <w:color w:val="4A4A4A"/>
-                <w:sz w:val="18"/>
-              </w:rPr>
-              <w:br/>
-              <w:t xml:space="preserve">18-8 stainless; A1 and B1 through 5 mm spacers, A2 through 4 mm spacer</w:t>
-            </w:r>
-          </w:p>
-        </w:tc>
-        <w:tc>
-          <w:tcPr>
-            <w:tcW w:w="2608" w:type="dxa"/>
-            <w:vAlign w:val="center"/>
-          </w:tcPr>
-          <w:p>
-            <w:pPr>
-              <w:spacing w:after="0"/>
-              <w:jc w:val="center"/>
-            </w:pPr>
-            <w:hyperlink r:id="rId86">
-              <w:r>
-                <w:rPr>
-                  <w:color w:val="17588B"/>
-                  <w:sz w:val="20"/>
-                  <w:u w:val="single"/>
-                </w:rPr>
-                <w:t xml:space="preserve">McMaster</w:t>
-              </w:r>
-            </w:hyperlink>
-          </w:p>
-        </w:tc>
-        <w:tc>
-          <w:tcPr>
-            <w:tcW w:w="1531" w:type="dxa"/>
-            <w:vAlign w:val="center"/>
-          </w:tcPr>
-          <w:p>
-            <w:pPr>
-              <w:spacing w:after="0" w:line="240" w:lineRule="auto"/>
-              <w:jc w:val="center"/>
-            </w:pPr>
-            <w:r>
-              <w:t xml:space="preserve">3 pcs</w:t>
-              <w:br/>
-              <w:t xml:space="preserve">1 × 50 pack</w:t>
             </w:r>
           </w:p>
         </w:tc>
@@ -5793,21 +5522,7 @@
           <w:rFonts w:hint="eastAsia"/>
           <w:lang w:eastAsia="zh-CN"/>
         </w:rPr>
-        <w:t xml:space="preserve">These things will </w:t>
-      </w:r>
-      <w:r>
-        <w:rPr>
-          <w:rFonts w:hint="eastAsia"/>
-          <w:lang w:eastAsia="zh-CN"/>
-        </w:rPr>
-        <w:t xml:space="preserve">not </w:t>
-      </w:r>
-      <w:r>
-        <w:rPr>
-          <w:rFonts w:hint="eastAsia"/>
-          <w:lang w:eastAsia="zh-CN"/>
-        </w:rPr>
-        <w:t xml:space="preserve">go into vacuum. No link means we have this in our lab. If there is a link, that means I </w:t>
+        <w:t xml:space="preserve">These things will not go into vacuum. No link means we have this in our lab. If there is a link, that means I </w:t>
       </w:r>
       <w:r>
         <w:rPr>
@@ -5820,23 +5535,7 @@
           <w:rFonts w:hint="eastAsia"/>
           <w:lang w:eastAsia="zh-CN"/>
         </w:rPr>
-        <w:t xml:space="preserve">t find </w:t>
-      </w:r>
-      <w:proofErr w:type="gramStart"/>
-      <w:r>
-        <w:rPr>
-          <w:rFonts w:hint="eastAsia"/>
-          <w:lang w:eastAsia="zh-CN"/>
-        </w:rPr>
-        <w:t>it(</w:t>
-      </w:r>
-      <w:proofErr w:type="gramEnd"/>
-      <w:r>
-        <w:rPr>
-          <w:rFonts w:hint="eastAsia"/>
-          <w:lang w:eastAsia="zh-CN"/>
-        </w:rPr>
-        <w:t>But maybe we also have).</w:t>
+        <w:t>t find it(But maybe we also have).</w:t>
       </w:r>
     </w:p>
     <w:p/>
@@ -5888,23 +5587,7 @@
         <w:color w:val="666666"/>
         <w:sz w:val="16"/>
       </w:rPr>
-      <w:t xml:space="preserve">Shopping </w:t>
-    </w:r>
-    <w:proofErr w:type="gramStart"/>
-    <w:r>
-      <w:rPr>
-        <w:color w:val="666666"/>
-        <w:sz w:val="16"/>
-      </w:rPr>
-      <w:t>list  |</w:t>
-    </w:r>
-    <w:proofErr w:type="gramEnd"/>
-    <w:r>
-      <w:rPr>
-        <w:color w:val="666666"/>
-        <w:sz w:val="16"/>
-      </w:rPr>
-      <w:t xml:space="preserve">  </w:t>
+      <w:t xml:space="preserve">Shopping list  |  </w:t>
     </w:r>
     <w:r>
       <w:fldChar w:fldCharType="begin"/>

</xml_diff>

<commit_message>
Enlarge lattice mirror pockets and use 0.062 inch inner radii
</commit_message>
<xml_diff>
--- a/production/shopping_list.docx
+++ b/production/shopping_list.docx
@@ -3603,7 +3603,7 @@
         <w:rPr>
           <w:sz w:val="18"/>
         </w:rPr>
-        <w:t xml:space="preserve">Assembly note: Each mirror-mount variant requires two 0.50 mm flat stop shims (four total). The shim purchase row remains omitted pending confirmation of supply; this omission does not confirm laboratory stock.</w:t>
+        <w:t xml:space="preserve">Retainers are manufactured as flat 0.30 mm sheets and elastically deflect during tightening to clamp the mirrors. The four 0.50 mm stop shims remain local CAD references only; they are excluded from CNC manufacture and installation.</w:t>
       </w:r>
     </w:p>
     <w:p>
@@ -4077,7 +4077,7 @@
                 <w:sz w:val="18"/>
               </w:rPr>
               <w:br/>
-              <w:t>3.00 mm solid web below mirror seat; mirror 0.50 mm above body rim</w:t>
+              <w:t>3.00 mm base web; mirror 0.50 mm above rim; pocket 26.8 x 14.2 mm; inner R0.062 in (1.5748 mm); total clearance 1.7 mm per axis</w:t>
             </w:r>
           </w:p>
         </w:tc>
@@ -4155,7 +4155,7 @@
                 <w:sz w:val="18"/>
               </w:rPr>
               <w:br/>
-              <w:t>3.00 mm solid web below mirror seat; mirror 0.50 mm above body rim</w:t>
+              <w:t>3.00 mm base web; mirror 0.50 mm above rim; pocket 27.1 x 27.1 mm; inner R0.062 in (1.5748 mm); total clearance 1.7 mm per axis</w:t>
             </w:r>
           </w:p>
         </w:tc>
@@ -4233,7 +4233,7 @@
                 <w:sz w:val="18"/>
               </w:rPr>
               <w:br/>
-              <w:t>0.30 mm flat sheet; two 0.50 mm calibrated stop shims</w:t>
+              <w:t>0.30 mm flat sheet; no pre-bending</w:t>
             </w:r>
           </w:p>
         </w:tc>
@@ -4311,7 +4311,7 @@
                 <w:sz w:val="18"/>
               </w:rPr>
               <w:br/>
-              <w:t>0.30 mm flat sheet; two 0.50 mm calibrated stop shims</w:t>
+              <w:t>0.30 mm flat sheet; no pre-bending</w:t>
             </w:r>
           </w:p>
         </w:tc>

</xml_diff>

<commit_message>
Use imperial CP33 CRM1T and CCM1-E03 in procurement
</commit_message>
<xml_diff>
--- a/production/shopping_list.docx
+++ b/production/shopping_list.docx
@@ -146,7 +146,23 @@
               <w:spacing w:after="0" w:line="240" w:lineRule="auto"/>
             </w:pPr>
             <w:r>
-              <w:t>Lattice board V9  |  dual TA 75–75  |  24 × 15 in</w:t>
+              <w:t>Lattice board V</w:t>
+            </w:r>
+            <w:proofErr w:type="gramStart"/>
+            <w:r>
+              <w:t>9  |</w:t>
+            </w:r>
+            <w:proofErr w:type="gramEnd"/>
+            <w:r>
+              <w:t xml:space="preserve">  dual TA 75–</w:t>
+            </w:r>
+            <w:proofErr w:type="gramStart"/>
+            <w:r>
+              <w:t>75  |</w:t>
+            </w:r>
+            <w:proofErr w:type="gramEnd"/>
+            <w:r>
+              <w:t xml:space="preserve">  24 × 15 in</w:t>
             </w:r>
           </w:p>
         </w:tc>
@@ -970,7 +986,15 @@
               <w:spacing w:after="0" w:line="240" w:lineRule="auto"/>
             </w:pPr>
             <w:r>
-              <w:t>TA board V9.15  |  11.625 × 10.625 in</w:t>
+              <w:t xml:space="preserve">TA board </w:t>
+            </w:r>
+            <w:proofErr w:type="gramStart"/>
+            <w:r>
+              <w:t>V9.15  |</w:t>
+            </w:r>
+            <w:proofErr w:type="gramEnd"/>
+            <w:r>
+              <w:t xml:space="preserve">  11.625 × 10.625 in</w:t>
             </w:r>
           </w:p>
         </w:tc>
@@ -1601,7 +1625,15 @@
               <w:spacing w:after="0" w:line="240" w:lineRule="auto"/>
             </w:pPr>
             <w:r>
-              <w:t>Splitting board V2  |  24 × 14 in</w:t>
+              <w:t>Splitting board V</w:t>
+            </w:r>
+            <w:proofErr w:type="gramStart"/>
+            <w:r>
+              <w:t>2  |</w:t>
+            </w:r>
+            <w:proofErr w:type="gramEnd"/>
+            <w:r>
+              <w:t xml:space="preserve">  24 × 14 in</w:t>
             </w:r>
           </w:p>
         </w:tc>
@@ -2065,7 +2097,7 @@
         <w:rPr>
           <w:sz w:val="18"/>
         </w:rPr>
-        <w:t xml:space="preserve">795 nm design with modular fibre collimators and telescopes with two CP32 lens plates each. Eight pedestal connections use 8-32 studs. Two steering mirrors per beam remain; top-flange hardware follows our existing design. Quantities are installed requirements before laboratory stock deductions.</w:t>
+        <w:t>795 nm design with modular fibre collimators and telescopes with two CP32 lens plates each. Eight pedestal connections use 8-32 studs. Two steering mirrors per beam remain; top-flange hardware follows our existing design. Quantities are installed requirements before laboratory stock deductions.</w:t>
       </w:r>
     </w:p>
     <w:p>
@@ -2073,7 +2105,7 @@
         <w:rPr>
           <w:sz w:val="18"/>
         </w:rPr>
-        <w:t xml:space="preserve">Assembly note: No adhesive is specified for the PBS125-to-CRM05 bond. Confirm a suitable adhesive and laboratory supply before assembly.</w:t>
+        <w:t>Assembly note: No adhesive is specified for the PBS125-to-CRM05 bond. Confirm a suitable adhesive and laboratory supply before assembly.</w:t>
       </w:r>
     </w:p>
     <w:tbl>
@@ -2180,7 +2212,15 @@
               <w:spacing w:after="0" w:line="240" w:lineRule="auto"/>
             </w:pPr>
             <w:r>
-              <w:t xml:space="preserve">A390TM-B  |  mounted collimation </w:t>
+              <w:t>A390TM-</w:t>
+            </w:r>
+            <w:proofErr w:type="gramStart"/>
+            <w:r>
+              <w:t>B  |</w:t>
+            </w:r>
+            <w:proofErr w:type="gramEnd"/>
+            <w:r>
+              <w:t xml:space="preserve">  mounted collimation </w:t>
             </w:r>
             <w:proofErr w:type="spellStart"/>
             <w:r>
@@ -2250,7 +2290,15 @@
               <w:spacing w:after="0" w:line="240" w:lineRule="auto"/>
             </w:pPr>
             <w:r>
-              <w:t>S05TM09  |  M9 × 0.5 to SM05 lens adapter</w:t>
+              <w:t>S05TM</w:t>
+            </w:r>
+            <w:proofErr w:type="gramStart"/>
+            <w:r>
+              <w:t>09  |</w:t>
+            </w:r>
+            <w:proofErr w:type="gramEnd"/>
+            <w:r>
+              <w:t xml:space="preserve">  M9 × 0.5 to SM05 lens adapter</w:t>
             </w:r>
           </w:p>
         </w:tc>
@@ -2307,7 +2355,15 @@
               <w:spacing w:after="0" w:line="240" w:lineRule="auto"/>
             </w:pPr>
             <w:r>
-              <w:t>SM05L05  |  ½ in collimator lens tube</w:t>
+              <w:t>SM05L</w:t>
+            </w:r>
+            <w:proofErr w:type="gramStart"/>
+            <w:r>
+              <w:t>05  |</w:t>
+            </w:r>
+            <w:proofErr w:type="gramEnd"/>
+            <w:r>
+              <w:t xml:space="preserve">  ½ in collimator lens tube</w:t>
             </w:r>
           </w:p>
         </w:tc>
@@ -2364,7 +2420,15 @@
               <w:spacing w:after="0" w:line="240" w:lineRule="auto"/>
             </w:pPr>
             <w:r>
-              <w:t xml:space="preserve">SM05FCA2  |  FC/APC </w:t>
+              <w:t>SM05FCA</w:t>
+            </w:r>
+            <w:proofErr w:type="gramStart"/>
+            <w:r>
+              <w:t>2  |</w:t>
+            </w:r>
+            <w:proofErr w:type="gramEnd"/>
+            <w:r>
+              <w:t xml:space="preserve">  FC/APC </w:t>
             </w:r>
             <w:proofErr w:type="spellStart"/>
             <w:r>
@@ -2437,7 +2501,15 @@
               <w:spacing w:after="0" w:line="240" w:lineRule="auto"/>
             </w:pPr>
             <w:r>
-              <w:t>AHWP05M-980  |  half-wave plate</w:t>
+              <w:t>AHWP05M-</w:t>
+            </w:r>
+            <w:proofErr w:type="gramStart"/>
+            <w:r>
+              <w:t>980  |</w:t>
+            </w:r>
+            <w:proofErr w:type="gramEnd"/>
+            <w:r>
+              <w:t xml:space="preserve">  half-wave plate</w:t>
             </w:r>
           </w:p>
         </w:tc>
@@ -2494,7 +2566,15 @@
               <w:spacing w:after="0" w:line="240" w:lineRule="auto"/>
             </w:pPr>
             <w:r>
-              <w:t>LC1054-B  |  telescope lens, f = −25 mm</w:t>
+              <w:t>LC1054-</w:t>
+            </w:r>
+            <w:proofErr w:type="gramStart"/>
+            <w:r>
+              <w:t>B  |</w:t>
+            </w:r>
+            <w:proofErr w:type="gramEnd"/>
+            <w:r>
+              <w:t xml:space="preserve">  telescope lens, f = −25 mm</w:t>
             </w:r>
           </w:p>
         </w:tc>
@@ -2551,7 +2631,15 @@
               <w:spacing w:after="0" w:line="240" w:lineRule="auto"/>
             </w:pPr>
             <w:r>
-              <w:t>LA1213-B  |  unmounted telescope lens</w:t>
+              <w:t>LA1213-</w:t>
+            </w:r>
+            <w:proofErr w:type="gramStart"/>
+            <w:r>
+              <w:t>B  |</w:t>
+            </w:r>
+            <w:proofErr w:type="gramEnd"/>
+            <w:r>
+              <w:t xml:space="preserve">  unmounted telescope lens</w:t>
             </w:r>
             <w:r>
               <w:rPr>
@@ -2616,9 +2704,19 @@
               <w:spacing w:after="0" w:line="240" w:lineRule="auto"/>
             </w:pPr>
             <w:r>
-              <w:t xml:space="preserve">KM05  |  ½ in two-axis mirror mount</w:t>
+              <w:t>KM</w:t>
+            </w:r>
+            <w:proofErr w:type="gramStart"/>
+            <w:r>
+              <w:t>05  |</w:t>
+            </w:r>
+            <w:proofErr w:type="gramEnd"/>
+            <w:r>
+              <w:t xml:space="preserve">  ½ in two-axis mirror mount</w:t>
+            </w:r>
+            <w:r>
               <w:br/>
-              <w:t xml:space="preserve">8-32 post mounting threads</w:t>
+              <w:t>8-32 post mounting threads</w:t>
             </w:r>
           </w:p>
         </w:tc>
@@ -2632,14 +2730,14 @@
               <w:spacing w:after="0"/>
               <w:jc w:val="center"/>
             </w:pPr>
-            <w:hyperlink r:id="rId73">
+            <w:hyperlink r:id="rId28">
               <w:r>
                 <w:rPr>
                   <w:color w:val="17588B"/>
                   <w:sz w:val="20"/>
                   <w:u w:val="single"/>
                 </w:rPr>
-                <w:t xml:space="preserve">Thorlabs</w:t>
+                <w:t>Thorlabs</w:t>
               </w:r>
             </w:hyperlink>
           </w:p>
@@ -2655,7 +2753,7 @@
               <w:jc w:val="center"/>
             </w:pPr>
             <w:r>
-              <w:t xml:space="preserve">4</w:t>
+              <w:t>4</w:t>
             </w:r>
           </w:p>
         </w:tc>
@@ -2675,10 +2773,18 @@
               <w:spacing w:after="0" w:line="240" w:lineRule="auto"/>
             </w:pPr>
             <w:r>
-              <w:t>CRM1T/M</w:t>
-            </w:r>
-            <w:r>
-              <w:t xml:space="preserve">  |  cage rotation mount</w:t>
+              <w:t>CRM1</w:t>
+            </w:r>
+            <w:proofErr w:type="gramStart"/>
+            <w:r>
+              <w:t>T</w:t>
+            </w:r>
+            <w:r>
+              <w:t xml:space="preserve">  |</w:t>
+            </w:r>
+            <w:proofErr w:type="gramEnd"/>
+            <w:r>
+              <w:t xml:space="preserve">  cage rotation mount</w:t>
             </w:r>
           </w:p>
         </w:tc>
@@ -2735,7 +2841,15 @@
               <w:spacing w:after="0" w:line="240" w:lineRule="auto"/>
             </w:pPr>
             <w:r>
-              <w:t>CRM05  |  ½ in rotation adapter</w:t>
+              <w:t>CRM</w:t>
+            </w:r>
+            <w:proofErr w:type="gramStart"/>
+            <w:r>
+              <w:t>05  |</w:t>
+            </w:r>
+            <w:proofErr w:type="gramEnd"/>
+            <w:r>
+              <w:t xml:space="preserve">  ½ in rotation adapter</w:t>
             </w:r>
           </w:p>
         </w:tc>
@@ -2792,7 +2906,97 @@
               <w:spacing w:after="0" w:line="240" w:lineRule="auto"/>
             </w:pPr>
             <w:r>
-              <w:t>CP33/M  |  30 mm cage plate</w:t>
+              <w:t>CP</w:t>
+            </w:r>
+            <w:proofErr w:type="gramStart"/>
+            <w:r>
+              <w:t>33</w:t>
+            </w:r>
+            <w:r>
+              <w:t xml:space="preserve">  |</w:t>
+            </w:r>
+            <w:proofErr w:type="gramEnd"/>
+            <w:r>
+              <w:t xml:space="preserve">  30 mm cage plate</w:t>
+            </w:r>
+          </w:p>
+        </w:tc>
+        <w:tc>
+          <w:tcPr>
+            <w:tcW w:w="2608" w:type="dxa"/>
+            <w:vAlign w:val="center"/>
+          </w:tcPr>
+          <w:p>
+            <w:pPr>
+              <w:spacing w:after="0"/>
+              <w:jc w:val="center"/>
+            </w:pPr>
+            <w:r>
+              <w:fldChar w:fldCharType="begin"/>
+            </w:r>
+            <w:r>
+              <w:instrText xml:space="preserve">HYPERLINK "https://www.thorlabs.com/item/CP33" \h </w:instrText>
+            </w:r>
+            <w:r>
+              <w:fldChar w:fldCharType="separate"/>
+            </w:r>
+            <w:r>
+              <w:rPr>
+                <w:color w:val="17588B"/>
+                <w:sz w:val="20"/>
+                <w:u w:val="single"/>
+              </w:rPr>
+              <w:t>Thorlabs</w:t>
+            </w:r>
+            <w:r>
+              <w:fldChar w:fldCharType="end"/>
+            </w:r>
+          </w:p>
+        </w:tc>
+        <w:tc>
+          <w:tcPr>
+            <w:tcW w:w="1531" w:type="dxa"/>
+            <w:vAlign w:val="center"/>
+          </w:tcPr>
+          <w:p>
+            <w:pPr>
+              <w:spacing w:after="0" w:line="240" w:lineRule="auto"/>
+              <w:jc w:val="center"/>
+            </w:pPr>
+            <w:r>
+              <w:t>2</w:t>
+            </w:r>
+          </w:p>
+        </w:tc>
+      </w:tr>
+      <w:tr>
+        <w:trPr>
+          <w:cantSplit/>
+          <w:jc w:val="center"/>
+        </w:trPr>
+        <w:tc>
+          <w:tcPr>
+            <w:tcW w:w="5953" w:type="dxa"/>
+            <w:vAlign w:val="center"/>
+          </w:tcPr>
+          <w:p>
+            <w:pPr>
+              <w:spacing w:after="0" w:line="240" w:lineRule="auto"/>
+            </w:pPr>
+            <w:r>
+              <w:t>CP</w:t>
+            </w:r>
+            <w:proofErr w:type="gramStart"/>
+            <w:r>
+              <w:t>32  |</w:t>
+            </w:r>
+            <w:proofErr w:type="gramEnd"/>
+            <w:r>
+              <w:t xml:space="preserve">  ½ in lens cage plate</w:t>
+            </w:r>
+            <w:r>
+              <w:br/>
+              <w:t>8-32 post mounting thread</w:t>
             </w:r>
           </w:p>
         </w:tc>
@@ -2829,7 +3033,7 @@
               <w:jc w:val="center"/>
             </w:pPr>
             <w:r>
-              <w:t>2</w:t>
+              <w:t>6</w:t>
             </w:r>
           </w:p>
         </w:tc>
@@ -2849,9 +3053,29 @@
               <w:spacing w:after="0" w:line="240" w:lineRule="auto"/>
             </w:pPr>
             <w:r>
-              <w:t xml:space="preserve">CP32  |  ½ in lens cage plate</w:t>
+              <w:t>ER6</w:t>
+            </w:r>
+            <w:proofErr w:type="gramStart"/>
+            <w:r>
+              <w:t>E  |</w:t>
+            </w:r>
+            <w:proofErr w:type="gramEnd"/>
+            <w:r>
+              <w:t xml:space="preserve">  6 in engraved cage rod</w:t>
+            </w:r>
+            <w:r>
+              <w:rPr>
+                <w:color w:val="4A4A4A"/>
+                <w:sz w:val="18"/>
+              </w:rPr>
               <w:br/>
-              <w:t xml:space="preserve">8-32 post mounting thread</w:t>
+            </w:r>
+            <w:r>
+              <w:rPr>
+                <w:color w:val="4A4A4A"/>
+                <w:sz w:val="18"/>
+              </w:rPr>
+              <w:t>152.4 mm; 4 rods per beam</w:t>
             </w:r>
           </w:p>
         </w:tc>
@@ -2865,14 +3089,14 @@
               <w:spacing w:after="0"/>
               <w:jc w:val="center"/>
             </w:pPr>
-            <w:hyperlink r:id="rId74">
+            <w:hyperlink r:id="rId32">
               <w:r>
                 <w:rPr>
                   <w:color w:val="17588B"/>
                   <w:sz w:val="20"/>
                   <w:u w:val="single"/>
                 </w:rPr>
-                <w:t xml:space="preserve">Thorlabs</w:t>
+                <w:t>Thorlabs</w:t>
               </w:r>
             </w:hyperlink>
           </w:p>
@@ -2888,7 +3112,7 @@
               <w:jc w:val="center"/>
             </w:pPr>
             <w:r>
-              <w:t xml:space="preserve">6</w:t>
+              <w:t>8</w:t>
             </w:r>
           </w:p>
         </w:tc>
@@ -2908,21 +3132,19 @@
               <w:spacing w:after="0" w:line="240" w:lineRule="auto"/>
             </w:pPr>
             <w:r>
-              <w:t>ER6E  |  6 in engraved cage rod</w:t>
-            </w:r>
-            <w:r>
-              <w:rPr>
-                <w:color w:val="4A4A4A"/>
-                <w:sz w:val="18"/>
-              </w:rPr>
+              <w:t>ER1.</w:t>
+            </w:r>
+            <w:proofErr w:type="gramStart"/>
+            <w:r>
+              <w:t>5  |</w:t>
+            </w:r>
+            <w:proofErr w:type="gramEnd"/>
+            <w:r>
+              <w:t xml:space="preserve">  1.5 in cage rod</w:t>
+            </w:r>
+            <w:r>
               <w:br/>
-            </w:r>
-            <w:r>
-              <w:rPr>
-                <w:color w:val="4A4A4A"/>
-                <w:sz w:val="18"/>
-              </w:rPr>
-              <w:t>152.4 mm; 4 rods per beam</w:t>
+              <w:t>38.1 mm; remove both factory 4-40 end studs from each of the four rods</w:t>
             </w:r>
           </w:p>
         </w:tc>
@@ -2959,7 +3181,7 @@
               <w:jc w:val="center"/>
             </w:pPr>
             <w:r>
-              <w:t>8</w:t>
+              <w:t>4</w:t>
             </w:r>
           </w:p>
         </w:tc>
@@ -2979,9 +3201,15 @@
               <w:spacing w:after="0" w:line="240" w:lineRule="auto"/>
             </w:pPr>
             <w:r>
-              <w:t xml:space="preserve">ER1.5  |  1.5 in cage rod</w:t>
-              <w:br/>
-              <w:t xml:space="preserve">38.1 mm; remove both factory 4-40 end studs from each of the four rods</w:t>
+              <w:t>LCP</w:t>
+            </w:r>
+            <w:proofErr w:type="gramStart"/>
+            <w:r>
+              <w:t>33  |</w:t>
+            </w:r>
+            <w:proofErr w:type="gramEnd"/>
+            <w:r>
+              <w:t xml:space="preserve">  30 mm to 60 mm cage plate</w:t>
             </w:r>
           </w:p>
         </w:tc>
@@ -2995,14 +3223,14 @@
               <w:spacing w:after="0"/>
               <w:jc w:val="center"/>
             </w:pPr>
-            <w:hyperlink r:id="rId72">
+            <w:hyperlink r:id="rId34">
               <w:r>
                 <w:rPr>
                   <w:color w:val="17588B"/>
                   <w:sz w:val="20"/>
                   <w:u w:val="single"/>
                 </w:rPr>
-                <w:t xml:space="preserve">Thorlabs</w:t>
+                <w:t>Thorlabs</w:t>
               </w:r>
             </w:hyperlink>
           </w:p>
@@ -3018,7 +3246,7 @@
               <w:jc w:val="center"/>
             </w:pPr>
             <w:r>
-              <w:t xml:space="preserve">4</w:t>
+              <w:t>1</w:t>
             </w:r>
           </w:p>
         </w:tc>
@@ -3038,7 +3266,110 @@
               <w:spacing w:after="0" w:line="240" w:lineRule="auto"/>
             </w:pPr>
             <w:r>
-              <w:t>LCP33  |  30 mm to 60 mm cage plate</w:t>
+              <w:t>CCM1-E03</w:t>
+            </w:r>
+            <w:proofErr w:type="gramStart"/>
+            <w:r>
+              <w:t xml:space="preserve">  |</w:t>
+            </w:r>
+            <w:proofErr w:type="gramEnd"/>
+            <w:r>
+              <w:t xml:space="preserve">  fixed 45° cage mirror</w:t>
+            </w:r>
+          </w:p>
+        </w:tc>
+        <w:tc>
+          <w:tcPr>
+            <w:tcW w:w="2608" w:type="dxa"/>
+            <w:vAlign w:val="center"/>
+          </w:tcPr>
+          <w:p>
+            <w:pPr>
+              <w:spacing w:after="0"/>
+              <w:jc w:val="center"/>
+            </w:pPr>
+            <w:r>
+              <w:fldChar w:fldCharType="begin"/>
+            </w:r>
+            <w:r>
+              <w:instrText xml:space="preserve">HYPERLINK "https://www.thorlabs.com/item/CCM1-E03" \h </w:instrText>
+            </w:r>
+            <w:r>
+              <w:fldChar w:fldCharType="separate"/>
+            </w:r>
+            <w:r>
+              <w:rPr>
+                <w:color w:val="17588B"/>
+                <w:sz w:val="20"/>
+                <w:u w:val="single"/>
+              </w:rPr>
+              <w:t>Thorlabs</w:t>
+            </w:r>
+            <w:r>
+              <w:fldChar w:fldCharType="end"/>
+            </w:r>
+          </w:p>
+        </w:tc>
+        <w:tc>
+          <w:tcPr>
+            <w:tcW w:w="1531" w:type="dxa"/>
+            <w:vAlign w:val="center"/>
+          </w:tcPr>
+          <w:p>
+            <w:pPr>
+              <w:spacing w:after="0" w:line="240" w:lineRule="auto"/>
+              <w:jc w:val="center"/>
+            </w:pPr>
+            <w:r>
+              <w:t>1</w:t>
+            </w:r>
+          </w:p>
+        </w:tc>
+      </w:tr>
+      <w:tr>
+        <w:trPr>
+          <w:cantSplit/>
+          <w:jc w:val="center"/>
+        </w:trPr>
+        <w:tc>
+          <w:tcPr>
+            <w:tcW w:w="5953" w:type="dxa"/>
+            <w:vAlign w:val="center"/>
+          </w:tcPr>
+          <w:p>
+            <w:pPr>
+              <w:spacing w:after="0" w:line="240" w:lineRule="auto"/>
+            </w:pPr>
+            <w:r>
+              <w:rPr>
+                <w:color w:val="4A4A4A"/>
+                <w:sz w:val="18"/>
+              </w:rPr>
+              <w:t>RS2P8</w:t>
+            </w:r>
+            <w:proofErr w:type="gramStart"/>
+            <w:r>
+              <w:rPr>
+                <w:color w:val="4A4A4A"/>
+                <w:sz w:val="18"/>
+              </w:rPr>
+              <w:t>E  |</w:t>
+            </w:r>
+            <w:proofErr w:type="gramEnd"/>
+            <w:r>
+              <w:rPr>
+                <w:color w:val="4A4A4A"/>
+                <w:sz w:val="18"/>
+              </w:rPr>
+              <w:t xml:space="preserve">  Ø1 in fixed pedestal post</w:t>
+            </w:r>
+            <w:r>
+              <w:rPr>
+                <w:color w:val="4A4A4A"/>
+                <w:sz w:val="18"/>
+              </w:rPr>
+              <w:br/>
+              <w:t>2 in nominal height; 8-32 tapped ends; 4 telescope + 4 mirror supports</w:t>
             </w:r>
           </w:p>
         </w:tc>
@@ -3075,7 +3406,7 @@
               <w:jc w:val="center"/>
             </w:pPr>
             <w:r>
-              <w:t>1</w:t>
+              <w:t>8</w:t>
             </w:r>
           </w:p>
         </w:tc>
@@ -3095,7 +3426,23 @@
               <w:spacing w:after="0" w:line="240" w:lineRule="auto"/>
             </w:pPr>
             <w:r>
-              <w:t>CCM1-E03/M  |  fixed 45° cage mirror</w:t>
+              <w:t>RS5</w:t>
+            </w:r>
+            <w:proofErr w:type="gramStart"/>
+            <w:r>
+              <w:t>M  |</w:t>
+            </w:r>
+            <w:proofErr w:type="gramEnd"/>
+            <w:r>
+              <w:t xml:space="preserve">  Ø25 mm post spacer</w:t>
+            </w:r>
+            <w:r>
+              <w:rPr>
+                <w:color w:val="4A4A4A"/>
+                <w:sz w:val="18"/>
+              </w:rPr>
+              <w:br/>
+              <w:t>5 mm thick; A1 and B1 steering supports</w:t>
             </w:r>
           </w:p>
         </w:tc>
@@ -3110,6 +3457,95 @@
               <w:jc w:val="center"/>
             </w:pPr>
             <w:hyperlink r:id="rId36">
+              <w:r>
+                <w:rPr>
+                  <w:color w:val="17588B"/>
+                  <w:sz w:val="20"/>
+                  <w:u w:val="single"/>
+                </w:rPr>
+                <w:t>T</w:t>
+              </w:r>
+              <w:r>
+                <w:rPr>
+                  <w:color w:val="17588B"/>
+                  <w:sz w:val="20"/>
+                  <w:u w:val="single"/>
+                </w:rPr>
+                <w:t>h</w:t>
+              </w:r>
+              <w:r>
+                <w:rPr>
+                  <w:color w:val="17588B"/>
+                  <w:sz w:val="20"/>
+                  <w:u w:val="single"/>
+                </w:rPr>
+                <w:t>orlabs</w:t>
+              </w:r>
+            </w:hyperlink>
+          </w:p>
+        </w:tc>
+        <w:tc>
+          <w:tcPr>
+            <w:tcW w:w="1531" w:type="dxa"/>
+            <w:vAlign w:val="center"/>
+          </w:tcPr>
+          <w:p>
+            <w:pPr>
+              <w:spacing w:after="0" w:line="240" w:lineRule="auto"/>
+              <w:jc w:val="center"/>
+            </w:pPr>
+            <w:r>
+              <w:t>2</w:t>
+            </w:r>
+          </w:p>
+        </w:tc>
+      </w:tr>
+      <w:tr>
+        <w:trPr>
+          <w:cantSplit/>
+          <w:jc w:val="center"/>
+        </w:trPr>
+        <w:tc>
+          <w:tcPr>
+            <w:tcW w:w="5953" w:type="dxa"/>
+            <w:vAlign w:val="center"/>
+          </w:tcPr>
+          <w:p>
+            <w:pPr>
+              <w:spacing w:after="0" w:line="240" w:lineRule="auto"/>
+            </w:pPr>
+            <w:r>
+              <w:t>RS4</w:t>
+            </w:r>
+            <w:proofErr w:type="gramStart"/>
+            <w:r>
+              <w:t>M  |</w:t>
+            </w:r>
+            <w:proofErr w:type="gramEnd"/>
+            <w:r>
+              <w:t xml:space="preserve">  Ø25 mm post spacer</w:t>
+            </w:r>
+            <w:r>
+              <w:rPr>
+                <w:color w:val="4A4A4A"/>
+                <w:sz w:val="18"/>
+              </w:rPr>
+              <w:br/>
+              <w:t>4 mm thick; A2 steering support (lowers A2 1 mm to clear beam B)</w:t>
+            </w:r>
+          </w:p>
+        </w:tc>
+        <w:tc>
+          <w:tcPr>
+            <w:tcW w:w="2608" w:type="dxa"/>
+            <w:vAlign w:val="center"/>
+          </w:tcPr>
+          <w:p>
+            <w:pPr>
+              <w:spacing w:after="0"/>
+              <w:jc w:val="center"/>
+            </w:pPr>
+            <w:hyperlink r:id="rId37">
               <w:r>
                 <w:rPr>
                   <w:color w:val="17588B"/>
@@ -3152,70 +3588,15 @@
               <w:spacing w:after="0" w:line="240" w:lineRule="auto"/>
             </w:pPr>
             <w:r>
-              <w:rPr>
-                <w:color w:val="4A4A4A"/>
-                <w:sz w:val="18"/>
-              </w:rPr>
-              <w:t xml:space="preserve">RS2P8E  |  Ø1 in fixed pedestal post</w:t>
-              <w:br/>
-              <w:t xml:space="preserve">2 in nominal height; 8-32 tapped ends; 4 telescope + 4 mirror supports</w:t>
-            </w:r>
-          </w:p>
-        </w:tc>
-        <w:tc>
-          <w:tcPr>
-            <w:tcW w:w="2608" w:type="dxa"/>
-            <w:vAlign w:val="center"/>
-          </w:tcPr>
-          <w:p>
-            <w:pPr>
-              <w:spacing w:after="0"/>
-              <w:jc w:val="center"/>
-            </w:pPr>
-            <w:hyperlink r:id="rId75">
-              <w:r>
-                <w:rPr>
-                  <w:color w:val="17588B"/>
-                  <w:sz w:val="20"/>
-                  <w:u w:val="single"/>
-                </w:rPr>
-                <w:t xml:space="preserve">Thorlabs</w:t>
-              </w:r>
-            </w:hyperlink>
-          </w:p>
-        </w:tc>
-        <w:tc>
-          <w:tcPr>
-            <w:tcW w:w="1531" w:type="dxa"/>
-            <w:vAlign w:val="center"/>
-          </w:tcPr>
-          <w:p>
-            <w:pPr>
-              <w:spacing w:after="0" w:line="240" w:lineRule="auto"/>
-              <w:jc w:val="center"/>
-            </w:pPr>
-            <w:r>
-              <w:t xml:space="preserve">8</w:t>
-            </w:r>
-          </w:p>
-        </w:tc>
-      </w:tr>
-      <w:tr>
-        <w:trPr>
-          <w:cantSplit/>
-          <w:jc w:val="center"/>
-        </w:trPr>
-        <w:tc>
-          <w:tcPr>
-            <w:tcW w:w="5953" w:type="dxa"/>
-            <w:vAlign w:val="center"/>
-          </w:tcPr>
-          <w:p>
-            <w:pPr>
-              <w:spacing w:after="0" w:line="240" w:lineRule="auto"/>
-            </w:pPr>
-            <w:r>
-              <w:t>RS5M  |  Ø25 mm post spacer</w:t>
+              <w:t>PS-F-1.</w:t>
+            </w:r>
+            <w:proofErr w:type="gramStart"/>
+            <w:r>
+              <w:t>0  |</w:t>
+            </w:r>
+            <w:proofErr w:type="gramEnd"/>
+            <w:r>
+              <w:t xml:space="preserve">  pedestal clamping fork</w:t>
             </w:r>
             <w:r>
               <w:rPr>
@@ -3223,7 +3604,7 @@
                 <w:sz w:val="18"/>
               </w:rPr>
               <w:br/>
-              <w:t>5 mm thick; A1 and B1 steering supports</w:t>
+              <w:t>Stainless steel; 1 in slot; for 1/4-20 fixing screws</w:t>
             </w:r>
           </w:p>
         </w:tc>
@@ -3244,7 +3625,7 @@
                   <w:sz w:val="20"/>
                   <w:u w:val="single"/>
                 </w:rPr>
-                <w:t>Thorlabs</w:t>
+                <w:t>Newport</w:t>
               </w:r>
             </w:hyperlink>
           </w:p>
@@ -3260,7 +3641,7 @@
               <w:jc w:val="center"/>
             </w:pPr>
             <w:r>
-              <w:t>2</w:t>
+              <w:t>8</w:t>
             </w:r>
           </w:p>
         </w:tc>
@@ -3280,7 +3661,15 @@
               <w:spacing w:after="0" w:line="240" w:lineRule="auto"/>
             </w:pPr>
             <w:r>
-              <w:t>RS4M  |  Ø25 mm post spacer</w:t>
+              <w:t>MB</w:t>
+            </w:r>
+            <w:proofErr w:type="gramStart"/>
+            <w:r>
+              <w:t>1224  |</w:t>
+            </w:r>
+            <w:proofErr w:type="gramEnd"/>
+            <w:r>
+              <w:t xml:space="preserve">  24 × 12 × ½ in breadboard</w:t>
             </w:r>
             <w:r>
               <w:rPr>
@@ -3288,7 +3677,7 @@
                 <w:sz w:val="18"/>
               </w:rPr>
               <w:br/>
-              <w:t>4 mm thick; A2 steering support (lowers A2 1 mm to clear beam B)</w:t>
+              <w:t>609.6 × 304.8 × 12.7 mm; 1/4-20 grid</w:t>
             </w:r>
           </w:p>
         </w:tc>
@@ -3345,15 +3734,15 @@
               <w:spacing w:after="0" w:line="240" w:lineRule="auto"/>
             </w:pPr>
             <w:r>
-              <w:t>PS-F-1.0  |  pedestal clamping fork</w:t>
-            </w:r>
-            <w:r>
-              <w:rPr>
-                <w:color w:val="4A4A4A"/>
-                <w:sz w:val="18"/>
-              </w:rPr>
-              <w:br/>
-              <w:t>Stainless steel; 1 in slot; for 1/4-20 fixing screws</w:t>
+              <w:t>MRA12-E</w:t>
+            </w:r>
+            <w:proofErr w:type="gramStart"/>
+            <w:r>
+              <w:t>03  |</w:t>
+            </w:r>
+            <w:proofErr w:type="gramEnd"/>
+            <w:r>
+              <w:t xml:space="preserve">  internal right-angle prism mirror</w:t>
             </w:r>
           </w:p>
         </w:tc>
@@ -3374,7 +3763,7 @@
                   <w:sz w:val="20"/>
                   <w:u w:val="single"/>
                 </w:rPr>
-                <w:t>Newport</w:t>
+                <w:t>Thorlabs</w:t>
               </w:r>
             </w:hyperlink>
           </w:p>
@@ -3390,7 +3779,7 @@
               <w:jc w:val="center"/>
             </w:pPr>
             <w:r>
-              <w:t>8</w:t>
+              <w:t>2</w:t>
             </w:r>
           </w:p>
         </w:tc>
@@ -3410,15 +3799,21 @@
               <w:spacing w:after="0" w:line="240" w:lineRule="auto"/>
             </w:pPr>
             <w:r>
-              <w:t>MB1224  |  24 × 12 × ½ in breadboard</w:t>
-            </w:r>
-            <w:r>
-              <w:rPr>
-                <w:color w:val="4A4A4A"/>
-                <w:sz w:val="18"/>
-              </w:rPr>
-              <w:br/>
-              <w:t>609.6 × 304.8 × 12.7 mm; 1/4-20 grid</w:t>
+              <w:t>HRS</w:t>
+            </w:r>
+            <w:r>
+              <w:t>1</w:t>
+            </w:r>
+            <w:r>
+              <w:t>015-</w:t>
+            </w:r>
+            <w:proofErr w:type="gramStart"/>
+            <w:r>
+              <w:t>AG  |</w:t>
+            </w:r>
+            <w:proofErr w:type="gramEnd"/>
+            <w:r>
+              <w:t xml:space="preserve">  internal hollow roof mirror</w:t>
             </w:r>
           </w:p>
         </w:tc>
@@ -3460,126 +3855,6 @@
           </w:p>
         </w:tc>
       </w:tr>
-      <w:tr>
-        <w:trPr>
-          <w:cantSplit/>
-          <w:jc w:val="center"/>
-        </w:trPr>
-        <w:tc>
-          <w:tcPr>
-            <w:tcW w:w="5953" w:type="dxa"/>
-            <w:vAlign w:val="center"/>
-          </w:tcPr>
-          <w:p>
-            <w:pPr>
-              <w:spacing w:after="0" w:line="240" w:lineRule="auto"/>
-            </w:pPr>
-            <w:r>
-              <w:t>MRA12-E03  |  internal right-angle prism mirror</w:t>
-            </w:r>
-          </w:p>
-        </w:tc>
-        <w:tc>
-          <w:tcPr>
-            <w:tcW w:w="2608" w:type="dxa"/>
-            <w:vAlign w:val="center"/>
-          </w:tcPr>
-          <w:p>
-            <w:pPr>
-              <w:spacing w:after="0"/>
-              <w:jc w:val="center"/>
-            </w:pPr>
-            <w:hyperlink r:id="rId42">
-              <w:r>
-                <w:rPr>
-                  <w:color w:val="17588B"/>
-                  <w:sz w:val="20"/>
-                  <w:u w:val="single"/>
-                </w:rPr>
-                <w:t>Thorlabs</w:t>
-              </w:r>
-            </w:hyperlink>
-          </w:p>
-        </w:tc>
-        <w:tc>
-          <w:tcPr>
-            <w:tcW w:w="1531" w:type="dxa"/>
-            <w:vAlign w:val="center"/>
-          </w:tcPr>
-          <w:p>
-            <w:pPr>
-              <w:spacing w:after="0" w:line="240" w:lineRule="auto"/>
-              <w:jc w:val="center"/>
-            </w:pPr>
-            <w:r>
-              <w:t>2</w:t>
-            </w:r>
-          </w:p>
-        </w:tc>
-      </w:tr>
-      <w:tr>
-        <w:trPr>
-          <w:cantSplit/>
-          <w:jc w:val="center"/>
-        </w:trPr>
-        <w:tc>
-          <w:tcPr>
-            <w:tcW w:w="5953" w:type="dxa"/>
-            <w:vAlign w:val="center"/>
-          </w:tcPr>
-          <w:p>
-            <w:pPr>
-              <w:spacing w:after="0" w:line="240" w:lineRule="auto"/>
-            </w:pPr>
-            <w:r>
-              <w:t>HRS</w:t>
-            </w:r>
-            <w:r>
-              <w:t>1</w:t>
-            </w:r>
-            <w:r>
-              <w:t>015-AG  |  internal hollow roof mirror</w:t>
-            </w:r>
-          </w:p>
-        </w:tc>
-        <w:tc>
-          <w:tcPr>
-            <w:tcW w:w="2608" w:type="dxa"/>
-            <w:vAlign w:val="center"/>
-          </w:tcPr>
-          <w:p>
-            <w:pPr>
-              <w:spacing w:after="0"/>
-              <w:jc w:val="center"/>
-            </w:pPr>
-            <w:hyperlink r:id="rId43">
-              <w:r>
-                <w:rPr>
-                  <w:color w:val="17588B"/>
-                  <w:sz w:val="20"/>
-                  <w:u w:val="single"/>
-                </w:rPr>
-                <w:t>Thorlabs</w:t>
-              </w:r>
-            </w:hyperlink>
-          </w:p>
-        </w:tc>
-        <w:tc>
-          <w:tcPr>
-            <w:tcW w:w="1531" w:type="dxa"/>
-            <w:vAlign w:val="center"/>
-          </w:tcPr>
-          <w:p>
-            <w:pPr>
-              <w:spacing w:after="0" w:line="240" w:lineRule="auto"/>
-              <w:jc w:val="center"/>
-            </w:pPr>
-            <w:r>
-              <w:t>1</w:t>
-            </w:r>
-          </w:p>
-        </w:tc>
-      </w:tr>
     </w:tbl>
     <w:p>
       <w:pPr>
@@ -3587,6 +3862,7 @@
         <w:pageBreakBefore/>
       </w:pPr>
       <w:r>
+        <w:lastRenderedPageBreak/>
         <w:t>Fridge CNC parts and internal fasteners</w:t>
       </w:r>
     </w:p>
@@ -3603,7 +3879,7 @@
         <w:rPr>
           <w:sz w:val="18"/>
         </w:rPr>
-        <w:t xml:space="preserve">Retainers are manufactured as flat 0.30 mm sheets and elastically deflect during tightening to clamp the mirrors. The four 0.50 mm stop shims remain local CAD references only; they are excluded from CNC manufacture and installation.</w:t>
+        <w:t>Retainers are manufactured as flat 0.30 mm sheets and elastically deflect during tightening to clamp the mirrors. The four 0.50 mm stop shims remain local CAD references only; they are excluded from CNC manufacture and installation.</w:t>
       </w:r>
     </w:p>
     <w:p>
@@ -3732,6 +4008,76 @@
               <w:spacing w:after="0" w:line="240" w:lineRule="auto"/>
               <w:jc w:val="center"/>
             </w:pPr>
+            <w:hyperlink r:id="rId42">
+              <w:r>
+                <w:rPr>
+                  <w:color w:val="17588B"/>
+                  <w:sz w:val="20"/>
+                  <w:u w:val="single"/>
+                </w:rPr>
+                <w:t>STEP</w:t>
+              </w:r>
+            </w:hyperlink>
+            <w:r>
+              <w:t xml:space="preserve">  |  </w:t>
+            </w:r>
+            <w:hyperlink r:id="rId43">
+              <w:r>
+                <w:rPr>
+                  <w:color w:val="17588B"/>
+                  <w:sz w:val="20"/>
+                  <w:u w:val="single"/>
+                </w:rPr>
+                <w:t>Drawing</w:t>
+              </w:r>
+            </w:hyperlink>
+          </w:p>
+        </w:tc>
+        <w:tc>
+          <w:tcPr>
+            <w:tcW w:w="1531" w:type="dxa"/>
+            <w:vAlign w:val="center"/>
+          </w:tcPr>
+          <w:p>
+            <w:pPr>
+              <w:spacing w:after="0" w:line="240" w:lineRule="auto"/>
+              <w:jc w:val="center"/>
+            </w:pPr>
+            <w:r>
+              <w:t>1</w:t>
+            </w:r>
+          </w:p>
+        </w:tc>
+      </w:tr>
+      <w:tr>
+        <w:trPr>
+          <w:cantSplit/>
+          <w:jc w:val="center"/>
+        </w:trPr>
+        <w:tc>
+          <w:tcPr>
+            <w:tcW w:w="5953" w:type="dxa"/>
+            <w:vAlign w:val="center"/>
+          </w:tcPr>
+          <w:p>
+            <w:pPr>
+              <w:spacing w:after="0" w:line="240" w:lineRule="auto"/>
+            </w:pPr>
+            <w:r>
+              <w:t>Leg_2</w:t>
+            </w:r>
+          </w:p>
+        </w:tc>
+        <w:tc>
+          <w:tcPr>
+            <w:tcW w:w="2608" w:type="dxa"/>
+            <w:vAlign w:val="center"/>
+          </w:tcPr>
+          <w:p>
+            <w:pPr>
+              <w:spacing w:after="0" w:line="240" w:lineRule="auto"/>
+              <w:jc w:val="center"/>
+            </w:pPr>
             <w:hyperlink r:id="rId44">
               <w:r>
                 <w:rPr>
@@ -3788,8 +4134,7 @@
               <w:spacing w:after="0" w:line="240" w:lineRule="auto"/>
             </w:pPr>
             <w:r>
-              <w:lastRenderedPageBreak/>
-              <w:t>Leg_2</w:t>
+              <w:t>Leg_3</w:t>
             </w:r>
           </w:p>
         </w:tc>
@@ -3859,7 +4204,7 @@
               <w:spacing w:after="0" w:line="240" w:lineRule="auto"/>
             </w:pPr>
             <w:r>
-              <w:t>Leg_3</w:t>
+              <w:t>Leg_4</w:t>
             </w:r>
           </w:p>
         </w:tc>
@@ -3929,7 +4274,7 @@
               <w:spacing w:after="0" w:line="240" w:lineRule="auto"/>
             </w:pPr>
             <w:r>
-              <w:t>Leg_4</w:t>
+              <w:t>Clamp_Half_64mm_179deg</w:t>
             </w:r>
           </w:p>
         </w:tc>
@@ -3979,7 +4324,7 @@
               <w:jc w:val="center"/>
             </w:pPr>
             <w:r>
-              <w:t>1</w:t>
+              <w:t>2</w:t>
             </w:r>
           </w:p>
         </w:tc>
@@ -3999,7 +4344,15 @@
               <w:spacing w:after="0" w:line="240" w:lineRule="auto"/>
             </w:pPr>
             <w:r>
-              <w:t>Clamp_Half_64mm_179deg</w:t>
+              <w:t>MRA12_Mirror_Mount</w:t>
+            </w:r>
+            <w:r>
+              <w:rPr>
+                <w:color w:val="4A4A4A"/>
+                <w:sz w:val="18"/>
+              </w:rPr>
+              <w:br/>
+              <w:t>3.00 mm base web; mirror 0.50 mm above rim; pocket 26.8 x 14.2 mm; inner R0.062 in (1.5748 mm); total clearance 1.7 mm per axis</w:t>
             </w:r>
           </w:p>
         </w:tc>
@@ -4049,7 +4402,7 @@
               <w:jc w:val="center"/>
             </w:pPr>
             <w:r>
-              <w:t>2</w:t>
+              <w:t>1</w:t>
             </w:r>
           </w:p>
         </w:tc>
@@ -4069,7 +4422,7 @@
               <w:spacing w:after="0" w:line="240" w:lineRule="auto"/>
             </w:pPr>
             <w:r>
-              <w:t>MRA12_Mirror_Mount</w:t>
+              <w:t>HRS1015_Mirror_Mount</w:t>
             </w:r>
             <w:r>
               <w:rPr>
@@ -4077,7 +4430,7 @@
                 <w:sz w:val="18"/>
               </w:rPr>
               <w:br/>
-              <w:t>3.00 mm base web; mirror 0.50 mm above rim; pocket 26.8 x 14.2 mm; inner R0.062 in (1.5748 mm); total clearance 1.7 mm per axis</w:t>
+              <w:t>3.00 mm base web; mirror 0.50 mm above rim; pocket 27.1 x 27.1 mm; inner R0.062 in (1.5748 mm); total clearance 1.7 mm per axis</w:t>
             </w:r>
           </w:p>
         </w:tc>
@@ -4147,7 +4500,7 @@
               <w:spacing w:after="0" w:line="240" w:lineRule="auto"/>
             </w:pPr>
             <w:r>
-              <w:t>HRS1015_Mirror_Mount</w:t>
+              <w:t>MRA12_Thin_Edge_Retainer</w:t>
             </w:r>
             <w:r>
               <w:rPr>
@@ -4155,7 +4508,7 @@
                 <w:sz w:val="18"/>
               </w:rPr>
               <w:br/>
-              <w:t>3.00 mm base web; mirror 0.50 mm above rim; pocket 27.1 x 27.1 mm; inner R0.062 in (1.5748 mm); total clearance 1.7 mm per axis</w:t>
+              <w:t>0.30 mm flat sheet; no pre-bending</w:t>
             </w:r>
           </w:p>
         </w:tc>
@@ -4225,7 +4578,7 @@
               <w:spacing w:after="0" w:line="240" w:lineRule="auto"/>
             </w:pPr>
             <w:r>
-              <w:t>MRA12_Thin_Edge_Retainer</w:t>
+              <w:t>HRS1015_Thin_Edge_Retainer</w:t>
             </w:r>
             <w:r>
               <w:rPr>
@@ -4233,6 +4586,12 @@
                 <w:sz w:val="18"/>
               </w:rPr>
               <w:br/>
+            </w:r>
+            <w:r>
+              <w:rPr>
+                <w:color w:val="4A4A4A"/>
+                <w:sz w:val="18"/>
+              </w:rPr>
               <w:t>0.30 mm flat sheet; no pre-bending</w:t>
             </w:r>
           </w:p>
@@ -4261,84 +4620,6 @@
               <w:t xml:space="preserve">  |  </w:t>
             </w:r>
             <w:hyperlink r:id="rId59">
-              <w:r>
-                <w:rPr>
-                  <w:color w:val="17588B"/>
-                  <w:sz w:val="20"/>
-                  <w:u w:val="single"/>
-                </w:rPr>
-                <w:t>Drawing</w:t>
-              </w:r>
-            </w:hyperlink>
-          </w:p>
-        </w:tc>
-        <w:tc>
-          <w:tcPr>
-            <w:tcW w:w="1531" w:type="dxa"/>
-            <w:vAlign w:val="center"/>
-          </w:tcPr>
-          <w:p>
-            <w:pPr>
-              <w:spacing w:after="0" w:line="240" w:lineRule="auto"/>
-              <w:jc w:val="center"/>
-            </w:pPr>
-            <w:r>
-              <w:t>1</w:t>
-            </w:r>
-          </w:p>
-        </w:tc>
-      </w:tr>
-      <w:tr>
-        <w:trPr>
-          <w:cantSplit/>
-          <w:jc w:val="center"/>
-        </w:trPr>
-        <w:tc>
-          <w:tcPr>
-            <w:tcW w:w="5953" w:type="dxa"/>
-            <w:vAlign w:val="center"/>
-          </w:tcPr>
-          <w:p>
-            <w:pPr>
-              <w:spacing w:after="0" w:line="240" w:lineRule="auto"/>
-            </w:pPr>
-            <w:r>
-              <w:t>HRS1015_Thin_Edge_Retainer</w:t>
-            </w:r>
-            <w:r>
-              <w:rPr>
-                <w:color w:val="4A4A4A"/>
-                <w:sz w:val="18"/>
-              </w:rPr>
-              <w:br/>
-              <w:t>0.30 mm flat sheet; no pre-bending</w:t>
-            </w:r>
-          </w:p>
-        </w:tc>
-        <w:tc>
-          <w:tcPr>
-            <w:tcW w:w="2608" w:type="dxa"/>
-            <w:vAlign w:val="center"/>
-          </w:tcPr>
-          <w:p>
-            <w:pPr>
-              <w:spacing w:after="0" w:line="240" w:lineRule="auto"/>
-              <w:jc w:val="center"/>
-            </w:pPr>
-            <w:hyperlink r:id="rId60">
-              <w:r>
-                <w:rPr>
-                  <w:color w:val="17588B"/>
-                  <w:sz w:val="20"/>
-                  <w:u w:val="single"/>
-                </w:rPr>
-                <w:t>STEP</w:t>
-              </w:r>
-            </w:hyperlink>
-            <w:r>
-              <w:t xml:space="preserve">  |  </w:t>
-            </w:r>
-            <w:hyperlink r:id="rId61">
               <w:r>
                 <w:rPr>
                   <w:color w:val="17588B"/>
@@ -4484,7 +4765,15 @@
               <w:spacing w:after="0" w:line="240" w:lineRule="auto"/>
             </w:pPr>
             <w:r>
-              <w:t>91292A132  |  M4 × 40 mm socket head</w:t>
+              <w:t>91292A</w:t>
+            </w:r>
+            <w:proofErr w:type="gramStart"/>
+            <w:r>
+              <w:t>132  |</w:t>
+            </w:r>
+            <w:proofErr w:type="gramEnd"/>
+            <w:r>
+              <w:t xml:space="preserve">  M4 × 40 mm socket head</w:t>
             </w:r>
             <w:r>
               <w:rPr>
@@ -4506,7 +4795,7 @@
               <w:spacing w:after="0" w:line="240" w:lineRule="auto"/>
               <w:jc w:val="center"/>
             </w:pPr>
-            <w:hyperlink r:id="rId62">
+            <w:hyperlink r:id="rId60">
               <w:r>
                 <w:rPr>
                   <w:color w:val="17588B"/>
@@ -4553,7 +4842,15 @@
               <w:spacing w:after="0" w:line="240" w:lineRule="auto"/>
             </w:pPr>
             <w:r>
-              <w:t>SH4S025  |  4-40 × ¼ in</w:t>
+              <w:t>SH4S</w:t>
+            </w:r>
+            <w:proofErr w:type="gramStart"/>
+            <w:r>
+              <w:t>025  |</w:t>
+            </w:r>
+            <w:proofErr w:type="gramEnd"/>
+            <w:r>
+              <w:t xml:space="preserve">  4-40 × ¼ in</w:t>
             </w:r>
             <w:r>
               <w:rPr>
@@ -4612,7 +4909,15 @@
               <w:spacing w:after="0" w:line="240" w:lineRule="auto"/>
             </w:pPr>
             <w:r>
-              <w:t>97125K111  |  718 nickel alloy Belleville</w:t>
+              <w:t>97125K</w:t>
+            </w:r>
+            <w:proofErr w:type="gramStart"/>
+            <w:r>
+              <w:t>111  |</w:t>
+            </w:r>
+            <w:proofErr w:type="gramEnd"/>
+            <w:r>
+              <w:t xml:space="preserve">  718 nickel alloy Belleville</w:t>
             </w:r>
             <w:r>
               <w:rPr>
@@ -4634,111 +4939,87 @@
               <w:spacing w:after="0" w:line="240" w:lineRule="auto"/>
               <w:jc w:val="center"/>
             </w:pPr>
-            <w:hyperlink r:id="rId63">
+            <w:hyperlink r:id="rId61">
               <w:r>
                 <w:rPr>
                   <w:color w:val="17588B"/>
                   <w:sz w:val="20"/>
                   <w:u w:val="single"/>
                 </w:rPr>
-                <w:t>Mc</w:t>
+                <w:t>McMaster</w:t>
               </w:r>
+            </w:hyperlink>
+          </w:p>
+        </w:tc>
+        <w:tc>
+          <w:tcPr>
+            <w:tcW w:w="1531" w:type="dxa"/>
+            <w:vAlign w:val="center"/>
+          </w:tcPr>
+          <w:p>
+            <w:pPr>
+              <w:spacing w:after="0" w:line="240" w:lineRule="auto"/>
+              <w:jc w:val="center"/>
+            </w:pPr>
+            <w:r>
+              <w:t>4</w:t>
+            </w:r>
+          </w:p>
+        </w:tc>
+      </w:tr>
+      <w:tr>
+        <w:trPr>
+          <w:cantSplit/>
+          <w:jc w:val="center"/>
+        </w:trPr>
+        <w:tc>
+          <w:tcPr>
+            <w:tcW w:w="5953" w:type="dxa"/>
+            <w:vAlign w:val="center"/>
+          </w:tcPr>
+          <w:p>
+            <w:pPr>
+              <w:spacing w:after="0" w:line="240" w:lineRule="auto"/>
+            </w:pPr>
+            <w:r>
+              <w:t>93237A</w:t>
+            </w:r>
+            <w:proofErr w:type="gramStart"/>
+            <w:r>
+              <w:t>103  |</w:t>
+            </w:r>
+            <w:proofErr w:type="gramEnd"/>
+            <w:r>
+              <w:t xml:space="preserve">  M4 Belleville</w:t>
+            </w:r>
+            <w:r>
+              <w:rPr>
+                <w:color w:val="4A4A4A"/>
+                <w:sz w:val="18"/>
+              </w:rPr>
+              <w:br/>
+              <w:t>316 stainless; OD 9 / ID 4.3 / t 1.0 / H 1.30 mm</w:t>
+            </w:r>
+          </w:p>
+        </w:tc>
+        <w:tc>
+          <w:tcPr>
+            <w:tcW w:w="2608" w:type="dxa"/>
+            <w:vAlign w:val="center"/>
+          </w:tcPr>
+          <w:p>
+            <w:pPr>
+              <w:spacing w:after="0" w:line="240" w:lineRule="auto"/>
+              <w:jc w:val="center"/>
+            </w:pPr>
+            <w:hyperlink r:id="rId62">
               <w:r>
                 <w:rPr>
                   <w:color w:val="17588B"/>
                   <w:sz w:val="20"/>
                   <w:u w:val="single"/>
                 </w:rPr>
-                <w:t>M</w:t>
-              </w:r>
-              <w:r>
-                <w:rPr>
-                  <w:color w:val="17588B"/>
-                  <w:sz w:val="20"/>
-                  <w:u w:val="single"/>
-                </w:rPr>
-                <w:t>aster</w:t>
-              </w:r>
-            </w:hyperlink>
-          </w:p>
-        </w:tc>
-        <w:tc>
-          <w:tcPr>
-            <w:tcW w:w="1531" w:type="dxa"/>
-            <w:vAlign w:val="center"/>
-          </w:tcPr>
-          <w:p>
-            <w:pPr>
-              <w:spacing w:after="0" w:line="240" w:lineRule="auto"/>
-              <w:jc w:val="center"/>
-            </w:pPr>
-            <w:r>
-              <w:t>4</w:t>
-            </w:r>
-          </w:p>
-        </w:tc>
-      </w:tr>
-      <w:tr>
-        <w:trPr>
-          <w:cantSplit/>
-          <w:jc w:val="center"/>
-        </w:trPr>
-        <w:tc>
-          <w:tcPr>
-            <w:tcW w:w="5953" w:type="dxa"/>
-            <w:vAlign w:val="center"/>
-          </w:tcPr>
-          <w:p>
-            <w:pPr>
-              <w:spacing w:after="0" w:line="240" w:lineRule="auto"/>
-            </w:pPr>
-            <w:r>
-              <w:t>93237A103  |  M4 Belleville</w:t>
-            </w:r>
-            <w:r>
-              <w:rPr>
-                <w:color w:val="4A4A4A"/>
-                <w:sz w:val="18"/>
-              </w:rPr>
-              <w:br/>
-              <w:t>316 stainless; OD 9 / ID 4.3 / t 1.0 / H 1.30 mm</w:t>
-            </w:r>
-          </w:p>
-        </w:tc>
-        <w:tc>
-          <w:tcPr>
-            <w:tcW w:w="2608" w:type="dxa"/>
-            <w:vAlign w:val="center"/>
-          </w:tcPr>
-          <w:p>
-            <w:pPr>
-              <w:spacing w:after="0" w:line="240" w:lineRule="auto"/>
-              <w:jc w:val="center"/>
-            </w:pPr>
-            <w:hyperlink r:id="rId64">
-              <w:r>
-                <w:rPr>
-                  <w:color w:val="17588B"/>
-                  <w:sz w:val="20"/>
-                  <w:u w:val="single"/>
-                </w:rPr>
-                <w:t>McM</w:t>
-              </w:r>
-              <w:r>
-                <w:rPr>
-                  <w:color w:val="17588B"/>
-                  <w:sz w:val="20"/>
-                  <w:u w:val="single"/>
-                </w:rPr>
-                <w:t>a</w:t>
-              </w:r>
-              <w:r>
-                <w:rPr>
-                  <w:color w:val="17588B"/>
-                  <w:sz w:val="20"/>
-                  <w:u w:val="single"/>
-                </w:rPr>
-                <w:t>ster</w:t>
+                <w:t>McMaster</w:t>
               </w:r>
             </w:hyperlink>
           </w:p>
@@ -4791,7 +5072,23 @@
           <w:rFonts w:hint="eastAsia"/>
           <w:lang w:eastAsia="zh-CN"/>
         </w:rPr>
-        <w:t>t find it(But maybe we also have).</w:t>
+        <w:t xml:space="preserve">t find </w:t>
+      </w:r>
+      <w:proofErr w:type="gramStart"/>
+      <w:r>
+        <w:rPr>
+          <w:rFonts w:hint="eastAsia"/>
+          <w:lang w:eastAsia="zh-CN"/>
+        </w:rPr>
+        <w:t>it(</w:t>
+      </w:r>
+      <w:proofErr w:type="gramEnd"/>
+      <w:r>
+        <w:rPr>
+          <w:rFonts w:hint="eastAsia"/>
+          <w:lang w:eastAsia="zh-CN"/>
+        </w:rPr>
+        <w:t>But maybe we also have).</w:t>
       </w:r>
       <w:bookmarkEnd w:id="0"/>
       <w:r>
@@ -4907,7 +5204,15 @@
               <w:spacing w:after="0" w:line="240" w:lineRule="auto"/>
             </w:pPr>
             <w:r>
-              <w:t>92196A540  |  1/4-20 × ¾ in socket head</w:t>
+              <w:t>92196A</w:t>
+            </w:r>
+            <w:proofErr w:type="gramStart"/>
+            <w:r>
+              <w:t>540  |</w:t>
+            </w:r>
+            <w:proofErr w:type="gramEnd"/>
+            <w:r>
+              <w:t xml:space="preserve">  1/4-20 × ¾ in socket head</w:t>
             </w:r>
             <w:r>
               <w:rPr>
@@ -4966,7 +5271,15 @@
               <w:spacing w:after="0" w:line="240" w:lineRule="auto"/>
             </w:pPr>
             <w:r>
-              <w:t>92196A537  |  1/4-20 × ½ in socket head</w:t>
+              <w:t>92196A</w:t>
+            </w:r>
+            <w:proofErr w:type="gramStart"/>
+            <w:r>
+              <w:t>537  |</w:t>
+            </w:r>
+            <w:proofErr w:type="gramEnd"/>
+            <w:r>
+              <w:t xml:space="preserve">  1/4-20 × ½ in socket head</w:t>
             </w:r>
             <w:r>
               <w:rPr>
@@ -5028,7 +5341,15 @@
               <w:spacing w:after="0" w:line="240" w:lineRule="auto"/>
             </w:pPr>
             <w:r>
-              <w:t>91292A174  |  M12 × 30 mm socket head</w:t>
+              <w:t>91292A</w:t>
+            </w:r>
+            <w:proofErr w:type="gramStart"/>
+            <w:r>
+              <w:t>174  |</w:t>
+            </w:r>
+            <w:proofErr w:type="gramEnd"/>
+            <w:r>
+              <w:t xml:space="preserve">  M12 × 30 mm socket head</w:t>
             </w:r>
             <w:r>
               <w:rPr>
@@ -5036,6 +5357,12 @@
                 <w:sz w:val="18"/>
               </w:rPr>
               <w:br/>
+            </w:r>
+            <w:r>
+              <w:rPr>
+                <w:color w:val="4A4A4A"/>
+                <w:sz w:val="18"/>
+              </w:rPr>
               <w:t>18-8 stainless; 4 legs to the existing platform</w:t>
             </w:r>
           </w:p>
@@ -5048,6 +5375,435 @@
           <w:p>
             <w:pPr>
               <w:spacing w:after="0" w:line="240" w:lineRule="auto"/>
+              <w:jc w:val="center"/>
+            </w:pPr>
+            <w:hyperlink r:id="rId63">
+              <w:r>
+                <w:rPr>
+                  <w:color w:val="17588B"/>
+                  <w:sz w:val="20"/>
+                  <w:u w:val="single"/>
+                </w:rPr>
+                <w:t>McMaster</w:t>
+              </w:r>
+            </w:hyperlink>
+          </w:p>
+        </w:tc>
+        <w:tc>
+          <w:tcPr>
+            <w:tcW w:w="1531" w:type="dxa"/>
+            <w:vAlign w:val="center"/>
+          </w:tcPr>
+          <w:p>
+            <w:pPr>
+              <w:spacing w:after="0" w:line="240" w:lineRule="auto"/>
+              <w:jc w:val="center"/>
+            </w:pPr>
+            <w:r>
+              <w:t>4 pcs</w:t>
+            </w:r>
+            <w:r>
+              <w:br/>
+              <w:t>1 × 10 pack</w:t>
+            </w:r>
+          </w:p>
+        </w:tc>
+      </w:tr>
+      <w:tr>
+        <w:trPr>
+          <w:cantSplit/>
+          <w:jc w:val="center"/>
+        </w:trPr>
+        <w:tc>
+          <w:tcPr>
+            <w:tcW w:w="5953" w:type="dxa"/>
+            <w:vAlign w:val="center"/>
+          </w:tcPr>
+          <w:p>
+            <w:pPr>
+              <w:spacing w:after="0" w:line="240" w:lineRule="auto"/>
+            </w:pPr>
+            <w:r>
+              <w:t>93475A</w:t>
+            </w:r>
+            <w:proofErr w:type="gramStart"/>
+            <w:r>
+              <w:t>290  |</w:t>
+            </w:r>
+            <w:proofErr w:type="gramEnd"/>
+            <w:r>
+              <w:t xml:space="preserve">  M12 flat washer</w:t>
+            </w:r>
+            <w:r>
+              <w:rPr>
+                <w:color w:val="4A4A4A"/>
+                <w:sz w:val="18"/>
+              </w:rPr>
+              <w:br/>
+              <w:t>18-8 stainless; ID 13 × OD 24 mm; t 2.0–2.9 mm</w:t>
+            </w:r>
+          </w:p>
+        </w:tc>
+        <w:tc>
+          <w:tcPr>
+            <w:tcW w:w="2608" w:type="dxa"/>
+            <w:vAlign w:val="center"/>
+          </w:tcPr>
+          <w:p>
+            <w:pPr>
+              <w:spacing w:after="0" w:line="240" w:lineRule="auto"/>
+              <w:jc w:val="center"/>
+              <w:rPr>
+                <w:lang w:eastAsia="zh-CN"/>
+              </w:rPr>
+            </w:pPr>
+            <w:hyperlink r:id="rId64">
+              <w:r>
+                <w:rPr>
+                  <w:color w:val="17588B"/>
+                  <w:sz w:val="20"/>
+                  <w:u w:val="single"/>
+                </w:rPr>
+                <w:t>McMaster</w:t>
+              </w:r>
+            </w:hyperlink>
+          </w:p>
+        </w:tc>
+        <w:tc>
+          <w:tcPr>
+            <w:tcW w:w="1531" w:type="dxa"/>
+            <w:vAlign w:val="center"/>
+          </w:tcPr>
+          <w:p>
+            <w:pPr>
+              <w:spacing w:after="0" w:line="240" w:lineRule="auto"/>
+              <w:jc w:val="center"/>
+            </w:pPr>
+            <w:r>
+              <w:t>4 pcs</w:t>
+            </w:r>
+            <w:r>
+              <w:br/>
+              <w:t>1 × 25 pack</w:t>
+            </w:r>
+          </w:p>
+        </w:tc>
+      </w:tr>
+      <w:tr>
+        <w:trPr>
+          <w:cantSplit/>
+          <w:jc w:val="center"/>
+        </w:trPr>
+        <w:tc>
+          <w:tcPr>
+            <w:tcW w:w="5953" w:type="dxa"/>
+            <w:vAlign w:val="center"/>
+          </w:tcPr>
+          <w:p>
+            <w:pPr>
+              <w:spacing w:after="0" w:line="240" w:lineRule="auto"/>
+            </w:pPr>
+            <w:r>
+              <w:t>SH8S</w:t>
+            </w:r>
+            <w:proofErr w:type="gramStart"/>
+            <w:r>
+              <w:t>100  |</w:t>
+            </w:r>
+            <w:proofErr w:type="gramEnd"/>
+            <w:r>
+              <w:t xml:space="preserve">  8-32 × 1 in</w:t>
+            </w:r>
+            <w:r>
+              <w:rPr>
+                <w:color w:val="4A4A4A"/>
+                <w:sz w:val="18"/>
+              </w:rPr>
+              <w:br/>
+              <w:t>2 clamp-ear bolts</w:t>
+            </w:r>
+          </w:p>
+        </w:tc>
+        <w:tc>
+          <w:tcPr>
+            <w:tcW w:w="2608" w:type="dxa"/>
+            <w:vAlign w:val="center"/>
+          </w:tcPr>
+          <w:p>
+            <w:pPr>
+              <w:spacing w:after="0" w:line="240" w:lineRule="auto"/>
+              <w:jc w:val="center"/>
+            </w:pPr>
+          </w:p>
+        </w:tc>
+        <w:tc>
+          <w:tcPr>
+            <w:tcW w:w="1531" w:type="dxa"/>
+            <w:vAlign w:val="center"/>
+          </w:tcPr>
+          <w:p>
+            <w:pPr>
+              <w:spacing w:after="0" w:line="240" w:lineRule="auto"/>
+              <w:jc w:val="center"/>
+            </w:pPr>
+            <w:r>
+              <w:t>2 pcs</w:t>
+            </w:r>
+            <w:r>
+              <w:br/>
+              <w:t>1 × 50 pack</w:t>
+            </w:r>
+          </w:p>
+        </w:tc>
+      </w:tr>
+      <w:tr>
+        <w:trPr>
+          <w:cantSplit/>
+          <w:jc w:val="center"/>
+        </w:trPr>
+        <w:tc>
+          <w:tcPr>
+            <w:tcW w:w="5953" w:type="dxa"/>
+            <w:vAlign w:val="center"/>
+          </w:tcPr>
+          <w:p>
+            <w:pPr>
+              <w:spacing w:after="0" w:line="240" w:lineRule="auto"/>
+            </w:pPr>
+            <w:r>
+              <w:t>N8S</w:t>
+            </w:r>
+            <w:proofErr w:type="gramStart"/>
+            <w:r>
+              <w:t>0340  |</w:t>
+            </w:r>
+            <w:proofErr w:type="gramEnd"/>
+            <w:r>
+              <w:t xml:space="preserve">  8-32 hex nut</w:t>
+            </w:r>
+            <w:r>
+              <w:rPr>
+                <w:color w:val="4A4A4A"/>
+                <w:sz w:val="18"/>
+              </w:rPr>
+              <w:br/>
+              <w:t>2 clamp-ear nuts</w:t>
+            </w:r>
+          </w:p>
+        </w:tc>
+        <w:tc>
+          <w:tcPr>
+            <w:tcW w:w="2608" w:type="dxa"/>
+            <w:vAlign w:val="center"/>
+          </w:tcPr>
+          <w:p>
+            <w:pPr>
+              <w:spacing w:after="0" w:line="240" w:lineRule="auto"/>
+              <w:jc w:val="center"/>
+            </w:pPr>
+          </w:p>
+        </w:tc>
+        <w:tc>
+          <w:tcPr>
+            <w:tcW w:w="1531" w:type="dxa"/>
+            <w:vAlign w:val="center"/>
+          </w:tcPr>
+          <w:p>
+            <w:pPr>
+              <w:spacing w:after="0" w:line="240" w:lineRule="auto"/>
+              <w:jc w:val="center"/>
+            </w:pPr>
+            <w:r>
+              <w:t>2 pcs</w:t>
+            </w:r>
+            <w:r>
+              <w:br/>
+              <w:t>1 × 50 pack</w:t>
+            </w:r>
+          </w:p>
+        </w:tc>
+      </w:tr>
+      <w:tr>
+        <w:trPr>
+          <w:cantSplit/>
+          <w:jc w:val="center"/>
+        </w:trPr>
+        <w:tc>
+          <w:tcPr>
+            <w:tcW w:w="5953" w:type="dxa"/>
+            <w:vAlign w:val="center"/>
+          </w:tcPr>
+          <w:p>
+            <w:pPr>
+              <w:spacing w:after="0" w:line="240" w:lineRule="auto"/>
+            </w:pPr>
+            <w:r>
+              <w:t xml:space="preserve">Lawson </w:t>
+            </w:r>
+            <w:proofErr w:type="gramStart"/>
+            <w:r>
+              <w:t>1297309  |</w:t>
+            </w:r>
+            <w:proofErr w:type="gramEnd"/>
+            <w:r>
+              <w:t xml:space="preserve">  8-32 × ¼ in</w:t>
+            </w:r>
+            <w:r>
+              <w:rPr>
+                <w:color w:val="4A4A4A"/>
+                <w:sz w:val="18"/>
+              </w:rPr>
+              <w:br/>
+              <w:t>Flat-point stainless set screw; 4 radial cage-rod locks</w:t>
+            </w:r>
+          </w:p>
+        </w:tc>
+        <w:tc>
+          <w:tcPr>
+            <w:tcW w:w="2608" w:type="dxa"/>
+            <w:vAlign w:val="center"/>
+          </w:tcPr>
+          <w:p>
+            <w:pPr>
+              <w:spacing w:after="0" w:line="240" w:lineRule="auto"/>
+              <w:jc w:val="center"/>
+            </w:pPr>
+          </w:p>
+        </w:tc>
+        <w:tc>
+          <w:tcPr>
+            <w:tcW w:w="1531" w:type="dxa"/>
+            <w:vAlign w:val="center"/>
+          </w:tcPr>
+          <w:p>
+            <w:pPr>
+              <w:spacing w:after="0" w:line="240" w:lineRule="auto"/>
+              <w:jc w:val="center"/>
+            </w:pPr>
+            <w:r>
+              <w:t>4</w:t>
+            </w:r>
+          </w:p>
+        </w:tc>
+      </w:tr>
+      <w:tr>
+        <w:trPr>
+          <w:cantSplit/>
+          <w:jc w:val="center"/>
+        </w:trPr>
+        <w:tc>
+          <w:tcPr>
+            <w:tcW w:w="5953" w:type="dxa"/>
+            <w:vAlign w:val="center"/>
+          </w:tcPr>
+          <w:p>
+            <w:pPr>
+              <w:spacing w:after="0" w:line="240" w:lineRule="auto"/>
+            </w:pPr>
+            <w:r>
+              <w:t>SSC-4-40-5/8-A</w:t>
+            </w:r>
+            <w:proofErr w:type="gramStart"/>
+            <w:r>
+              <w:t>2  |</w:t>
+            </w:r>
+            <w:proofErr w:type="gramEnd"/>
+            <w:r>
+              <w:t xml:space="preserve">  4-40 × ⅝ in</w:t>
+            </w:r>
+            <w:r>
+              <w:rPr>
+                <w:color w:val="4A4A4A"/>
+                <w:sz w:val="18"/>
+              </w:rPr>
+              <w:br/>
+              <w:t>4 screws attaching the top cage mirror cube</w:t>
+            </w:r>
+          </w:p>
+        </w:tc>
+        <w:tc>
+          <w:tcPr>
+            <w:tcW w:w="2608" w:type="dxa"/>
+            <w:vAlign w:val="center"/>
+          </w:tcPr>
+          <w:p>
+            <w:pPr>
+              <w:spacing w:after="0" w:line="240" w:lineRule="auto"/>
+              <w:jc w:val="center"/>
+            </w:pPr>
+          </w:p>
+        </w:tc>
+        <w:tc>
+          <w:tcPr>
+            <w:tcW w:w="1531" w:type="dxa"/>
+            <w:vAlign w:val="center"/>
+          </w:tcPr>
+          <w:p>
+            <w:pPr>
+              <w:spacing w:after="0" w:line="240" w:lineRule="auto"/>
+              <w:jc w:val="center"/>
+            </w:pPr>
+            <w:r>
+              <w:t>4</w:t>
+            </w:r>
+          </w:p>
+        </w:tc>
+      </w:tr>
+      <w:tr>
+        <w:trPr>
+          <w:cantSplit/>
+          <w:jc w:val="center"/>
+        </w:trPr>
+        <w:tc>
+          <w:tcPr>
+            <w:tcW w:w="5953" w:type="dxa"/>
+            <w:vAlign w:val="center"/>
+          </w:tcPr>
+          <w:p>
+            <w:pPr>
+              <w:spacing w:after="0" w:line="240" w:lineRule="auto"/>
+            </w:pPr>
+            <w:r>
+              <w:rPr>
+                <w:color w:val="4A4A4A"/>
+                <w:sz w:val="18"/>
+              </w:rPr>
+              <w:t>94355A</w:t>
+            </w:r>
+            <w:proofErr w:type="gramStart"/>
+            <w:r>
+              <w:rPr>
+                <w:color w:val="4A4A4A"/>
+                <w:sz w:val="18"/>
+              </w:rPr>
+              <w:t>192  |</w:t>
+            </w:r>
+            <w:proofErr w:type="gramEnd"/>
+            <w:r>
+              <w:rPr>
+                <w:color w:val="4A4A4A"/>
+                <w:sz w:val="18"/>
+              </w:rPr>
+              <w:t xml:space="preserve">  8-32 × ⅜ in flat-tip setscrew</w:t>
+            </w:r>
+            <w:r>
+              <w:rPr>
+                <w:color w:val="4A4A4A"/>
+                <w:sz w:val="18"/>
+              </w:rPr>
+              <w:br/>
+              <w:t>18-8 stainless; 4 telescope supports + B2 mirror support</w:t>
+            </w:r>
+          </w:p>
+        </w:tc>
+        <w:tc>
+          <w:tcPr>
+            <w:tcW w:w="2608" w:type="dxa"/>
+            <w:vAlign w:val="center"/>
+          </w:tcPr>
+          <w:p>
+            <w:pPr>
+              <w:spacing w:after="0"/>
               <w:jc w:val="center"/>
             </w:pPr>
             <w:hyperlink r:id="rId65">
@@ -5073,11 +5829,11 @@
               <w:jc w:val="center"/>
             </w:pPr>
             <w:r>
-              <w:t>4 pcs</w:t>
+              <w:t>5 pcs</w:t>
             </w:r>
             <w:r>
               <w:br/>
-              <w:t>1 × 10 pack</w:t>
+              <w:t>1 × 25 pack</w:t>
             </w:r>
           </w:p>
         </w:tc>
@@ -5097,7 +5853,27 @@
               <w:spacing w:after="0" w:line="240" w:lineRule="auto"/>
             </w:pPr>
             <w:r>
-              <w:t>93475A290  |  M12 flat washer</w:t>
+              <w:rPr>
+                <w:color w:val="4A4A4A"/>
+                <w:sz w:val="18"/>
+              </w:rPr>
+              <w:t>94355A</w:t>
+            </w:r>
+            <w:proofErr w:type="gramStart"/>
+            <w:r>
+              <w:rPr>
+                <w:color w:val="4A4A4A"/>
+                <w:sz w:val="18"/>
+              </w:rPr>
+              <w:t>198  |</w:t>
+            </w:r>
+            <w:proofErr w:type="gramEnd"/>
+            <w:r>
+              <w:rPr>
+                <w:color w:val="4A4A4A"/>
+                <w:sz w:val="18"/>
+              </w:rPr>
+              <w:t xml:space="preserve">  8-32 × ⅝ in flat-tip setscrew</w:t>
             </w:r>
             <w:r>
               <w:rPr>
@@ -5105,7 +5881,7 @@
                 <w:sz w:val="18"/>
               </w:rPr>
               <w:br/>
-              <w:t>18-8 stainless; ID 13 × OD 24 mm; t 2.0–2.9 mm</w:t>
+              <w:t>18-8 stainless; A1 and B1 through 5 mm spacers, A2 through 4 mm spacer</w:t>
             </w:r>
           </w:p>
         </w:tc>
@@ -5116,11 +5892,8 @@
           </w:tcPr>
           <w:p>
             <w:pPr>
-              <w:spacing w:after="0" w:line="240" w:lineRule="auto"/>
+              <w:spacing w:after="0"/>
               <w:jc w:val="center"/>
-              <w:rPr>
-                <w:lang w:eastAsia="zh-CN"/>
-              </w:rPr>
             </w:pPr>
             <w:hyperlink r:id="rId66">
               <w:r>
@@ -5145,369 +5918,11 @@
               <w:jc w:val="center"/>
             </w:pPr>
             <w:r>
-              <w:t>4 pcs</w:t>
+              <w:t>3 pcs</w:t>
             </w:r>
             <w:r>
               <w:br/>
               <w:t>1 × 25 pack</w:t>
-            </w:r>
-          </w:p>
-        </w:tc>
-      </w:tr>
-      <w:tr>
-        <w:trPr>
-          <w:cantSplit/>
-          <w:jc w:val="center"/>
-        </w:trPr>
-        <w:tc>
-          <w:tcPr>
-            <w:tcW w:w="5953" w:type="dxa"/>
-            <w:vAlign w:val="center"/>
-          </w:tcPr>
-          <w:p>
-            <w:pPr>
-              <w:spacing w:after="0" w:line="240" w:lineRule="auto"/>
-            </w:pPr>
-            <w:r>
-              <w:t>SH8S100  |  8-32 × 1 in</w:t>
-            </w:r>
-            <w:r>
-              <w:rPr>
-                <w:color w:val="4A4A4A"/>
-                <w:sz w:val="18"/>
-              </w:rPr>
-              <w:br/>
-              <w:t>2 clamp-ear bolts</w:t>
-            </w:r>
-          </w:p>
-        </w:tc>
-        <w:tc>
-          <w:tcPr>
-            <w:tcW w:w="2608" w:type="dxa"/>
-            <w:vAlign w:val="center"/>
-          </w:tcPr>
-          <w:p>
-            <w:pPr>
-              <w:spacing w:after="0" w:line="240" w:lineRule="auto"/>
-              <w:jc w:val="center"/>
-            </w:pPr>
-          </w:p>
-        </w:tc>
-        <w:tc>
-          <w:tcPr>
-            <w:tcW w:w="1531" w:type="dxa"/>
-            <w:vAlign w:val="center"/>
-          </w:tcPr>
-          <w:p>
-            <w:pPr>
-              <w:spacing w:after="0" w:line="240" w:lineRule="auto"/>
-              <w:jc w:val="center"/>
-            </w:pPr>
-            <w:r>
-              <w:t>2 pcs</w:t>
-            </w:r>
-            <w:r>
-              <w:br/>
-              <w:t>1 × 50 pack</w:t>
-            </w:r>
-          </w:p>
-        </w:tc>
-      </w:tr>
-      <w:tr>
-        <w:trPr>
-          <w:cantSplit/>
-          <w:jc w:val="center"/>
-        </w:trPr>
-        <w:tc>
-          <w:tcPr>
-            <w:tcW w:w="5953" w:type="dxa"/>
-            <w:vAlign w:val="center"/>
-          </w:tcPr>
-          <w:p>
-            <w:pPr>
-              <w:spacing w:after="0" w:line="240" w:lineRule="auto"/>
-            </w:pPr>
-            <w:r>
-              <w:t>N8S0340  |  8-32 hex nut</w:t>
-            </w:r>
-            <w:r>
-              <w:rPr>
-                <w:color w:val="4A4A4A"/>
-                <w:sz w:val="18"/>
-              </w:rPr>
-              <w:br/>
-              <w:t>2 clamp-ear nuts</w:t>
-            </w:r>
-          </w:p>
-        </w:tc>
-        <w:tc>
-          <w:tcPr>
-            <w:tcW w:w="2608" w:type="dxa"/>
-            <w:vAlign w:val="center"/>
-          </w:tcPr>
-          <w:p>
-            <w:pPr>
-              <w:spacing w:after="0" w:line="240" w:lineRule="auto"/>
-              <w:jc w:val="center"/>
-            </w:pPr>
-          </w:p>
-        </w:tc>
-        <w:tc>
-          <w:tcPr>
-            <w:tcW w:w="1531" w:type="dxa"/>
-            <w:vAlign w:val="center"/>
-          </w:tcPr>
-          <w:p>
-            <w:pPr>
-              <w:spacing w:after="0" w:line="240" w:lineRule="auto"/>
-              <w:jc w:val="center"/>
-            </w:pPr>
-            <w:r>
-              <w:t>2 pcs</w:t>
-            </w:r>
-            <w:r>
-              <w:br/>
-              <w:t>1 × 50 pack</w:t>
-            </w:r>
-          </w:p>
-        </w:tc>
-      </w:tr>
-      <w:tr>
-        <w:trPr>
-          <w:cantSplit/>
-          <w:jc w:val="center"/>
-        </w:trPr>
-        <w:tc>
-          <w:tcPr>
-            <w:tcW w:w="5953" w:type="dxa"/>
-            <w:vAlign w:val="center"/>
-          </w:tcPr>
-          <w:p>
-            <w:pPr>
-              <w:spacing w:after="0" w:line="240" w:lineRule="auto"/>
-            </w:pPr>
-            <w:r>
-              <w:t>Lawson 1297309  |  8-32 × ¼ in</w:t>
-            </w:r>
-            <w:r>
-              <w:rPr>
-                <w:color w:val="4A4A4A"/>
-                <w:sz w:val="18"/>
-              </w:rPr>
-              <w:br/>
-              <w:t>Flat-point stainless set screw; 4 radial cage-rod locks</w:t>
-            </w:r>
-          </w:p>
-        </w:tc>
-        <w:tc>
-          <w:tcPr>
-            <w:tcW w:w="2608" w:type="dxa"/>
-            <w:vAlign w:val="center"/>
-          </w:tcPr>
-          <w:p>
-            <w:pPr>
-              <w:spacing w:after="0" w:line="240" w:lineRule="auto"/>
-              <w:jc w:val="center"/>
-            </w:pPr>
-          </w:p>
-        </w:tc>
-        <w:tc>
-          <w:tcPr>
-            <w:tcW w:w="1531" w:type="dxa"/>
-            <w:vAlign w:val="center"/>
-          </w:tcPr>
-          <w:p>
-            <w:pPr>
-              <w:spacing w:after="0" w:line="240" w:lineRule="auto"/>
-              <w:jc w:val="center"/>
-            </w:pPr>
-            <w:r>
-              <w:t>4</w:t>
-            </w:r>
-          </w:p>
-        </w:tc>
-      </w:tr>
-      <w:tr>
-        <w:trPr>
-          <w:cantSplit/>
-          <w:jc w:val="center"/>
-        </w:trPr>
-        <w:tc>
-          <w:tcPr>
-            <w:tcW w:w="5953" w:type="dxa"/>
-            <w:vAlign w:val="center"/>
-          </w:tcPr>
-          <w:p>
-            <w:pPr>
-              <w:spacing w:after="0" w:line="240" w:lineRule="auto"/>
-            </w:pPr>
-            <w:r>
-              <w:t>SSC-4-40-5/8-A2  |  4-40 × ⅝ in</w:t>
-            </w:r>
-            <w:r>
-              <w:rPr>
-                <w:color w:val="4A4A4A"/>
-                <w:sz w:val="18"/>
-              </w:rPr>
-              <w:br/>
-              <w:t>4 screws attaching the top cage mirror cube</w:t>
-            </w:r>
-          </w:p>
-        </w:tc>
-        <w:tc>
-          <w:tcPr>
-            <w:tcW w:w="2608" w:type="dxa"/>
-            <w:vAlign w:val="center"/>
-          </w:tcPr>
-          <w:p>
-            <w:pPr>
-              <w:spacing w:after="0" w:line="240" w:lineRule="auto"/>
-              <w:jc w:val="center"/>
-            </w:pPr>
-          </w:p>
-        </w:tc>
-        <w:tc>
-          <w:tcPr>
-            <w:tcW w:w="1531" w:type="dxa"/>
-            <w:vAlign w:val="center"/>
-          </w:tcPr>
-          <w:p>
-            <w:pPr>
-              <w:spacing w:after="0" w:line="240" w:lineRule="auto"/>
-              <w:jc w:val="center"/>
-            </w:pPr>
-            <w:r>
-              <w:t>4</w:t>
-            </w:r>
-          </w:p>
-        </w:tc>
-      </w:tr>
-      <w:tr>
-        <w:trPr>
-          <w:cantSplit/>
-          <w:jc w:val="center"/>
-        </w:trPr>
-        <w:tc>
-          <w:tcPr>
-            <w:tcW w:w="5953" w:type="dxa"/>
-            <w:vAlign w:val="center"/>
-          </w:tcPr>
-          <w:p>
-            <w:pPr>
-              <w:spacing w:after="0" w:line="240" w:lineRule="auto"/>
-            </w:pPr>
-            <w:r>
-              <w:rPr>
-                <w:color w:val="4A4A4A"/>
-                <w:sz w:val="18"/>
-              </w:rPr>
-              <w:t xml:space="preserve">94355A192  |  8-32 × ⅜ in flat-tip setscrew</w:t>
-              <w:br/>
-              <w:t xml:space="preserve">18-8 stainless; 4 telescope supports + B2 mirror support</w:t>
-            </w:r>
-          </w:p>
-        </w:tc>
-        <w:tc>
-          <w:tcPr>
-            <w:tcW w:w="2608" w:type="dxa"/>
-            <w:vAlign w:val="center"/>
-          </w:tcPr>
-          <w:p>
-            <w:pPr>
-              <w:spacing w:after="0"/>
-              <w:jc w:val="center"/>
-            </w:pPr>
-            <w:hyperlink r:id="rId76">
-              <w:r>
-                <w:rPr>
-                  <w:color w:val="17588B"/>
-                  <w:sz w:val="20"/>
-                  <w:u w:val="single"/>
-                </w:rPr>
-                <w:t xml:space="preserve">McMaster</w:t>
-              </w:r>
-            </w:hyperlink>
-          </w:p>
-        </w:tc>
-        <w:tc>
-          <w:tcPr>
-            <w:tcW w:w="1531" w:type="dxa"/>
-            <w:vAlign w:val="center"/>
-          </w:tcPr>
-          <w:p>
-            <w:pPr>
-              <w:spacing w:after="0" w:line="240" w:lineRule="auto"/>
-              <w:jc w:val="center"/>
-            </w:pPr>
-            <w:r>
-              <w:t xml:space="preserve">5 pcs</w:t>
-              <w:br/>
-              <w:t xml:space="preserve">1 × 25 pack</w:t>
-            </w:r>
-          </w:p>
-        </w:tc>
-      </w:tr>
-      <w:tr>
-        <w:trPr>
-          <w:cantSplit/>
-          <w:jc w:val="center"/>
-        </w:trPr>
-        <w:tc>
-          <w:tcPr>
-            <w:tcW w:w="5953" w:type="dxa"/>
-            <w:vAlign w:val="center"/>
-          </w:tcPr>
-          <w:p>
-            <w:pPr>
-              <w:spacing w:after="0" w:line="240" w:lineRule="auto"/>
-            </w:pPr>
-            <w:r>
-              <w:rPr>
-                <w:color w:val="4A4A4A"/>
-                <w:sz w:val="18"/>
-              </w:rPr>
-              <w:t xml:space="preserve">94355A198  |  8-32 × ⅝ in flat-tip setscrew</w:t>
-              <w:br/>
-              <w:t xml:space="preserve">18-8 stainless; A1 and B1 through 5 mm spacers, A2 through 4 mm spacer</w:t>
-            </w:r>
-          </w:p>
-        </w:tc>
-        <w:tc>
-          <w:tcPr>
-            <w:tcW w:w="2608" w:type="dxa"/>
-            <w:vAlign w:val="center"/>
-          </w:tcPr>
-          <w:p>
-            <w:pPr>
-              <w:spacing w:after="0"/>
-              <w:jc w:val="center"/>
-            </w:pPr>
-            <w:hyperlink r:id="rId77">
-              <w:r>
-                <w:rPr>
-                  <w:color w:val="17588B"/>
-                  <w:sz w:val="20"/>
-                  <w:u w:val="single"/>
-                </w:rPr>
-                <w:t xml:space="preserve">McMaster</w:t>
-              </w:r>
-            </w:hyperlink>
-          </w:p>
-        </w:tc>
-        <w:tc>
-          <w:tcPr>
-            <w:tcW w:w="1531" w:type="dxa"/>
-            <w:vAlign w:val="center"/>
-          </w:tcPr>
-          <w:p>
-            <w:pPr>
-              <w:spacing w:after="0" w:line="240" w:lineRule="auto"/>
-              <w:jc w:val="center"/>
-            </w:pPr>
-            <w:r>
-              <w:t xml:space="preserve">3 pcs</w:t>
-              <w:br/>
-              <w:t xml:space="preserve">1 × 25 pack</w:t>
             </w:r>
           </w:p>
         </w:tc>
@@ -5535,12 +5950,28 @@
           <w:rFonts w:hint="eastAsia"/>
           <w:lang w:eastAsia="zh-CN"/>
         </w:rPr>
-        <w:t>t find it(But maybe we also have).</w:t>
+        <w:t xml:space="preserve">t find </w:t>
+      </w:r>
+      <w:proofErr w:type="gramStart"/>
+      <w:r>
+        <w:rPr>
+          <w:rFonts w:hint="eastAsia"/>
+          <w:lang w:eastAsia="zh-CN"/>
+        </w:rPr>
+        <w:t>it(</w:t>
+      </w:r>
+      <w:proofErr w:type="gramEnd"/>
+      <w:r>
+        <w:rPr>
+          <w:rFonts w:hint="eastAsia"/>
+          <w:lang w:eastAsia="zh-CN"/>
+        </w:rPr>
+        <w:t>But maybe we also have).</w:t>
       </w:r>
     </w:p>
     <w:p/>
     <w:sectPr>
-      <w:footerReference w:type="default" r:id="rId69"/>
+      <w:footerReference w:type="default" r:id="rId67"/>
       <w:pgSz w:w="11906" w:h="16838"/>
       <w:pgMar w:top="907" w:right="907" w:bottom="850" w:left="907" w:header="397" w:footer="397" w:gutter="0"/>
       <w:cols w:space="720"/>
@@ -5587,7 +6018,23 @@
         <w:color w:val="666666"/>
         <w:sz w:val="16"/>
       </w:rPr>
-      <w:t xml:space="preserve">Shopping list  |  </w:t>
+      <w:t xml:space="preserve">Shopping </w:t>
+    </w:r>
+    <w:proofErr w:type="gramStart"/>
+    <w:r>
+      <w:rPr>
+        <w:color w:val="666666"/>
+        <w:sz w:val="16"/>
+      </w:rPr>
+      <w:t>list  |</w:t>
+    </w:r>
+    <w:proofErr w:type="gramEnd"/>
+    <w:r>
+      <w:rPr>
+        <w:color w:val="666666"/>
+        <w:sz w:val="16"/>
+      </w:rPr>
+      <w:t xml:space="preserve">  </w:t>
     </w:r>
     <w:r>
       <w:fldChar w:fldCharType="begin"/>

</xml_diff>

<commit_message>
Update washer cage extensions and existing waveplate mounting purchases
</commit_message>
<xml_diff>
--- a/production/shopping_list.docx
+++ b/production/shopping_list.docx
@@ -146,23 +146,7 @@
               <w:spacing w:after="0" w:line="240" w:lineRule="auto"/>
             </w:pPr>
             <w:r>
-              <w:t>Lattice board V</w:t>
-            </w:r>
-            <w:proofErr w:type="gramStart"/>
-            <w:r>
-              <w:t>9  |</w:t>
-            </w:r>
-            <w:proofErr w:type="gramEnd"/>
-            <w:r>
-              <w:t xml:space="preserve">  dual TA 75–</w:t>
-            </w:r>
-            <w:proofErr w:type="gramStart"/>
-            <w:r>
-              <w:t>75  |</w:t>
-            </w:r>
-            <w:proofErr w:type="gramEnd"/>
-            <w:r>
-              <w:t xml:space="preserve">  24 × 15 in</w:t>
+              <w:t>Lattice board V9  |  dual TA 75–75  |  24 × 15 in</w:t>
             </w:r>
           </w:p>
         </w:tc>
@@ -986,15 +970,7 @@
               <w:spacing w:after="0" w:line="240" w:lineRule="auto"/>
             </w:pPr>
             <w:r>
-              <w:t xml:space="preserve">TA board </w:t>
-            </w:r>
-            <w:proofErr w:type="gramStart"/>
-            <w:r>
-              <w:t>V9.15  |</w:t>
-            </w:r>
-            <w:proofErr w:type="gramEnd"/>
-            <w:r>
-              <w:t xml:space="preserve">  11.625 × 10.625 in</w:t>
+              <w:t>TA board V9.15  |  11.625 × 10.625 in</w:t>
             </w:r>
           </w:p>
         </w:tc>
@@ -1625,15 +1601,7 @@
               <w:spacing w:after="0" w:line="240" w:lineRule="auto"/>
             </w:pPr>
             <w:r>
-              <w:t>Splitting board V</w:t>
-            </w:r>
-            <w:proofErr w:type="gramStart"/>
-            <w:r>
-              <w:t>2  |</w:t>
-            </w:r>
-            <w:proofErr w:type="gramEnd"/>
-            <w:r>
-              <w:t xml:space="preserve">  24 × 14 in</w:t>
+              <w:t>Splitting board V2  |  24 × 14 in</w:t>
             </w:r>
           </w:p>
         </w:tc>
@@ -2103,9 +2071,30 @@
     <w:p>
       <w:r>
         <w:rPr>
+          <w:rFonts w:hint="eastAsia"/>
           <w:sz w:val="18"/>
         </w:rPr>
-        <w:t>Assembly note: No adhesive is specified for the PBS125-to-CRM05 bond. Confirm a suitable adhesive and laboratory supply before assembly.</w:t>
+        <w:t xml:space="preserve">Assembly: Existing Ø12.7 mm waveplates (thickness </w:t>
+      </w:r>
+      <w:r>
+        <w:rPr>
+          <w:rFonts w:hint="eastAsia"/>
+          <w:sz w:val="18"/>
+        </w:rPr>
+        <w:t>≤</w:t>
+      </w:r>
+      <w:r>
+        <w:rPr>
+          <w:rFonts w:hint="eastAsia"/>
+          <w:sz w:val="18"/>
+        </w:rPr>
+        <w:t xml:space="preserve"> 6.5 mm) use CRM05 with the included SM05RR; no new waveplates or disassembly required. PBS125 remains adhesive-mounted; adhesive is not included. Extend each ER6E with one ER1 using one supplied 4-40 stu</w:t>
+      </w:r>
+      <w:r>
+        <w:rPr>
+          <w:sz w:val="18"/>
+        </w:rPr>
+        <w:t>d; remove the duplicate stud at each joint. Procurement revision 2026-10-23; Inventor remains unchanged.</w:t>
       </w:r>
     </w:p>
     <w:tbl>
@@ -2212,21 +2201,8 @@
               <w:spacing w:after="0" w:line="240" w:lineRule="auto"/>
             </w:pPr>
             <w:r>
-              <w:t>A390TM-</w:t>
-            </w:r>
-            <w:proofErr w:type="gramStart"/>
-            <w:r>
-              <w:t>B  |</w:t>
-            </w:r>
-            <w:proofErr w:type="gramEnd"/>
-            <w:r>
-              <w:t xml:space="preserve">  mounted collimation </w:t>
-            </w:r>
-            <w:proofErr w:type="spellStart"/>
-            <w:r>
-              <w:t>asphere</w:t>
-            </w:r>
-            <w:proofErr w:type="spellEnd"/>
+              <w:t>A390TM-B  |  mounted collimation asphere</w:t>
+            </w:r>
             <w:r>
               <w:rPr>
                 <w:color w:val="4A4A4A"/>
@@ -2290,15 +2266,7 @@
               <w:spacing w:after="0" w:line="240" w:lineRule="auto"/>
             </w:pPr>
             <w:r>
-              <w:t>S05TM</w:t>
-            </w:r>
-            <w:proofErr w:type="gramStart"/>
-            <w:r>
-              <w:t>09  |</w:t>
-            </w:r>
-            <w:proofErr w:type="gramEnd"/>
-            <w:r>
-              <w:t xml:space="preserve">  M9 × 0.5 to SM05 lens adapter</w:t>
+              <w:t>S05TM09  |  M9 × 0.5 to SM05 lens adapter</w:t>
             </w:r>
           </w:p>
         </w:tc>
@@ -2355,15 +2323,7 @@
               <w:spacing w:after="0" w:line="240" w:lineRule="auto"/>
             </w:pPr>
             <w:r>
-              <w:t>SM05L</w:t>
-            </w:r>
-            <w:proofErr w:type="gramStart"/>
-            <w:r>
-              <w:t>05  |</w:t>
-            </w:r>
-            <w:proofErr w:type="gramEnd"/>
-            <w:r>
-              <w:t xml:space="preserve">  ½ in collimator lens tube</w:t>
+              <w:t>SM05L05  |  ½ in collimator lens tube</w:t>
             </w:r>
           </w:p>
         </w:tc>
@@ -2420,23 +2380,7 @@
               <w:spacing w:after="0" w:line="240" w:lineRule="auto"/>
             </w:pPr>
             <w:r>
-              <w:t>SM05FCA</w:t>
-            </w:r>
-            <w:proofErr w:type="gramStart"/>
-            <w:r>
-              <w:t>2  |</w:t>
-            </w:r>
-            <w:proofErr w:type="gramEnd"/>
-            <w:r>
-              <w:t xml:space="preserve">  FC/APC </w:t>
-            </w:r>
-            <w:proofErr w:type="spellStart"/>
-            <w:r>
-              <w:t>fibre</w:t>
-            </w:r>
-            <w:proofErr w:type="spellEnd"/>
-            <w:r>
-              <w:t xml:space="preserve"> adapter</w:t>
+              <w:t>SM05FCA2  |  FC/APC fibre adapter</w:t>
             </w:r>
             <w:r>
               <w:rPr>
@@ -2501,15 +2445,7 @@
               <w:spacing w:after="0" w:line="240" w:lineRule="auto"/>
             </w:pPr>
             <w:r>
-              <w:t>AHWP05M-</w:t>
-            </w:r>
-            <w:proofErr w:type="gramStart"/>
-            <w:r>
-              <w:t>980  |</w:t>
-            </w:r>
-            <w:proofErr w:type="gramEnd"/>
-            <w:r>
-              <w:t xml:space="preserve">  half-wave plate</w:t>
+              <w:t>LC1054-B  |  telescope lens, f = −25 mm</w:t>
             </w:r>
           </w:p>
         </w:tc>
@@ -2566,15 +2502,15 @@
               <w:spacing w:after="0" w:line="240" w:lineRule="auto"/>
             </w:pPr>
             <w:r>
-              <w:t>LC1054-</w:t>
-            </w:r>
-            <w:proofErr w:type="gramStart"/>
-            <w:r>
-              <w:t>B  |</w:t>
-            </w:r>
-            <w:proofErr w:type="gramEnd"/>
-            <w:r>
-              <w:t xml:space="preserve">  telescope lens, f = −25 mm</w:t>
+              <w:t>LA1213-B  |  unmounted telescope lens</w:t>
+            </w:r>
+            <w:r>
+              <w:rPr>
+                <w:color w:val="4A4A4A"/>
+                <w:sz w:val="18"/>
+              </w:rPr>
+              <w:br/>
+              <w:t>½ in optic; nominal f = +50 mm; AR 650–1050 nm</w:t>
             </w:r>
           </w:p>
         </w:tc>
@@ -2631,23 +2567,11 @@
               <w:spacing w:after="0" w:line="240" w:lineRule="auto"/>
             </w:pPr>
             <w:r>
-              <w:t>LA1213-</w:t>
-            </w:r>
-            <w:proofErr w:type="gramStart"/>
-            <w:r>
-              <w:t>B  |</w:t>
-            </w:r>
-            <w:proofErr w:type="gramEnd"/>
-            <w:r>
-              <w:t xml:space="preserve">  unmounted telescope lens</w:t>
-            </w:r>
-            <w:r>
-              <w:rPr>
-                <w:color w:val="4A4A4A"/>
-                <w:sz w:val="18"/>
-              </w:rPr>
+              <w:t>KM05  |  ½ in two-axis mirror mount</w:t>
+            </w:r>
+            <w:r>
               <w:br/>
-              <w:t>½ in optic; nominal f = +50 mm; AR 650–1050 nm</w:t>
+              <w:t>8-32 post mounting threads</w:t>
             </w:r>
           </w:p>
         </w:tc>
@@ -2684,7 +2608,7 @@
               <w:jc w:val="center"/>
             </w:pPr>
             <w:r>
-              <w:t>2</w:t>
+              <w:t>4</w:t>
             </w:r>
           </w:p>
         </w:tc>
@@ -2704,19 +2628,26 @@
               <w:spacing w:after="0" w:line="240" w:lineRule="auto"/>
             </w:pPr>
             <w:r>
-              <w:t>KM</w:t>
-            </w:r>
-            <w:proofErr w:type="gramStart"/>
-            <w:r>
-              <w:t>05  |</w:t>
-            </w:r>
-            <w:proofErr w:type="gramEnd"/>
-            <w:r>
-              <w:t xml:space="preserve">  ½ in two-axis mirror mount</w:t>
-            </w:r>
-            <w:r>
+              <w:rPr>
+                <w:rFonts w:cs="Arial"/>
+                <w:sz w:val="22"/>
+              </w:rPr>
+              <w:t>CRM05  |  ½ in rotation adapter</w:t>
+            </w:r>
+            <w:r>
+              <w:rPr>
+                <w:rFonts w:cs="Arial"/>
+                <w:sz w:val="22"/>
+              </w:rPr>
               <w:br/>
-              <w:t>8-32 post mounting threads</w:t>
+            </w:r>
+            <w:r>
+              <w:rPr>
+                <w:rFonts w:cs="Arial"/>
+                <w:color w:val="4A4A4A"/>
+                <w:sz w:val="18"/>
+              </w:rPr>
+              <w:t>2 PBS carriers + 2 holders for existing Ø12.7 mm waveplates; SM05RR included</w:t>
             </w:r>
           </w:p>
         </w:tc>
@@ -2773,18 +2704,26 @@
               <w:spacing w:after="0" w:line="240" w:lineRule="auto"/>
             </w:pPr>
             <w:r>
-              <w:t>CRM1</w:t>
-            </w:r>
-            <w:proofErr w:type="gramStart"/>
-            <w:r>
-              <w:t>T</w:t>
-            </w:r>
-            <w:r>
-              <w:t xml:space="preserve">  |</w:t>
-            </w:r>
-            <w:proofErr w:type="gramEnd"/>
-            <w:r>
-              <w:t xml:space="preserve">  cage rotation mount</w:t>
+              <w:rPr>
+                <w:rFonts w:cs="Arial"/>
+                <w:sz w:val="22"/>
+              </w:rPr>
+              <w:t>CP33  |  30 mm cage plate</w:t>
+            </w:r>
+            <w:r>
+              <w:rPr>
+                <w:rFonts w:cs="Arial"/>
+                <w:sz w:val="22"/>
+              </w:rPr>
+              <w:br/>
+            </w:r>
+            <w:r>
+              <w:rPr>
+                <w:rFonts w:cs="Arial"/>
+                <w:color w:val="4A4A4A"/>
+                <w:sz w:val="18"/>
+              </w:rPr>
+              <w:t>8-32 post thread; 2 PBS + 2 waveplate rotation carriers</w:t>
             </w:r>
           </w:p>
         </w:tc>
@@ -2805,7 +2744,23 @@
                   <w:sz w:val="20"/>
                   <w:u w:val="single"/>
                 </w:rPr>
-                <w:t>Thorlabs</w:t>
+                <w:t>Thorl</w:t>
+              </w:r>
+              <w:r>
+                <w:rPr>
+                  <w:color w:val="17588B"/>
+                  <w:sz w:val="20"/>
+                  <w:u w:val="single"/>
+                </w:rPr>
+                <w:t>a</w:t>
+              </w:r>
+              <w:r>
+                <w:rPr>
+                  <w:color w:val="17588B"/>
+                  <w:sz w:val="20"/>
+                  <w:u w:val="single"/>
+                </w:rPr>
+                <w:t>bs</w:t>
               </w:r>
             </w:hyperlink>
           </w:p>
@@ -2821,7 +2776,7 @@
               <w:jc w:val="center"/>
             </w:pPr>
             <w:r>
-              <w:t>2</w:t>
+              <w:t>4</w:t>
             </w:r>
           </w:p>
         </w:tc>
@@ -2841,15 +2796,11 @@
               <w:spacing w:after="0" w:line="240" w:lineRule="auto"/>
             </w:pPr>
             <w:r>
-              <w:t>CRM</w:t>
-            </w:r>
-            <w:proofErr w:type="gramStart"/>
-            <w:r>
-              <w:t>05  |</w:t>
-            </w:r>
-            <w:proofErr w:type="gramEnd"/>
-            <w:r>
-              <w:t xml:space="preserve">  ½ in rotation adapter</w:t>
+              <w:t>CP32  |  ½ in lens cage plate</w:t>
+            </w:r>
+            <w:r>
+              <w:br/>
+              <w:t>8-32 post mounting thread</w:t>
             </w:r>
           </w:p>
         </w:tc>
@@ -2886,7 +2837,7 @@
               <w:jc w:val="center"/>
             </w:pPr>
             <w:r>
-              <w:t>2</w:t>
+              <w:t>6</w:t>
             </w:r>
           </w:p>
         </w:tc>
@@ -2906,97 +2857,26 @@
               <w:spacing w:after="0" w:line="240" w:lineRule="auto"/>
             </w:pPr>
             <w:r>
-              <w:t>CP</w:t>
-            </w:r>
-            <w:proofErr w:type="gramStart"/>
-            <w:r>
-              <w:t>33</w:t>
-            </w:r>
-            <w:r>
-              <w:t xml:space="preserve">  |</w:t>
-            </w:r>
-            <w:proofErr w:type="gramEnd"/>
-            <w:r>
-              <w:t xml:space="preserve">  30 mm cage plate</w:t>
-            </w:r>
-          </w:p>
-        </w:tc>
-        <w:tc>
-          <w:tcPr>
-            <w:tcW w:w="2608" w:type="dxa"/>
-            <w:vAlign w:val="center"/>
-          </w:tcPr>
-          <w:p>
-            <w:pPr>
-              <w:spacing w:after="0"/>
-              <w:jc w:val="center"/>
-            </w:pPr>
-            <w:r>
-              <w:fldChar w:fldCharType="begin"/>
-            </w:r>
-            <w:r>
-              <w:instrText xml:space="preserve">HYPERLINK "https://www.thorlabs.com/item/CP33" \h </w:instrText>
-            </w:r>
-            <w:r>
-              <w:fldChar w:fldCharType="separate"/>
-            </w:r>
-            <w:r>
               <w:rPr>
-                <w:color w:val="17588B"/>
-                <w:sz w:val="20"/>
-                <w:u w:val="single"/>
+                <w:rFonts w:cs="Arial"/>
+                <w:sz w:val="22"/>
               </w:rPr>
-              <w:t>Thorlabs</w:t>
-            </w:r>
-            <w:r>
-              <w:fldChar w:fldCharType="end"/>
-            </w:r>
-          </w:p>
-        </w:tc>
-        <w:tc>
-          <w:tcPr>
-            <w:tcW w:w="1531" w:type="dxa"/>
-            <w:vAlign w:val="center"/>
-          </w:tcPr>
-          <w:p>
-            <w:pPr>
-              <w:spacing w:after="0" w:line="240" w:lineRule="auto"/>
-              <w:jc w:val="center"/>
-            </w:pPr>
-            <w:r>
-              <w:t>2</w:t>
-            </w:r>
-          </w:p>
-        </w:tc>
-      </w:tr>
-      <w:tr>
-        <w:trPr>
-          <w:cantSplit/>
-          <w:jc w:val="center"/>
-        </w:trPr>
-        <w:tc>
-          <w:tcPr>
-            <w:tcW w:w="5953" w:type="dxa"/>
-            <w:vAlign w:val="center"/>
-          </w:tcPr>
-          <w:p>
-            <w:pPr>
-              <w:spacing w:after="0" w:line="240" w:lineRule="auto"/>
-            </w:pPr>
-            <w:r>
-              <w:t>CP</w:t>
-            </w:r>
-            <w:proofErr w:type="gramStart"/>
-            <w:r>
-              <w:t>32  |</w:t>
-            </w:r>
-            <w:proofErr w:type="gramEnd"/>
-            <w:r>
-              <w:t xml:space="preserve">  ½ in lens cage plate</w:t>
-            </w:r>
-            <w:r>
+              <w:t>ER6E  |  6 in engraved cage rod</w:t>
+            </w:r>
+            <w:r>
+              <w:rPr>
+                <w:rFonts w:cs="Arial"/>
+                <w:sz w:val="22"/>
+              </w:rPr>
               <w:br/>
-              <w:t>8-32 post mounting thread</w:t>
+            </w:r>
+            <w:r>
+              <w:rPr>
+                <w:rFonts w:cs="Arial"/>
+                <w:color w:val="4A4A4A"/>
+                <w:sz w:val="18"/>
+              </w:rPr>
+              <w:t>152.4 mm; add one ER1 per rod for 177.8 mm total; 4 rods per beam</w:t>
             </w:r>
           </w:p>
         </w:tc>
@@ -3033,7 +2913,7 @@
               <w:jc w:val="center"/>
             </w:pPr>
             <w:r>
-              <w:t>6</w:t>
+              <w:t>8</w:t>
             </w:r>
           </w:p>
         </w:tc>
@@ -3053,29 +2933,26 @@
               <w:spacing w:after="0" w:line="240" w:lineRule="auto"/>
             </w:pPr>
             <w:r>
-              <w:t>ER6</w:t>
-            </w:r>
-            <w:proofErr w:type="gramStart"/>
-            <w:r>
-              <w:t>E  |</w:t>
-            </w:r>
-            <w:proofErr w:type="gramEnd"/>
-            <w:r>
-              <w:t xml:space="preserve">  6 in engraved cage rod</w:t>
-            </w:r>
-            <w:r>
               <w:rPr>
+                <w:rFonts w:cs="Arial"/>
+                <w:sz w:val="22"/>
+              </w:rPr>
+              <w:t>ER1-P4  |  1 in cage rod, pack of 4</w:t>
+            </w:r>
+            <w:r>
+              <w:rPr>
+                <w:rFonts w:cs="Arial"/>
+                <w:sz w:val="22"/>
+              </w:rPr>
+              <w:br/>
+            </w:r>
+            <w:r>
+              <w:rPr>
+                <w:rFonts w:cs="Arial"/>
                 <w:color w:val="4A4A4A"/>
                 <w:sz w:val="18"/>
               </w:rPr>
-              <w:br/>
-            </w:r>
-            <w:r>
-              <w:rPr>
-                <w:color w:val="4A4A4A"/>
-                <w:sz w:val="18"/>
-              </w:rPr>
-              <w:t>152.4 mm; 4 rods per beam</w:t>
+              <w:t>25.4 mm extensions for 8 ER6E rods; join using supplied 4-40 end studs</w:t>
             </w:r>
           </w:p>
         </w:tc>
@@ -3089,12 +2966,10 @@
               <w:spacing w:after="0"/>
               <w:jc w:val="center"/>
             </w:pPr>
-            <w:hyperlink r:id="rId32">
+            <w:hyperlink r:id="rId32" w:history="1">
               <w:r>
                 <w:rPr>
-                  <w:color w:val="17588B"/>
-                  <w:sz w:val="20"/>
-                  <w:u w:val="single"/>
+                  <w:rStyle w:val="aff9"/>
                 </w:rPr>
                 <w:t>Thorlabs</w:t>
               </w:r>
@@ -3112,7 +2987,11 @@
               <w:jc w:val="center"/>
             </w:pPr>
             <w:r>
-              <w:t>8</w:t>
+              <w:t>8 rods</w:t>
+            </w:r>
+            <w:r>
+              <w:br/>
+              <w:t>2 × 4 pack</w:t>
             </w:r>
           </w:p>
         </w:tc>
@@ -3132,15 +3011,7 @@
               <w:spacing w:after="0" w:line="240" w:lineRule="auto"/>
             </w:pPr>
             <w:r>
-              <w:t>ER1.</w:t>
-            </w:r>
-            <w:proofErr w:type="gramStart"/>
-            <w:r>
-              <w:t>5  |</w:t>
-            </w:r>
-            <w:proofErr w:type="gramEnd"/>
-            <w:r>
-              <w:t xml:space="preserve">  1.5 in cage rod</w:t>
+              <w:t>ER1.5  |  1.5 in cage rod</w:t>
             </w:r>
             <w:r>
               <w:br/>
@@ -3201,15 +3072,7 @@
               <w:spacing w:after="0" w:line="240" w:lineRule="auto"/>
             </w:pPr>
             <w:r>
-              <w:t>LCP</w:t>
-            </w:r>
-            <w:proofErr w:type="gramStart"/>
-            <w:r>
-              <w:t>33  |</w:t>
-            </w:r>
-            <w:proofErr w:type="gramEnd"/>
-            <w:r>
-              <w:t xml:space="preserve">  30 mm to 60 mm cage plate</w:t>
+              <w:t>LCP33  |  30 mm to 60 mm cage plate</w:t>
             </w:r>
           </w:p>
         </w:tc>
@@ -3268,108 +3131,8 @@
             <w:r>
               <w:t>CCM1-E03</w:t>
             </w:r>
-            <w:proofErr w:type="gramStart"/>
-            <w:r>
-              <w:t xml:space="preserve">  |</w:t>
-            </w:r>
-            <w:proofErr w:type="gramEnd"/>
-            <w:r>
-              <w:t xml:space="preserve">  fixed 45° cage mirror</w:t>
-            </w:r>
-          </w:p>
-        </w:tc>
-        <w:tc>
-          <w:tcPr>
-            <w:tcW w:w="2608" w:type="dxa"/>
-            <w:vAlign w:val="center"/>
-          </w:tcPr>
-          <w:p>
-            <w:pPr>
-              <w:spacing w:after="0"/>
-              <w:jc w:val="center"/>
-            </w:pPr>
-            <w:r>
-              <w:fldChar w:fldCharType="begin"/>
-            </w:r>
-            <w:r>
-              <w:instrText xml:space="preserve">HYPERLINK "https://www.thorlabs.com/item/CCM1-E03" \h </w:instrText>
-            </w:r>
-            <w:r>
-              <w:fldChar w:fldCharType="separate"/>
-            </w:r>
-            <w:r>
-              <w:rPr>
-                <w:color w:val="17588B"/>
-                <w:sz w:val="20"/>
-                <w:u w:val="single"/>
-              </w:rPr>
-              <w:t>Thorlabs</w:t>
-            </w:r>
-            <w:r>
-              <w:fldChar w:fldCharType="end"/>
-            </w:r>
-          </w:p>
-        </w:tc>
-        <w:tc>
-          <w:tcPr>
-            <w:tcW w:w="1531" w:type="dxa"/>
-            <w:vAlign w:val="center"/>
-          </w:tcPr>
-          <w:p>
-            <w:pPr>
-              <w:spacing w:after="0" w:line="240" w:lineRule="auto"/>
-              <w:jc w:val="center"/>
-            </w:pPr>
-            <w:r>
-              <w:t>1</w:t>
-            </w:r>
-          </w:p>
-        </w:tc>
-      </w:tr>
-      <w:tr>
-        <w:trPr>
-          <w:cantSplit/>
-          <w:jc w:val="center"/>
-        </w:trPr>
-        <w:tc>
-          <w:tcPr>
-            <w:tcW w:w="5953" w:type="dxa"/>
-            <w:vAlign w:val="center"/>
-          </w:tcPr>
-          <w:p>
-            <w:pPr>
-              <w:spacing w:after="0" w:line="240" w:lineRule="auto"/>
-            </w:pPr>
-            <w:r>
-              <w:rPr>
-                <w:color w:val="4A4A4A"/>
-                <w:sz w:val="18"/>
-              </w:rPr>
-              <w:t>RS2P8</w:t>
-            </w:r>
-            <w:proofErr w:type="gramStart"/>
-            <w:r>
-              <w:rPr>
-                <w:color w:val="4A4A4A"/>
-                <w:sz w:val="18"/>
-              </w:rPr>
-              <w:t>E  |</w:t>
-            </w:r>
-            <w:proofErr w:type="gramEnd"/>
-            <w:r>
-              <w:rPr>
-                <w:color w:val="4A4A4A"/>
-                <w:sz w:val="18"/>
-              </w:rPr>
-              <w:t xml:space="preserve">  Ø1 in fixed pedestal post</w:t>
-            </w:r>
-            <w:r>
-              <w:rPr>
-                <w:color w:val="4A4A4A"/>
-                <w:sz w:val="18"/>
-              </w:rPr>
-              <w:br/>
-              <w:t>2 in nominal height; 8-32 tapped ends; 4 telescope + 4 mirror supports</w:t>
+            <w:r>
+              <w:t xml:space="preserve">  |  fixed 45° cage mirror</w:t>
             </w:r>
           </w:p>
         </w:tc>
@@ -3406,7 +3169,7 @@
               <w:jc w:val="center"/>
             </w:pPr>
             <w:r>
-              <w:t>8</w:t>
+              <w:t>1</w:t>
             </w:r>
           </w:p>
         </w:tc>
@@ -3426,15 +3189,11 @@
               <w:spacing w:after="0" w:line="240" w:lineRule="auto"/>
             </w:pPr>
             <w:r>
-              <w:t>RS5</w:t>
-            </w:r>
-            <w:proofErr w:type="gramStart"/>
-            <w:r>
-              <w:t>M  |</w:t>
-            </w:r>
-            <w:proofErr w:type="gramEnd"/>
-            <w:r>
-              <w:t xml:space="preserve">  Ø25 mm post spacer</w:t>
+              <w:rPr>
+                <w:color w:val="4A4A4A"/>
+                <w:sz w:val="18"/>
+              </w:rPr>
+              <w:t>RS2P8E  |  Ø1 in fixed pedestal post</w:t>
             </w:r>
             <w:r>
               <w:rPr>
@@ -3442,7 +3201,7 @@
                 <w:sz w:val="18"/>
               </w:rPr>
               <w:br/>
-              <w:t>5 mm thick; A1 and B1 steering supports</w:t>
+              <w:t>2 in nominal height; 8-32 tapped ends; 4 telescope + 4 mirror supports</w:t>
             </w:r>
           </w:p>
         </w:tc>
@@ -3463,23 +3222,7 @@
                   <w:sz w:val="20"/>
                   <w:u w:val="single"/>
                 </w:rPr>
-                <w:t>T</w:t>
-              </w:r>
-              <w:r>
-                <w:rPr>
-                  <w:color w:val="17588B"/>
-                  <w:sz w:val="20"/>
-                  <w:u w:val="single"/>
-                </w:rPr>
-                <w:t>h</w:t>
-              </w:r>
-              <w:r>
-                <w:rPr>
-                  <w:color w:val="17588B"/>
-                  <w:sz w:val="20"/>
-                  <w:u w:val="single"/>
-                </w:rPr>
-                <w:t>orlabs</w:t>
+                <w:t>Thorlabs</w:t>
               </w:r>
             </w:hyperlink>
           </w:p>
@@ -3495,7 +3238,7 @@
               <w:jc w:val="center"/>
             </w:pPr>
             <w:r>
-              <w:t>2</w:t>
+              <w:t>8</w:t>
             </w:r>
           </w:p>
         </w:tc>
@@ -3515,15 +3258,7 @@
               <w:spacing w:after="0" w:line="240" w:lineRule="auto"/>
             </w:pPr>
             <w:r>
-              <w:t>RS4</w:t>
-            </w:r>
-            <w:proofErr w:type="gramStart"/>
-            <w:r>
-              <w:t>M  |</w:t>
-            </w:r>
-            <w:proofErr w:type="gramEnd"/>
-            <w:r>
-              <w:t xml:space="preserve">  Ø25 mm post spacer</w:t>
+              <w:t>RS5M  |  Ø25 mm post spacer</w:t>
             </w:r>
             <w:r>
               <w:rPr>
@@ -3531,7 +3266,7 @@
                 <w:sz w:val="18"/>
               </w:rPr>
               <w:br/>
-              <w:t>4 mm thick; A2 steering support (lowers A2 1 mm to clear beam B)</w:t>
+              <w:t>5 mm thick; A1 and B1 steering supports</w:t>
             </w:r>
           </w:p>
         </w:tc>
@@ -3568,7 +3303,7 @@
               <w:jc w:val="center"/>
             </w:pPr>
             <w:r>
-              <w:t>1</w:t>
+              <w:t>2</w:t>
             </w:r>
           </w:p>
         </w:tc>
@@ -3588,15 +3323,72 @@
               <w:spacing w:after="0" w:line="240" w:lineRule="auto"/>
             </w:pPr>
             <w:r>
-              <w:t>PS-F-1.</w:t>
-            </w:r>
-            <w:proofErr w:type="gramStart"/>
-            <w:r>
-              <w:t>0  |</w:t>
-            </w:r>
-            <w:proofErr w:type="gramEnd"/>
-            <w:r>
-              <w:t xml:space="preserve">  pedestal clamping fork</w:t>
+              <w:t>RS4M  |  Ø25 mm post spacer</w:t>
+            </w:r>
+            <w:r>
+              <w:rPr>
+                <w:color w:val="4A4A4A"/>
+                <w:sz w:val="18"/>
+              </w:rPr>
+              <w:br/>
+              <w:t>4 mm thick; A2 steering support (lowers A2 1 mm to clear beam B)</w:t>
+            </w:r>
+          </w:p>
+        </w:tc>
+        <w:tc>
+          <w:tcPr>
+            <w:tcW w:w="2608" w:type="dxa"/>
+            <w:vAlign w:val="center"/>
+          </w:tcPr>
+          <w:p>
+            <w:pPr>
+              <w:spacing w:after="0"/>
+              <w:jc w:val="center"/>
+            </w:pPr>
+            <w:hyperlink r:id="rId38">
+              <w:r>
+                <w:rPr>
+                  <w:color w:val="17588B"/>
+                  <w:sz w:val="20"/>
+                  <w:u w:val="single"/>
+                </w:rPr>
+                <w:t>Thorlabs</w:t>
+              </w:r>
+            </w:hyperlink>
+          </w:p>
+        </w:tc>
+        <w:tc>
+          <w:tcPr>
+            <w:tcW w:w="1531" w:type="dxa"/>
+            <w:vAlign w:val="center"/>
+          </w:tcPr>
+          <w:p>
+            <w:pPr>
+              <w:spacing w:after="0" w:line="240" w:lineRule="auto"/>
+              <w:jc w:val="center"/>
+            </w:pPr>
+            <w:r>
+              <w:t>1</w:t>
+            </w:r>
+          </w:p>
+        </w:tc>
+      </w:tr>
+      <w:tr>
+        <w:trPr>
+          <w:cantSplit/>
+          <w:jc w:val="center"/>
+        </w:trPr>
+        <w:tc>
+          <w:tcPr>
+            <w:tcW w:w="5953" w:type="dxa"/>
+            <w:vAlign w:val="center"/>
+          </w:tcPr>
+          <w:p>
+            <w:pPr>
+              <w:spacing w:after="0" w:line="240" w:lineRule="auto"/>
+            </w:pPr>
+            <w:r>
+              <w:t>PS-F-1.0  |  pedestal clamping fork</w:t>
             </w:r>
             <w:r>
               <w:rPr>
@@ -3618,7 +3410,7 @@
               <w:spacing w:after="0"/>
               <w:jc w:val="center"/>
             </w:pPr>
-            <w:hyperlink r:id="rId38">
+            <w:hyperlink r:id="rId39">
               <w:r>
                 <w:rPr>
                   <w:color w:val="17588B"/>
@@ -3661,15 +3453,7 @@
               <w:spacing w:after="0" w:line="240" w:lineRule="auto"/>
             </w:pPr>
             <w:r>
-              <w:t>MB</w:t>
-            </w:r>
-            <w:proofErr w:type="gramStart"/>
-            <w:r>
-              <w:t>1224  |</w:t>
-            </w:r>
-            <w:proofErr w:type="gramEnd"/>
-            <w:r>
-              <w:t xml:space="preserve">  24 × 12 × ½ in breadboard</w:t>
+              <w:t>MB1224  |  24 × 12 × ½ in breadboard</w:t>
             </w:r>
             <w:r>
               <w:rPr>
@@ -3678,71 +3462,6 @@
               </w:rPr>
               <w:br/>
               <w:t>609.6 × 304.8 × 12.7 mm; 1/4-20 grid</w:t>
-            </w:r>
-          </w:p>
-        </w:tc>
-        <w:tc>
-          <w:tcPr>
-            <w:tcW w:w="2608" w:type="dxa"/>
-            <w:vAlign w:val="center"/>
-          </w:tcPr>
-          <w:p>
-            <w:pPr>
-              <w:spacing w:after="0"/>
-              <w:jc w:val="center"/>
-            </w:pPr>
-            <w:hyperlink r:id="rId39">
-              <w:r>
-                <w:rPr>
-                  <w:color w:val="17588B"/>
-                  <w:sz w:val="20"/>
-                  <w:u w:val="single"/>
-                </w:rPr>
-                <w:t>Thorlabs</w:t>
-              </w:r>
-            </w:hyperlink>
-          </w:p>
-        </w:tc>
-        <w:tc>
-          <w:tcPr>
-            <w:tcW w:w="1531" w:type="dxa"/>
-            <w:vAlign w:val="center"/>
-          </w:tcPr>
-          <w:p>
-            <w:pPr>
-              <w:spacing w:after="0" w:line="240" w:lineRule="auto"/>
-              <w:jc w:val="center"/>
-            </w:pPr>
-            <w:r>
-              <w:t>1</w:t>
-            </w:r>
-          </w:p>
-        </w:tc>
-      </w:tr>
-      <w:tr>
-        <w:trPr>
-          <w:cantSplit/>
-          <w:jc w:val="center"/>
-        </w:trPr>
-        <w:tc>
-          <w:tcPr>
-            <w:tcW w:w="5953" w:type="dxa"/>
-            <w:vAlign w:val="center"/>
-          </w:tcPr>
-          <w:p>
-            <w:pPr>
-              <w:spacing w:after="0" w:line="240" w:lineRule="auto"/>
-            </w:pPr>
-            <w:r>
-              <w:t>MRA12-E</w:t>
-            </w:r>
-            <w:proofErr w:type="gramStart"/>
-            <w:r>
-              <w:t>03  |</w:t>
-            </w:r>
-            <w:proofErr w:type="gramEnd"/>
-            <w:r>
-              <w:t xml:space="preserve">  internal right-angle prism mirror</w:t>
             </w:r>
           </w:p>
         </w:tc>
@@ -3779,7 +3498,7 @@
               <w:jc w:val="center"/>
             </w:pPr>
             <w:r>
-              <w:t>2</w:t>
+              <w:t>1</w:t>
             </w:r>
           </w:p>
         </w:tc>
@@ -3799,21 +3518,7 @@
               <w:spacing w:after="0" w:line="240" w:lineRule="auto"/>
             </w:pPr>
             <w:r>
-              <w:t>HRS</w:t>
-            </w:r>
-            <w:r>
-              <w:t>1</w:t>
-            </w:r>
-            <w:r>
-              <w:t>015-</w:t>
-            </w:r>
-            <w:proofErr w:type="gramStart"/>
-            <w:r>
-              <w:t>AG  |</w:t>
-            </w:r>
-            <w:proofErr w:type="gramEnd"/>
-            <w:r>
-              <w:t xml:space="preserve">  internal hollow roof mirror</w:t>
+              <w:t>MRA12-E03  |  internal right-angle prism mirror</w:t>
             </w:r>
           </w:p>
         </w:tc>
@@ -3828,6 +3533,69 @@
               <w:jc w:val="center"/>
             </w:pPr>
             <w:hyperlink r:id="rId41">
+              <w:r>
+                <w:rPr>
+                  <w:color w:val="17588B"/>
+                  <w:sz w:val="20"/>
+                  <w:u w:val="single"/>
+                </w:rPr>
+                <w:t>Thorlabs</w:t>
+              </w:r>
+            </w:hyperlink>
+          </w:p>
+        </w:tc>
+        <w:tc>
+          <w:tcPr>
+            <w:tcW w:w="1531" w:type="dxa"/>
+            <w:vAlign w:val="center"/>
+          </w:tcPr>
+          <w:p>
+            <w:pPr>
+              <w:spacing w:after="0" w:line="240" w:lineRule="auto"/>
+              <w:jc w:val="center"/>
+            </w:pPr>
+            <w:r>
+              <w:t>2</w:t>
+            </w:r>
+          </w:p>
+        </w:tc>
+      </w:tr>
+      <w:tr>
+        <w:trPr>
+          <w:cantSplit/>
+          <w:jc w:val="center"/>
+        </w:trPr>
+        <w:tc>
+          <w:tcPr>
+            <w:tcW w:w="5953" w:type="dxa"/>
+            <w:vAlign w:val="center"/>
+          </w:tcPr>
+          <w:p>
+            <w:pPr>
+              <w:spacing w:after="0" w:line="240" w:lineRule="auto"/>
+            </w:pPr>
+            <w:r>
+              <w:t>HRS</w:t>
+            </w:r>
+            <w:r>
+              <w:t>1</w:t>
+            </w:r>
+            <w:r>
+              <w:t>015-AG  |  internal hollow roof mirror</w:t>
+            </w:r>
+          </w:p>
+        </w:tc>
+        <w:tc>
+          <w:tcPr>
+            <w:tcW w:w="2608" w:type="dxa"/>
+            <w:vAlign w:val="center"/>
+          </w:tcPr>
+          <w:p>
+            <w:pPr>
+              <w:spacing w:after="0"/>
+              <w:jc w:val="center"/>
+            </w:pPr>
+            <w:hyperlink r:id="rId42">
               <w:r>
                 <w:rPr>
                   <w:color w:val="17588B"/>
@@ -4008,7 +3776,7 @@
               <w:spacing w:after="0" w:line="240" w:lineRule="auto"/>
               <w:jc w:val="center"/>
             </w:pPr>
-            <w:hyperlink r:id="rId42">
+            <w:hyperlink r:id="rId43">
               <w:r>
                 <w:rPr>
                   <w:color w:val="17588B"/>
@@ -4021,7 +3789,7 @@
             <w:r>
               <w:t xml:space="preserve">  |  </w:t>
             </w:r>
-            <w:hyperlink r:id="rId43">
+            <w:hyperlink r:id="rId44">
               <w:r>
                 <w:rPr>
                   <w:color w:val="17588B"/>
@@ -4078,7 +3846,7 @@
               <w:spacing w:after="0" w:line="240" w:lineRule="auto"/>
               <w:jc w:val="center"/>
             </w:pPr>
-            <w:hyperlink r:id="rId44">
+            <w:hyperlink r:id="rId45">
               <w:r>
                 <w:rPr>
                   <w:color w:val="17588B"/>
@@ -4091,7 +3859,7 @@
             <w:r>
               <w:t xml:space="preserve">  |  </w:t>
             </w:r>
-            <w:hyperlink r:id="rId45">
+            <w:hyperlink r:id="rId46">
               <w:r>
                 <w:rPr>
                   <w:color w:val="17588B"/>
@@ -4148,7 +3916,7 @@
               <w:spacing w:after="0" w:line="240" w:lineRule="auto"/>
               <w:jc w:val="center"/>
             </w:pPr>
-            <w:hyperlink r:id="rId46">
+            <w:hyperlink r:id="rId47">
               <w:r>
                 <w:rPr>
                   <w:color w:val="17588B"/>
@@ -4161,7 +3929,7 @@
             <w:r>
               <w:t xml:space="preserve">  |  </w:t>
             </w:r>
-            <w:hyperlink r:id="rId47">
+            <w:hyperlink r:id="rId48">
               <w:r>
                 <w:rPr>
                   <w:color w:val="17588B"/>
@@ -4218,7 +3986,7 @@
               <w:spacing w:after="0" w:line="240" w:lineRule="auto"/>
               <w:jc w:val="center"/>
             </w:pPr>
-            <w:hyperlink r:id="rId48">
+            <w:hyperlink r:id="rId49">
               <w:r>
                 <w:rPr>
                   <w:color w:val="17588B"/>
@@ -4231,7 +3999,7 @@
             <w:r>
               <w:t xml:space="preserve">  |  </w:t>
             </w:r>
-            <w:hyperlink r:id="rId49">
+            <w:hyperlink r:id="rId50">
               <w:r>
                 <w:rPr>
                   <w:color w:val="17588B"/>
@@ -4288,7 +4056,7 @@
               <w:spacing w:after="0" w:line="240" w:lineRule="auto"/>
               <w:jc w:val="center"/>
             </w:pPr>
-            <w:hyperlink r:id="rId50">
+            <w:hyperlink r:id="rId51">
               <w:r>
                 <w:rPr>
                   <w:color w:val="17588B"/>
@@ -4301,7 +4069,7 @@
             <w:r>
               <w:t xml:space="preserve">  |  </w:t>
             </w:r>
-            <w:hyperlink r:id="rId51">
+            <w:hyperlink r:id="rId52">
               <w:r>
                 <w:rPr>
                   <w:color w:val="17588B"/>
@@ -4366,7 +4134,7 @@
               <w:spacing w:after="0" w:line="240" w:lineRule="auto"/>
               <w:jc w:val="center"/>
             </w:pPr>
-            <w:hyperlink r:id="rId52">
+            <w:hyperlink r:id="rId53">
               <w:r>
                 <w:rPr>
                   <w:color w:val="17588B"/>
@@ -4379,7 +4147,7 @@
             <w:r>
               <w:t xml:space="preserve">  |  </w:t>
             </w:r>
-            <w:hyperlink r:id="rId53">
+            <w:hyperlink r:id="rId54">
               <w:r>
                 <w:rPr>
                   <w:color w:val="17588B"/>
@@ -4444,7 +4212,7 @@
               <w:spacing w:after="0" w:line="240" w:lineRule="auto"/>
               <w:jc w:val="center"/>
             </w:pPr>
-            <w:hyperlink r:id="rId54">
+            <w:hyperlink r:id="rId55">
               <w:r>
                 <w:rPr>
                   <w:color w:val="17588B"/>
@@ -4457,7 +4225,7 @@
             <w:r>
               <w:t xml:space="preserve">  |  </w:t>
             </w:r>
-            <w:hyperlink r:id="rId55">
+            <w:hyperlink r:id="rId56">
               <w:r>
                 <w:rPr>
                   <w:color w:val="17588B"/>
@@ -4522,7 +4290,7 @@
               <w:spacing w:after="0" w:line="240" w:lineRule="auto"/>
               <w:jc w:val="center"/>
             </w:pPr>
-            <w:hyperlink r:id="rId56">
+            <w:hyperlink r:id="rId57">
               <w:r>
                 <w:rPr>
                   <w:color w:val="17588B"/>
@@ -4535,7 +4303,7 @@
             <w:r>
               <w:t xml:space="preserve">  |  </w:t>
             </w:r>
-            <w:hyperlink r:id="rId57">
+            <w:hyperlink r:id="rId58">
               <w:r>
                 <w:rPr>
                   <w:color w:val="17588B"/>
@@ -4586,12 +4354,6 @@
                 <w:sz w:val="18"/>
               </w:rPr>
               <w:br/>
-            </w:r>
-            <w:r>
-              <w:rPr>
-                <w:color w:val="4A4A4A"/>
-                <w:sz w:val="18"/>
-              </w:rPr>
               <w:t>0.30 mm flat sheet; no pre-bending</w:t>
             </w:r>
           </w:p>
@@ -4606,7 +4368,7 @@
               <w:spacing w:after="0" w:line="240" w:lineRule="auto"/>
               <w:jc w:val="center"/>
             </w:pPr>
-            <w:hyperlink r:id="rId58">
+            <w:hyperlink r:id="rId59">
               <w:r>
                 <w:rPr>
                   <w:color w:val="17588B"/>
@@ -4619,7 +4381,7 @@
             <w:r>
               <w:t xml:space="preserve">  |  </w:t>
             </w:r>
-            <w:hyperlink r:id="rId59">
+            <w:hyperlink r:id="rId60">
               <w:r>
                 <w:rPr>
                   <w:color w:val="17588B"/>
@@ -4765,167 +4527,88 @@
               <w:spacing w:after="0" w:line="240" w:lineRule="auto"/>
             </w:pPr>
             <w:r>
-              <w:t>91292A</w:t>
-            </w:r>
-            <w:proofErr w:type="gramStart"/>
-            <w:r>
-              <w:t>132  |</w:t>
-            </w:r>
-            <w:proofErr w:type="gramEnd"/>
-            <w:r>
-              <w:t xml:space="preserve">  M4 × 40 mm socket head</w:t>
-            </w:r>
-            <w:r>
               <w:rPr>
+                <w:rFonts w:cs="Arial" w:hint="eastAsia"/>
+                <w:sz w:val="22"/>
+              </w:rPr>
+              <w:t xml:space="preserve">91292A132  |  M4 </w:t>
+            </w:r>
+            <w:r>
+              <w:rPr>
+                <w:rFonts w:cs="Arial" w:hint="eastAsia"/>
+                <w:sz w:val="22"/>
+              </w:rPr>
+              <w:t>×</w:t>
+            </w:r>
+            <w:r>
+              <w:rPr>
+                <w:rFonts w:cs="Arial" w:hint="eastAsia"/>
+                <w:sz w:val="22"/>
+              </w:rPr>
+              <w:t xml:space="preserve"> 40 mm socket head</w:t>
+            </w:r>
+            <w:r>
+              <w:rPr>
+                <w:rFonts w:cs="Arial" w:hint="eastAsia"/>
+                <w:sz w:val="22"/>
+              </w:rPr>
+              <w:br/>
+            </w:r>
+            <w:r>
+              <w:rPr>
+                <w:rFonts w:cs="Arial" w:hint="eastAsia"/>
                 <w:color w:val="4A4A4A"/>
                 <w:sz w:val="18"/>
               </w:rPr>
-              <w:br/>
-              <w:t>18-8 stainless; finish to MRA12 32.5 mm × 2 and HRS1015 38.5 mm × 2; retain ≥ 6 mm usable thread</w:t>
-            </w:r>
-          </w:p>
-        </w:tc>
-        <w:tc>
-          <w:tcPr>
-            <w:tcW w:w="2608" w:type="dxa"/>
-            <w:vAlign w:val="center"/>
-          </w:tcPr>
-          <w:p>
-            <w:pPr>
-              <w:spacing w:after="0" w:line="240" w:lineRule="auto"/>
-              <w:jc w:val="center"/>
-            </w:pPr>
-            <w:hyperlink r:id="rId60">
-              <w:r>
-                <w:rPr>
-                  <w:color w:val="17588B"/>
-                  <w:sz w:val="20"/>
-                  <w:u w:val="single"/>
-                </w:rPr>
-                <w:t>McMaster</w:t>
-              </w:r>
-            </w:hyperlink>
-          </w:p>
-        </w:tc>
-        <w:tc>
-          <w:tcPr>
-            <w:tcW w:w="1531" w:type="dxa"/>
-            <w:vAlign w:val="center"/>
-          </w:tcPr>
-          <w:p>
-            <w:pPr>
-              <w:spacing w:after="0" w:line="240" w:lineRule="auto"/>
-              <w:jc w:val="center"/>
-            </w:pPr>
-            <w:r>
-              <w:t>4 pcs</w:t>
-            </w:r>
-            <w:r>
-              <w:br/>
-              <w:t>1 × 50 pack</w:t>
-            </w:r>
-          </w:p>
-        </w:tc>
-      </w:tr>
-      <w:tr>
-        <w:trPr>
-          <w:cantSplit/>
-          <w:jc w:val="center"/>
-        </w:trPr>
-        <w:tc>
-          <w:tcPr>
-            <w:tcW w:w="5953" w:type="dxa"/>
-            <w:vAlign w:val="center"/>
-          </w:tcPr>
-          <w:p>
-            <w:pPr>
-              <w:spacing w:after="0" w:line="240" w:lineRule="auto"/>
-            </w:pPr>
-            <w:r>
-              <w:t>SH4S</w:t>
-            </w:r>
-            <w:proofErr w:type="gramStart"/>
-            <w:r>
-              <w:t>025  |</w:t>
-            </w:r>
-            <w:proofErr w:type="gramEnd"/>
-            <w:r>
-              <w:t xml:space="preserve">  4-40 × ¼ in</w:t>
+              <w:t xml:space="preserve">18-8 stainless; finish to MRA12 32.0 mm </w:t>
             </w:r>
             <w:r>
               <w:rPr>
+                <w:rFonts w:cs="Arial" w:hint="eastAsia"/>
                 <w:color w:val="4A4A4A"/>
                 <w:sz w:val="18"/>
               </w:rPr>
-              <w:br/>
-              <w:t>Thin retainer screws; direct tapped holes, no Helicoil</w:t>
-            </w:r>
-          </w:p>
-        </w:tc>
-        <w:tc>
-          <w:tcPr>
-            <w:tcW w:w="2608" w:type="dxa"/>
-            <w:vAlign w:val="center"/>
-          </w:tcPr>
-          <w:p>
-            <w:pPr>
-              <w:spacing w:after="0" w:line="240" w:lineRule="auto"/>
-              <w:jc w:val="center"/>
-            </w:pPr>
-          </w:p>
-        </w:tc>
-        <w:tc>
-          <w:tcPr>
-            <w:tcW w:w="1531" w:type="dxa"/>
-            <w:vAlign w:val="center"/>
-          </w:tcPr>
-          <w:p>
-            <w:pPr>
-              <w:spacing w:after="0" w:line="240" w:lineRule="auto"/>
-              <w:jc w:val="center"/>
-            </w:pPr>
-            <w:r>
-              <w:t>4 pcs</w:t>
-            </w:r>
-            <w:r>
-              <w:br/>
-              <w:t>1 × 50 pack</w:t>
-            </w:r>
-          </w:p>
-        </w:tc>
-      </w:tr>
-      <w:tr>
-        <w:trPr>
-          <w:cantSplit/>
-          <w:jc w:val="center"/>
-        </w:trPr>
-        <w:tc>
-          <w:tcPr>
-            <w:tcW w:w="5953" w:type="dxa"/>
-            <w:vAlign w:val="center"/>
-          </w:tcPr>
-          <w:p>
-            <w:pPr>
-              <w:spacing w:after="0" w:line="240" w:lineRule="auto"/>
-            </w:pPr>
-            <w:r>
-              <w:t>97125K</w:t>
-            </w:r>
-            <w:proofErr w:type="gramStart"/>
-            <w:r>
-              <w:t>111  |</w:t>
-            </w:r>
-            <w:proofErr w:type="gramEnd"/>
-            <w:r>
-              <w:t xml:space="preserve">  718 nickel alloy Belleville</w:t>
+              <w:t>×</w:t>
             </w:r>
             <w:r>
               <w:rPr>
+                <w:rFonts w:cs="Arial" w:hint="eastAsia"/>
                 <w:color w:val="4A4A4A"/>
                 <w:sz w:val="18"/>
               </w:rPr>
-              <w:br/>
-              <w:t>For 4-40; OD 7.1374 / ID 3.6068 / t 0.5334 / H 0.8382 mm</w:t>
+              <w:t xml:space="preserve"> 2 and HRS1015 38.0 mm </w:t>
+            </w:r>
+            <w:r>
+              <w:rPr>
+                <w:rFonts w:cs="Arial" w:hint="eastAsia"/>
+                <w:color w:val="4A4A4A"/>
+                <w:sz w:val="18"/>
+              </w:rPr>
+              <w:t>×</w:t>
+            </w:r>
+            <w:r>
+              <w:rPr>
+                <w:rFonts w:cs="Arial" w:hint="eastAsia"/>
+                <w:color w:val="4A4A4A"/>
+                <w:sz w:val="18"/>
+              </w:rPr>
+              <w:t xml:space="preserve"> 2; retain </w:t>
+            </w:r>
+            <w:r>
+              <w:rPr>
+                <w:rFonts w:cs="Arial" w:hint="eastAsia"/>
+                <w:color w:val="4A4A4A"/>
+                <w:sz w:val="18"/>
+              </w:rPr>
+              <w:t>≥</w:t>
+            </w:r>
+            <w:r>
+              <w:rPr>
+                <w:rFonts w:cs="Arial" w:hint="eastAsia"/>
+                <w:color w:val="4A4A4A"/>
+                <w:sz w:val="18"/>
+              </w:rPr>
+              <w:t xml:space="preserve"> 6 mm usable thread</w:t>
             </w:r>
           </w:p>
         </w:tc>
@@ -4962,7 +4645,11 @@
               <w:jc w:val="center"/>
             </w:pPr>
             <w:r>
-              <w:t>4</w:t>
+              <w:t>4 pcs</w:t>
+            </w:r>
+            <w:r>
+              <w:br/>
+              <w:t>1 × 50 pack</w:t>
             </w:r>
           </w:p>
         </w:tc>
@@ -4982,15 +4669,7 @@
               <w:spacing w:after="0" w:line="240" w:lineRule="auto"/>
             </w:pPr>
             <w:r>
-              <w:t>93237A</w:t>
-            </w:r>
-            <w:proofErr w:type="gramStart"/>
-            <w:r>
-              <w:t>103  |</w:t>
-            </w:r>
-            <w:proofErr w:type="gramEnd"/>
-            <w:r>
-              <w:t xml:space="preserve">  M4 Belleville</w:t>
+              <w:t>SH4S025  |  4-40 × ¼ in</w:t>
             </w:r>
             <w:r>
               <w:rPr>
@@ -4998,7 +4677,66 @@
                 <w:sz w:val="18"/>
               </w:rPr>
               <w:br/>
-              <w:t>316 stainless; OD 9 / ID 4.3 / t 1.0 / H 1.30 mm</w:t>
+              <w:t>Thin retainer screws; direct tapped holes, no Helicoil</w:t>
+            </w:r>
+          </w:p>
+        </w:tc>
+        <w:tc>
+          <w:tcPr>
+            <w:tcW w:w="2608" w:type="dxa"/>
+            <w:vAlign w:val="center"/>
+          </w:tcPr>
+          <w:p>
+            <w:pPr>
+              <w:spacing w:after="0" w:line="240" w:lineRule="auto"/>
+              <w:jc w:val="center"/>
+            </w:pPr>
+          </w:p>
+        </w:tc>
+        <w:tc>
+          <w:tcPr>
+            <w:tcW w:w="1531" w:type="dxa"/>
+            <w:vAlign w:val="center"/>
+          </w:tcPr>
+          <w:p>
+            <w:pPr>
+              <w:spacing w:after="0" w:line="240" w:lineRule="auto"/>
+              <w:jc w:val="center"/>
+            </w:pPr>
+            <w:r>
+              <w:t>4 pcs</w:t>
+            </w:r>
+            <w:r>
+              <w:br/>
+              <w:t>1 × 50 pack</w:t>
+            </w:r>
+          </w:p>
+        </w:tc>
+      </w:tr>
+      <w:tr>
+        <w:trPr>
+          <w:cantSplit/>
+          <w:jc w:val="center"/>
+        </w:trPr>
+        <w:tc>
+          <w:tcPr>
+            <w:tcW w:w="5953" w:type="dxa"/>
+            <w:vAlign w:val="center"/>
+          </w:tcPr>
+          <w:p>
+            <w:pPr>
+              <w:spacing w:after="0" w:line="240" w:lineRule="auto"/>
+            </w:pPr>
+            <w:r>
+              <w:t>97125K111  |  718 nickel alloy Belleville</w:t>
+            </w:r>
+            <w:r>
+              <w:rPr>
+                <w:color w:val="4A4A4A"/>
+                <w:sz w:val="18"/>
+              </w:rPr>
+              <w:br/>
+              <w:t>For 4-40; OD 7.1374 / ID 3.6068 / t 0.5334 / H 0.8382 mm</w:t>
             </w:r>
           </w:p>
         </w:tc>
@@ -5035,11 +4773,87 @@
               <w:jc w:val="center"/>
             </w:pPr>
             <w:r>
+              <w:t>4</w:t>
+            </w:r>
+          </w:p>
+        </w:tc>
+      </w:tr>
+      <w:tr>
+        <w:trPr>
+          <w:cantSplit/>
+          <w:jc w:val="center"/>
+        </w:trPr>
+        <w:tc>
+          <w:tcPr>
+            <w:tcW w:w="5953" w:type="dxa"/>
+            <w:vAlign w:val="center"/>
+          </w:tcPr>
+          <w:p>
+            <w:pPr>
+              <w:spacing w:after="0" w:line="240" w:lineRule="auto"/>
+            </w:pPr>
+            <w:r>
+              <w:rPr>
+                <w:rFonts w:cs="Arial"/>
+                <w:sz w:val="22"/>
+              </w:rPr>
+              <w:t>9713K59  |  conical disc spring for M4</w:t>
+            </w:r>
+            <w:r>
+              <w:rPr>
+                <w:rFonts w:cs="Arial"/>
+                <w:sz w:val="22"/>
+              </w:rPr>
+              <w:br/>
+            </w:r>
+            <w:r>
+              <w:rPr>
+                <w:rFonts w:cs="Arial"/>
+                <w:color w:val="4A4A4A"/>
+                <w:sz w:val="18"/>
+              </w:rPr>
+              <w:t>302 stainless; OD 9.525 / ID 4.826 / t 0.508 / H 0.762 mm</w:t>
+            </w:r>
+          </w:p>
+        </w:tc>
+        <w:tc>
+          <w:tcPr>
+            <w:tcW w:w="2608" w:type="dxa"/>
+            <w:vAlign w:val="center"/>
+          </w:tcPr>
+          <w:p>
+            <w:pPr>
+              <w:spacing w:after="0" w:line="240" w:lineRule="auto"/>
+              <w:jc w:val="center"/>
+            </w:pPr>
+            <w:hyperlink r:id="rId63">
+              <w:r>
+                <w:rPr>
+                  <w:color w:val="17588B"/>
+                  <w:sz w:val="20"/>
+                  <w:u w:val="single"/>
+                </w:rPr>
+                <w:t>McMaster</w:t>
+              </w:r>
+            </w:hyperlink>
+          </w:p>
+        </w:tc>
+        <w:tc>
+          <w:tcPr>
+            <w:tcW w:w="1531" w:type="dxa"/>
+            <w:vAlign w:val="center"/>
+          </w:tcPr>
+          <w:p>
+            <w:pPr>
+              <w:spacing w:after="0" w:line="240" w:lineRule="auto"/>
+              <w:jc w:val="center"/>
+            </w:pPr>
+            <w:r>
               <w:t>4 pcs</w:t>
             </w:r>
             <w:r>
               <w:br/>
-              <w:t>1 × 10 pack</w:t>
+              <w:t>1 × 12 pack</w:t>
             </w:r>
           </w:p>
         </w:tc>
@@ -5072,23 +4886,7 @@
           <w:rFonts w:hint="eastAsia"/>
           <w:lang w:eastAsia="zh-CN"/>
         </w:rPr>
-        <w:t xml:space="preserve">t find </w:t>
-      </w:r>
-      <w:proofErr w:type="gramStart"/>
-      <w:r>
-        <w:rPr>
-          <w:rFonts w:hint="eastAsia"/>
-          <w:lang w:eastAsia="zh-CN"/>
-        </w:rPr>
-        <w:t>it(</w:t>
-      </w:r>
-      <w:proofErr w:type="gramEnd"/>
-      <w:r>
-        <w:rPr>
-          <w:rFonts w:hint="eastAsia"/>
-          <w:lang w:eastAsia="zh-CN"/>
-        </w:rPr>
-        <w:t>But maybe we also have).</w:t>
+        <w:t>t find it(But maybe we also have).</w:t>
       </w:r>
       <w:bookmarkEnd w:id="0"/>
       <w:r>
@@ -5204,15 +5002,7 @@
               <w:spacing w:after="0" w:line="240" w:lineRule="auto"/>
             </w:pPr>
             <w:r>
-              <w:t>92196A</w:t>
-            </w:r>
-            <w:proofErr w:type="gramStart"/>
-            <w:r>
-              <w:t>540  |</w:t>
-            </w:r>
-            <w:proofErr w:type="gramEnd"/>
-            <w:r>
-              <w:t xml:space="preserve">  1/4-20 × ¾ in socket head</w:t>
+              <w:t>92196A540  |  1/4-20 × ¾ in socket head</w:t>
             </w:r>
             <w:r>
               <w:rPr>
@@ -5271,15 +5061,7 @@
               <w:spacing w:after="0" w:line="240" w:lineRule="auto"/>
             </w:pPr>
             <w:r>
-              <w:t>92196A</w:t>
-            </w:r>
-            <w:proofErr w:type="gramStart"/>
-            <w:r>
-              <w:t>537  |</w:t>
-            </w:r>
-            <w:proofErr w:type="gramEnd"/>
-            <w:r>
-              <w:t xml:space="preserve">  1/4-20 × ½ in socket head</w:t>
+              <w:t>92196A537  |  1/4-20 × ½ in socket head</w:t>
             </w:r>
             <w:r>
               <w:rPr>
@@ -5341,15 +5123,7 @@
               <w:spacing w:after="0" w:line="240" w:lineRule="auto"/>
             </w:pPr>
             <w:r>
-              <w:t>91292A</w:t>
-            </w:r>
-            <w:proofErr w:type="gramStart"/>
-            <w:r>
-              <w:t>174  |</w:t>
-            </w:r>
-            <w:proofErr w:type="gramEnd"/>
-            <w:r>
-              <w:t xml:space="preserve">  M12 × 30 mm socket head</w:t>
+              <w:t>91292A174  |  M12 × 30 mm socket head</w:t>
             </w:r>
             <w:r>
               <w:rPr>
@@ -5357,12 +5131,6 @@
                 <w:sz w:val="18"/>
               </w:rPr>
               <w:br/>
-            </w:r>
-            <w:r>
-              <w:rPr>
-                <w:color w:val="4A4A4A"/>
-                <w:sz w:val="18"/>
-              </w:rPr>
               <w:t>18-8 stainless; 4 legs to the existing platform</w:t>
             </w:r>
           </w:p>
@@ -5376,86 +5144,6 @@
             <w:pPr>
               <w:spacing w:after="0" w:line="240" w:lineRule="auto"/>
               <w:jc w:val="center"/>
-            </w:pPr>
-            <w:hyperlink r:id="rId63">
-              <w:r>
-                <w:rPr>
-                  <w:color w:val="17588B"/>
-                  <w:sz w:val="20"/>
-                  <w:u w:val="single"/>
-                </w:rPr>
-                <w:t>McMaster</w:t>
-              </w:r>
-            </w:hyperlink>
-          </w:p>
-        </w:tc>
-        <w:tc>
-          <w:tcPr>
-            <w:tcW w:w="1531" w:type="dxa"/>
-            <w:vAlign w:val="center"/>
-          </w:tcPr>
-          <w:p>
-            <w:pPr>
-              <w:spacing w:after="0" w:line="240" w:lineRule="auto"/>
-              <w:jc w:val="center"/>
-            </w:pPr>
-            <w:r>
-              <w:t>4 pcs</w:t>
-            </w:r>
-            <w:r>
-              <w:br/>
-              <w:t>1 × 10 pack</w:t>
-            </w:r>
-          </w:p>
-        </w:tc>
-      </w:tr>
-      <w:tr>
-        <w:trPr>
-          <w:cantSplit/>
-          <w:jc w:val="center"/>
-        </w:trPr>
-        <w:tc>
-          <w:tcPr>
-            <w:tcW w:w="5953" w:type="dxa"/>
-            <w:vAlign w:val="center"/>
-          </w:tcPr>
-          <w:p>
-            <w:pPr>
-              <w:spacing w:after="0" w:line="240" w:lineRule="auto"/>
-            </w:pPr>
-            <w:r>
-              <w:t>93475A</w:t>
-            </w:r>
-            <w:proofErr w:type="gramStart"/>
-            <w:r>
-              <w:t>290  |</w:t>
-            </w:r>
-            <w:proofErr w:type="gramEnd"/>
-            <w:r>
-              <w:t xml:space="preserve">  M12 flat washer</w:t>
-            </w:r>
-            <w:r>
-              <w:rPr>
-                <w:color w:val="4A4A4A"/>
-                <w:sz w:val="18"/>
-              </w:rPr>
-              <w:br/>
-              <w:t>18-8 stainless; ID 13 × OD 24 mm; t 2.0–2.9 mm</w:t>
-            </w:r>
-          </w:p>
-        </w:tc>
-        <w:tc>
-          <w:tcPr>
-            <w:tcW w:w="2608" w:type="dxa"/>
-            <w:vAlign w:val="center"/>
-          </w:tcPr>
-          <w:p>
-            <w:pPr>
-              <w:spacing w:after="0" w:line="240" w:lineRule="auto"/>
-              <w:jc w:val="center"/>
-              <w:rPr>
-                <w:lang w:eastAsia="zh-CN"/>
-              </w:rPr>
             </w:pPr>
             <w:hyperlink r:id="rId64">
               <w:r>
@@ -5484,7 +5172,7 @@
             </w:r>
             <w:r>
               <w:br/>
-              <w:t>1 × 25 pack</w:t>
+              <w:t>1 × 10 pack</w:t>
             </w:r>
           </w:p>
         </w:tc>
@@ -5504,15 +5192,7 @@
               <w:spacing w:after="0" w:line="240" w:lineRule="auto"/>
             </w:pPr>
             <w:r>
-              <w:t>SH8S</w:t>
-            </w:r>
-            <w:proofErr w:type="gramStart"/>
-            <w:r>
-              <w:t>100  |</w:t>
-            </w:r>
-            <w:proofErr w:type="gramEnd"/>
-            <w:r>
-              <w:t xml:space="preserve">  8-32 × 1 in</w:t>
+              <w:t>93475A290  |  M12 flat washer</w:t>
             </w:r>
             <w:r>
               <w:rPr>
@@ -5520,7 +5200,7 @@
                 <w:sz w:val="18"/>
               </w:rPr>
               <w:br/>
-              <w:t>2 clamp-ear bolts</w:t>
+              <w:t>18-8 stainless; ID 13 × OD 24 mm; t 2.0–2.9 mm</w:t>
             </w:r>
           </w:p>
         </w:tc>
@@ -5533,278 +5213,9 @@
             <w:pPr>
               <w:spacing w:after="0" w:line="240" w:lineRule="auto"/>
               <w:jc w:val="center"/>
-            </w:pPr>
-          </w:p>
-        </w:tc>
-        <w:tc>
-          <w:tcPr>
-            <w:tcW w:w="1531" w:type="dxa"/>
-            <w:vAlign w:val="center"/>
-          </w:tcPr>
-          <w:p>
-            <w:pPr>
-              <w:spacing w:after="0" w:line="240" w:lineRule="auto"/>
-              <w:jc w:val="center"/>
-            </w:pPr>
-            <w:r>
-              <w:t>2 pcs</w:t>
-            </w:r>
-            <w:r>
-              <w:br/>
-              <w:t>1 × 50 pack</w:t>
-            </w:r>
-          </w:p>
-        </w:tc>
-      </w:tr>
-      <w:tr>
-        <w:trPr>
-          <w:cantSplit/>
-          <w:jc w:val="center"/>
-        </w:trPr>
-        <w:tc>
-          <w:tcPr>
-            <w:tcW w:w="5953" w:type="dxa"/>
-            <w:vAlign w:val="center"/>
-          </w:tcPr>
-          <w:p>
-            <w:pPr>
-              <w:spacing w:after="0" w:line="240" w:lineRule="auto"/>
-            </w:pPr>
-            <w:r>
-              <w:t>N8S</w:t>
-            </w:r>
-            <w:proofErr w:type="gramStart"/>
-            <w:r>
-              <w:t>0340  |</w:t>
-            </w:r>
-            <w:proofErr w:type="gramEnd"/>
-            <w:r>
-              <w:t xml:space="preserve">  8-32 hex nut</w:t>
-            </w:r>
-            <w:r>
               <w:rPr>
-                <w:color w:val="4A4A4A"/>
-                <w:sz w:val="18"/>
+                <w:lang w:eastAsia="zh-CN"/>
               </w:rPr>
-              <w:br/>
-              <w:t>2 clamp-ear nuts</w:t>
-            </w:r>
-          </w:p>
-        </w:tc>
-        <w:tc>
-          <w:tcPr>
-            <w:tcW w:w="2608" w:type="dxa"/>
-            <w:vAlign w:val="center"/>
-          </w:tcPr>
-          <w:p>
-            <w:pPr>
-              <w:spacing w:after="0" w:line="240" w:lineRule="auto"/>
-              <w:jc w:val="center"/>
-            </w:pPr>
-          </w:p>
-        </w:tc>
-        <w:tc>
-          <w:tcPr>
-            <w:tcW w:w="1531" w:type="dxa"/>
-            <w:vAlign w:val="center"/>
-          </w:tcPr>
-          <w:p>
-            <w:pPr>
-              <w:spacing w:after="0" w:line="240" w:lineRule="auto"/>
-              <w:jc w:val="center"/>
-            </w:pPr>
-            <w:r>
-              <w:t>2 pcs</w:t>
-            </w:r>
-            <w:r>
-              <w:br/>
-              <w:t>1 × 50 pack</w:t>
-            </w:r>
-          </w:p>
-        </w:tc>
-      </w:tr>
-      <w:tr>
-        <w:trPr>
-          <w:cantSplit/>
-          <w:jc w:val="center"/>
-        </w:trPr>
-        <w:tc>
-          <w:tcPr>
-            <w:tcW w:w="5953" w:type="dxa"/>
-            <w:vAlign w:val="center"/>
-          </w:tcPr>
-          <w:p>
-            <w:pPr>
-              <w:spacing w:after="0" w:line="240" w:lineRule="auto"/>
-            </w:pPr>
-            <w:r>
-              <w:t xml:space="preserve">Lawson </w:t>
-            </w:r>
-            <w:proofErr w:type="gramStart"/>
-            <w:r>
-              <w:t>1297309  |</w:t>
-            </w:r>
-            <w:proofErr w:type="gramEnd"/>
-            <w:r>
-              <w:t xml:space="preserve">  8-32 × ¼ in</w:t>
-            </w:r>
-            <w:r>
-              <w:rPr>
-                <w:color w:val="4A4A4A"/>
-                <w:sz w:val="18"/>
-              </w:rPr>
-              <w:br/>
-              <w:t>Flat-point stainless set screw; 4 radial cage-rod locks</w:t>
-            </w:r>
-          </w:p>
-        </w:tc>
-        <w:tc>
-          <w:tcPr>
-            <w:tcW w:w="2608" w:type="dxa"/>
-            <w:vAlign w:val="center"/>
-          </w:tcPr>
-          <w:p>
-            <w:pPr>
-              <w:spacing w:after="0" w:line="240" w:lineRule="auto"/>
-              <w:jc w:val="center"/>
-            </w:pPr>
-          </w:p>
-        </w:tc>
-        <w:tc>
-          <w:tcPr>
-            <w:tcW w:w="1531" w:type="dxa"/>
-            <w:vAlign w:val="center"/>
-          </w:tcPr>
-          <w:p>
-            <w:pPr>
-              <w:spacing w:after="0" w:line="240" w:lineRule="auto"/>
-              <w:jc w:val="center"/>
-            </w:pPr>
-            <w:r>
-              <w:t>4</w:t>
-            </w:r>
-          </w:p>
-        </w:tc>
-      </w:tr>
-      <w:tr>
-        <w:trPr>
-          <w:cantSplit/>
-          <w:jc w:val="center"/>
-        </w:trPr>
-        <w:tc>
-          <w:tcPr>
-            <w:tcW w:w="5953" w:type="dxa"/>
-            <w:vAlign w:val="center"/>
-          </w:tcPr>
-          <w:p>
-            <w:pPr>
-              <w:spacing w:after="0" w:line="240" w:lineRule="auto"/>
-            </w:pPr>
-            <w:r>
-              <w:t>SSC-4-40-5/8-A</w:t>
-            </w:r>
-            <w:proofErr w:type="gramStart"/>
-            <w:r>
-              <w:t>2  |</w:t>
-            </w:r>
-            <w:proofErr w:type="gramEnd"/>
-            <w:r>
-              <w:t xml:space="preserve">  4-40 × ⅝ in</w:t>
-            </w:r>
-            <w:r>
-              <w:rPr>
-                <w:color w:val="4A4A4A"/>
-                <w:sz w:val="18"/>
-              </w:rPr>
-              <w:br/>
-              <w:t>4 screws attaching the top cage mirror cube</w:t>
-            </w:r>
-          </w:p>
-        </w:tc>
-        <w:tc>
-          <w:tcPr>
-            <w:tcW w:w="2608" w:type="dxa"/>
-            <w:vAlign w:val="center"/>
-          </w:tcPr>
-          <w:p>
-            <w:pPr>
-              <w:spacing w:after="0" w:line="240" w:lineRule="auto"/>
-              <w:jc w:val="center"/>
-            </w:pPr>
-          </w:p>
-        </w:tc>
-        <w:tc>
-          <w:tcPr>
-            <w:tcW w:w="1531" w:type="dxa"/>
-            <w:vAlign w:val="center"/>
-          </w:tcPr>
-          <w:p>
-            <w:pPr>
-              <w:spacing w:after="0" w:line="240" w:lineRule="auto"/>
-              <w:jc w:val="center"/>
-            </w:pPr>
-            <w:r>
-              <w:t>4</w:t>
-            </w:r>
-          </w:p>
-        </w:tc>
-      </w:tr>
-      <w:tr>
-        <w:trPr>
-          <w:cantSplit/>
-          <w:jc w:val="center"/>
-        </w:trPr>
-        <w:tc>
-          <w:tcPr>
-            <w:tcW w:w="5953" w:type="dxa"/>
-            <w:vAlign w:val="center"/>
-          </w:tcPr>
-          <w:p>
-            <w:pPr>
-              <w:spacing w:after="0" w:line="240" w:lineRule="auto"/>
-            </w:pPr>
-            <w:r>
-              <w:rPr>
-                <w:color w:val="4A4A4A"/>
-                <w:sz w:val="18"/>
-              </w:rPr>
-              <w:t>94355A</w:t>
-            </w:r>
-            <w:proofErr w:type="gramStart"/>
-            <w:r>
-              <w:rPr>
-                <w:color w:val="4A4A4A"/>
-                <w:sz w:val="18"/>
-              </w:rPr>
-              <w:t>192  |</w:t>
-            </w:r>
-            <w:proofErr w:type="gramEnd"/>
-            <w:r>
-              <w:rPr>
-                <w:color w:val="4A4A4A"/>
-                <w:sz w:val="18"/>
-              </w:rPr>
-              <w:t xml:space="preserve">  8-32 × ⅜ in flat-tip setscrew</w:t>
-            </w:r>
-            <w:r>
-              <w:rPr>
-                <w:color w:val="4A4A4A"/>
-                <w:sz w:val="18"/>
-              </w:rPr>
-              <w:br/>
-              <w:t>18-8 stainless; 4 telescope supports + B2 mirror support</w:t>
-            </w:r>
-          </w:p>
-        </w:tc>
-        <w:tc>
-          <w:tcPr>
-            <w:tcW w:w="2608" w:type="dxa"/>
-            <w:vAlign w:val="center"/>
-          </w:tcPr>
-          <w:p>
-            <w:pPr>
-              <w:spacing w:after="0"/>
-              <w:jc w:val="center"/>
             </w:pPr>
             <w:hyperlink r:id="rId65">
               <w:r>
@@ -5829,7 +5240,7 @@
               <w:jc w:val="center"/>
             </w:pPr>
             <w:r>
-              <w:t>5 pcs</w:t>
+              <w:t>4 pcs</w:t>
             </w:r>
             <w:r>
               <w:br/>
@@ -5853,27 +5264,302 @@
               <w:spacing w:after="0" w:line="240" w:lineRule="auto"/>
             </w:pPr>
             <w:r>
+              <w:t>SH8S100  |  8-32 × 1 in</w:t>
+            </w:r>
+            <w:r>
               <w:rPr>
                 <w:color w:val="4A4A4A"/>
                 <w:sz w:val="18"/>
               </w:rPr>
-              <w:t>94355A</w:t>
-            </w:r>
-            <w:proofErr w:type="gramStart"/>
+              <w:br/>
+              <w:t>2 clamp-ear bolts</w:t>
+            </w:r>
+          </w:p>
+        </w:tc>
+        <w:tc>
+          <w:tcPr>
+            <w:tcW w:w="2608" w:type="dxa"/>
+            <w:vAlign w:val="center"/>
+          </w:tcPr>
+          <w:p>
+            <w:pPr>
+              <w:spacing w:after="0" w:line="240" w:lineRule="auto"/>
+              <w:jc w:val="center"/>
+            </w:pPr>
+          </w:p>
+        </w:tc>
+        <w:tc>
+          <w:tcPr>
+            <w:tcW w:w="1531" w:type="dxa"/>
+            <w:vAlign w:val="center"/>
+          </w:tcPr>
+          <w:p>
+            <w:pPr>
+              <w:spacing w:after="0" w:line="240" w:lineRule="auto"/>
+              <w:jc w:val="center"/>
+            </w:pPr>
+            <w:r>
+              <w:t>2 pcs</w:t>
+            </w:r>
+            <w:r>
+              <w:br/>
+              <w:t>1 × 50 pack</w:t>
+            </w:r>
+          </w:p>
+        </w:tc>
+      </w:tr>
+      <w:tr>
+        <w:trPr>
+          <w:cantSplit/>
+          <w:jc w:val="center"/>
+        </w:trPr>
+        <w:tc>
+          <w:tcPr>
+            <w:tcW w:w="5953" w:type="dxa"/>
+            <w:vAlign w:val="center"/>
+          </w:tcPr>
+          <w:p>
+            <w:pPr>
+              <w:spacing w:after="0" w:line="240" w:lineRule="auto"/>
+            </w:pPr>
+            <w:r>
+              <w:t>N8S0340  |  8-32 hex nut</w:t>
+            </w:r>
             <w:r>
               <w:rPr>
                 <w:color w:val="4A4A4A"/>
                 <w:sz w:val="18"/>
               </w:rPr>
-              <w:t>198  |</w:t>
-            </w:r>
-            <w:proofErr w:type="gramEnd"/>
+              <w:br/>
+              <w:t>2 clamp-ear nuts</w:t>
+            </w:r>
+          </w:p>
+        </w:tc>
+        <w:tc>
+          <w:tcPr>
+            <w:tcW w:w="2608" w:type="dxa"/>
+            <w:vAlign w:val="center"/>
+          </w:tcPr>
+          <w:p>
+            <w:pPr>
+              <w:spacing w:after="0" w:line="240" w:lineRule="auto"/>
+              <w:jc w:val="center"/>
+            </w:pPr>
+          </w:p>
+        </w:tc>
+        <w:tc>
+          <w:tcPr>
+            <w:tcW w:w="1531" w:type="dxa"/>
+            <w:vAlign w:val="center"/>
+          </w:tcPr>
+          <w:p>
+            <w:pPr>
+              <w:spacing w:after="0" w:line="240" w:lineRule="auto"/>
+              <w:jc w:val="center"/>
+            </w:pPr>
+            <w:r>
+              <w:t>2 pcs</w:t>
+            </w:r>
+            <w:r>
+              <w:br/>
+              <w:t>1 × 50 pack</w:t>
+            </w:r>
+          </w:p>
+        </w:tc>
+      </w:tr>
+      <w:tr>
+        <w:trPr>
+          <w:cantSplit/>
+          <w:jc w:val="center"/>
+        </w:trPr>
+        <w:tc>
+          <w:tcPr>
+            <w:tcW w:w="5953" w:type="dxa"/>
+            <w:vAlign w:val="center"/>
+          </w:tcPr>
+          <w:p>
+            <w:pPr>
+              <w:spacing w:after="0" w:line="240" w:lineRule="auto"/>
+            </w:pPr>
+            <w:r>
+              <w:t>Lawson 1297309  |  8-32 × ¼ in</w:t>
+            </w:r>
             <w:r>
               <w:rPr>
                 <w:color w:val="4A4A4A"/>
                 <w:sz w:val="18"/>
               </w:rPr>
-              <w:t xml:space="preserve">  8-32 × ⅝ in flat-tip setscrew</w:t>
+              <w:br/>
+              <w:t>Flat-point stainless set screw; 4 radial cage-rod locks</w:t>
+            </w:r>
+          </w:p>
+        </w:tc>
+        <w:tc>
+          <w:tcPr>
+            <w:tcW w:w="2608" w:type="dxa"/>
+            <w:vAlign w:val="center"/>
+          </w:tcPr>
+          <w:p>
+            <w:pPr>
+              <w:spacing w:after="0" w:line="240" w:lineRule="auto"/>
+              <w:jc w:val="center"/>
+            </w:pPr>
+          </w:p>
+        </w:tc>
+        <w:tc>
+          <w:tcPr>
+            <w:tcW w:w="1531" w:type="dxa"/>
+            <w:vAlign w:val="center"/>
+          </w:tcPr>
+          <w:p>
+            <w:pPr>
+              <w:spacing w:after="0" w:line="240" w:lineRule="auto"/>
+              <w:jc w:val="center"/>
+            </w:pPr>
+            <w:r>
+              <w:t>4</w:t>
+            </w:r>
+          </w:p>
+        </w:tc>
+      </w:tr>
+      <w:tr>
+        <w:trPr>
+          <w:cantSplit/>
+          <w:jc w:val="center"/>
+        </w:trPr>
+        <w:tc>
+          <w:tcPr>
+            <w:tcW w:w="5953" w:type="dxa"/>
+            <w:vAlign w:val="center"/>
+          </w:tcPr>
+          <w:p>
+            <w:pPr>
+              <w:spacing w:after="0" w:line="240" w:lineRule="auto"/>
+            </w:pPr>
+            <w:r>
+              <w:t>SSC-4-40-5/8-A2  |  4-40 × ⅝ in</w:t>
+            </w:r>
+            <w:r>
+              <w:rPr>
+                <w:color w:val="4A4A4A"/>
+                <w:sz w:val="18"/>
+              </w:rPr>
+              <w:br/>
+              <w:t>4 screws attaching the top cage mirror cube</w:t>
+            </w:r>
+          </w:p>
+        </w:tc>
+        <w:tc>
+          <w:tcPr>
+            <w:tcW w:w="2608" w:type="dxa"/>
+            <w:vAlign w:val="center"/>
+          </w:tcPr>
+          <w:p>
+            <w:pPr>
+              <w:spacing w:after="0" w:line="240" w:lineRule="auto"/>
+              <w:jc w:val="center"/>
+            </w:pPr>
+          </w:p>
+        </w:tc>
+        <w:tc>
+          <w:tcPr>
+            <w:tcW w:w="1531" w:type="dxa"/>
+            <w:vAlign w:val="center"/>
+          </w:tcPr>
+          <w:p>
+            <w:pPr>
+              <w:spacing w:after="0" w:line="240" w:lineRule="auto"/>
+              <w:jc w:val="center"/>
+            </w:pPr>
+            <w:r>
+              <w:t>4</w:t>
+            </w:r>
+          </w:p>
+        </w:tc>
+      </w:tr>
+      <w:tr>
+        <w:trPr>
+          <w:cantSplit/>
+          <w:jc w:val="center"/>
+        </w:trPr>
+        <w:tc>
+          <w:tcPr>
+            <w:tcW w:w="5953" w:type="dxa"/>
+            <w:vAlign w:val="center"/>
+          </w:tcPr>
+          <w:p>
+            <w:pPr>
+              <w:spacing w:after="0" w:line="240" w:lineRule="auto"/>
+            </w:pPr>
+            <w:r>
+              <w:rPr>
+                <w:color w:val="4A4A4A"/>
+                <w:sz w:val="18"/>
+              </w:rPr>
+              <w:t>94355A192  |  8-32 × ⅜ in flat-tip setscrew</w:t>
+            </w:r>
+            <w:r>
+              <w:rPr>
+                <w:color w:val="4A4A4A"/>
+                <w:sz w:val="18"/>
+              </w:rPr>
+              <w:br/>
+              <w:t>18-8 stainless; 4 telescope supports + B2 mirror support</w:t>
+            </w:r>
+          </w:p>
+        </w:tc>
+        <w:tc>
+          <w:tcPr>
+            <w:tcW w:w="2608" w:type="dxa"/>
+            <w:vAlign w:val="center"/>
+          </w:tcPr>
+          <w:p>
+            <w:pPr>
+              <w:spacing w:after="0"/>
+              <w:jc w:val="center"/>
+            </w:pPr>
+          </w:p>
+        </w:tc>
+        <w:tc>
+          <w:tcPr>
+            <w:tcW w:w="1531" w:type="dxa"/>
+            <w:vAlign w:val="center"/>
+          </w:tcPr>
+          <w:p>
+            <w:pPr>
+              <w:spacing w:after="0" w:line="240" w:lineRule="auto"/>
+              <w:jc w:val="center"/>
+            </w:pPr>
+            <w:r>
+              <w:t>5 pcs</w:t>
+            </w:r>
+            <w:r>
+              <w:br/>
+              <w:t>1 × 25 pack</w:t>
+            </w:r>
+          </w:p>
+        </w:tc>
+      </w:tr>
+      <w:tr>
+        <w:trPr>
+          <w:cantSplit/>
+          <w:jc w:val="center"/>
+        </w:trPr>
+        <w:tc>
+          <w:tcPr>
+            <w:tcW w:w="5953" w:type="dxa"/>
+            <w:vAlign w:val="center"/>
+          </w:tcPr>
+          <w:p>
+            <w:pPr>
+              <w:spacing w:after="0" w:line="240" w:lineRule="auto"/>
+            </w:pPr>
+            <w:r>
+              <w:rPr>
+                <w:color w:val="4A4A4A"/>
+                <w:sz w:val="18"/>
+              </w:rPr>
+              <w:t>94355A198  |  8-32 × ⅝ in flat-tip setscrew</w:t>
             </w:r>
             <w:r>
               <w:rPr>
@@ -5895,16 +5581,6 @@
               <w:spacing w:after="0"/>
               <w:jc w:val="center"/>
             </w:pPr>
-            <w:hyperlink r:id="rId66">
-              <w:r>
-                <w:rPr>
-                  <w:color w:val="17588B"/>
-                  <w:sz w:val="20"/>
-                  <w:u w:val="single"/>
-                </w:rPr>
-                <w:t>McMaster</w:t>
-              </w:r>
-            </w:hyperlink>
           </w:p>
         </w:tc>
         <w:tc>
@@ -5950,28 +5626,12 @@
           <w:rFonts w:hint="eastAsia"/>
           <w:lang w:eastAsia="zh-CN"/>
         </w:rPr>
-        <w:t xml:space="preserve">t find </w:t>
-      </w:r>
-      <w:proofErr w:type="gramStart"/>
-      <w:r>
-        <w:rPr>
-          <w:rFonts w:hint="eastAsia"/>
-          <w:lang w:eastAsia="zh-CN"/>
-        </w:rPr>
-        <w:t>it(</w:t>
-      </w:r>
-      <w:proofErr w:type="gramEnd"/>
-      <w:r>
-        <w:rPr>
-          <w:rFonts w:hint="eastAsia"/>
-          <w:lang w:eastAsia="zh-CN"/>
-        </w:rPr>
-        <w:t>But maybe we also have).</w:t>
+        <w:t>t find it(But maybe we also have).</w:t>
       </w:r>
     </w:p>
     <w:p/>
     <w:sectPr>
-      <w:footerReference w:type="default" r:id="rId67"/>
+      <w:footerReference w:type="default" r:id="rId66"/>
       <w:pgSz w:w="11906" w:h="16838"/>
       <w:pgMar w:top="907" w:right="907" w:bottom="850" w:left="907" w:header="397" w:footer="397" w:gutter="0"/>
       <w:cols w:space="720"/>
@@ -6018,23 +5678,7 @@
         <w:color w:val="666666"/>
         <w:sz w:val="16"/>
       </w:rPr>
-      <w:t xml:space="preserve">Shopping </w:t>
-    </w:r>
-    <w:proofErr w:type="gramStart"/>
-    <w:r>
-      <w:rPr>
-        <w:color w:val="666666"/>
-        <w:sz w:val="16"/>
-      </w:rPr>
-      <w:t>list  |</w:t>
-    </w:r>
-    <w:proofErr w:type="gramEnd"/>
-    <w:r>
-      <w:rPr>
-        <w:color w:val="666666"/>
-        <w:sz w:val="16"/>
-      </w:rPr>
-      <w:t xml:space="preserve">  </w:t>
+      <w:t xml:space="preserve">Shopping list  |  </w:t>
     </w:r>
     <w:r>
       <w:fldChar w:fldCharType="begin"/>
@@ -17665,6 +17309,29 @@
       </w:tcPr>
     </w:tblStylePr>
   </w:style>
+  <w:style w:type="character" w:styleId="aff9">
+    <w:name w:val="Hyperlink"/>
+    <w:basedOn w:val="a2"/>
+    <w:uiPriority w:val="99"/>
+    <w:unhideWhenUsed/>
+    <w:rsid w:val="00C76582"/>
+    <w:rPr>
+      <w:color w:val="0000FF" w:themeColor="hyperlink"/>
+      <w:u w:val="single"/>
+    </w:rPr>
+  </w:style>
+  <w:style w:type="character" w:styleId="affa">
+    <w:name w:val="Unresolved Mention"/>
+    <w:basedOn w:val="a2"/>
+    <w:uiPriority w:val="99"/>
+    <w:semiHidden/>
+    <w:unhideWhenUsed/>
+    <w:rsid w:val="00C76582"/>
+    <w:rPr>
+      <w:color w:val="605E5C"/>
+      <w:shd w:val="clear" w:color="auto" w:fill="E1DFDD"/>
+    </w:rPr>
+  </w:style>
 </w:styles>
 </file>
 

</xml_diff>